<commit_message>
Fix GSE30929 KM plots and copy to main figures
</commit_message>
<xml_diff>
--- a/Manuscript.docx
+++ b/Manuscript.docx
@@ -66,127 +66,7 @@
           <w:sz w:val="24"/>
           <w14:ligatures w14:val="none"/>
         </w:rPr>
-        <w:t xml:space="preserve">Weihua Xiao, </w:t>
-      </w:r>
-      <w:proofErr w:type="spellStart"/>
-      <w:r>
-        <w:rPr>
-          <w:rFonts w:ascii="Times New Roman" w:eastAsia="宋体" w:hAnsi="Times New Roman" w:cs="Times New Roman"/>
-          <w:kern w:val="0"/>
-          <w:sz w:val="24"/>
-          <w14:ligatures w14:val="none"/>
-        </w:rPr>
-        <w:t>Chunjiao</w:t>
-      </w:r>
-      <w:proofErr w:type="spellEnd"/>
-      <w:r>
-        <w:rPr>
-          <w:rFonts w:ascii="Times New Roman" w:eastAsia="宋体" w:hAnsi="Times New Roman" w:cs="Times New Roman"/>
-          <w:kern w:val="0"/>
-          <w:sz w:val="24"/>
-          <w14:ligatures w14:val="none"/>
-        </w:rPr>
-        <w:t xml:space="preserve"> Liu, </w:t>
-      </w:r>
-      <w:proofErr w:type="spellStart"/>
-      <w:r>
-        <w:rPr>
-          <w:rFonts w:ascii="Times New Roman" w:eastAsia="宋体" w:hAnsi="Times New Roman" w:cs="Times New Roman"/>
-          <w:kern w:val="0"/>
-          <w:sz w:val="24"/>
-          <w14:ligatures w14:val="none"/>
-        </w:rPr>
-        <w:t>Jingdan</w:t>
-      </w:r>
-      <w:proofErr w:type="spellEnd"/>
-      <w:r>
-        <w:rPr>
-          <w:rFonts w:ascii="Times New Roman" w:eastAsia="宋体" w:hAnsi="Times New Roman" w:cs="Times New Roman"/>
-          <w:kern w:val="0"/>
-          <w:sz w:val="24"/>
-          <w14:ligatures w14:val="none"/>
-        </w:rPr>
-        <w:t xml:space="preserve"> Sheng, </w:t>
-      </w:r>
-      <w:proofErr w:type="spellStart"/>
-      <w:r>
-        <w:rPr>
-          <w:rFonts w:ascii="Times New Roman" w:eastAsia="宋体" w:hAnsi="Times New Roman" w:cs="Times New Roman"/>
-          <w:kern w:val="0"/>
-          <w:sz w:val="24"/>
-          <w14:ligatures w14:val="none"/>
-        </w:rPr>
-        <w:t>Junqiang</w:t>
-      </w:r>
-      <w:proofErr w:type="spellEnd"/>
-      <w:r>
-        <w:rPr>
-          <w:rFonts w:ascii="Times New Roman" w:eastAsia="宋体" w:hAnsi="Times New Roman" w:cs="Times New Roman"/>
-          <w:kern w:val="0"/>
-          <w:sz w:val="24"/>
-          <w14:ligatures w14:val="none"/>
-        </w:rPr>
-        <w:t xml:space="preserve"> Li, </w:t>
-      </w:r>
-      <w:proofErr w:type="spellStart"/>
-      <w:r>
-        <w:rPr>
-          <w:rFonts w:ascii="Times New Roman" w:eastAsia="宋体" w:hAnsi="Times New Roman" w:cs="Times New Roman"/>
-          <w:kern w:val="0"/>
-          <w:sz w:val="24"/>
-          <w14:ligatures w14:val="none"/>
-        </w:rPr>
-        <w:t>Shaonan</w:t>
-      </w:r>
-      <w:proofErr w:type="spellEnd"/>
-      <w:r>
-        <w:rPr>
-          <w:rFonts w:ascii="Times New Roman" w:eastAsia="宋体" w:hAnsi="Times New Roman" w:cs="Times New Roman"/>
-          <w:kern w:val="0"/>
-          <w:sz w:val="24"/>
-          <w14:ligatures w14:val="none"/>
-        </w:rPr>
-        <w:t xml:space="preserve"> Ge, </w:t>
-      </w:r>
-      <w:proofErr w:type="spellStart"/>
-      <w:r>
-        <w:rPr>
-          <w:rFonts w:ascii="Times New Roman" w:eastAsia="宋体" w:hAnsi="Times New Roman" w:cs="Times New Roman"/>
-          <w:kern w:val="0"/>
-          <w:sz w:val="24"/>
-          <w14:ligatures w14:val="none"/>
-        </w:rPr>
-        <w:t>Maofen</w:t>
-      </w:r>
-      <w:proofErr w:type="spellEnd"/>
-      <w:r>
-        <w:rPr>
-          <w:rFonts w:ascii="Times New Roman" w:eastAsia="宋体" w:hAnsi="Times New Roman" w:cs="Times New Roman"/>
-          <w:kern w:val="0"/>
-          <w:sz w:val="24"/>
-          <w14:ligatures w14:val="none"/>
-        </w:rPr>
-        <w:t xml:space="preserve"> Jiang, Min Wang, Ji He, Yaxin Ding, </w:t>
-      </w:r>
-      <w:proofErr w:type="spellStart"/>
-      <w:r>
-        <w:rPr>
-          <w:rFonts w:ascii="Times New Roman" w:eastAsia="宋体" w:hAnsi="Times New Roman" w:cs="Times New Roman"/>
-          <w:kern w:val="0"/>
-          <w:sz w:val="24"/>
-          <w14:ligatures w14:val="none"/>
-        </w:rPr>
-        <w:t>Haifen</w:t>
-      </w:r>
-      <w:proofErr w:type="spellEnd"/>
-      <w:r>
-        <w:rPr>
-          <w:rFonts w:ascii="Times New Roman" w:eastAsia="宋体" w:hAnsi="Times New Roman" w:cs="Times New Roman"/>
-          <w:kern w:val="0"/>
-          <w:sz w:val="24"/>
-          <w14:ligatures w14:val="none"/>
-        </w:rPr>
-        <w:t xml:space="preserve"> Ma</w:t>
+        <w:t>Weihua Xiao, Chunjiao Liu, Jingdan Sheng, Junqiang Li, Shaonan Ge, Maofen Jiang, Min Wang, Ji He, Yaxin Ding, Haifen Ma</w:t>
       </w:r>
     </w:p>
     <w:p>
@@ -222,25 +102,14 @@
           <w14:ligatures w14:val="none"/>
         </w:rPr>
       </w:pPr>
-      <w:proofErr w:type="spellStart"/>
-      <w:r>
-        <w:rPr>
-          <w:rFonts w:ascii="Times New Roman" w:eastAsia="宋体" w:hAnsi="Times New Roman" w:cs="Times New Roman"/>
-          <w:kern w:val="0"/>
-          <w:sz w:val="24"/>
-          <w14:ligatures w14:val="none"/>
-        </w:rPr>
-        <w:t>Beilun</w:t>
-      </w:r>
-      <w:proofErr w:type="spellEnd"/>
-      <w:r>
-        <w:rPr>
-          <w:rFonts w:ascii="Times New Roman" w:eastAsia="宋体" w:hAnsi="Times New Roman" w:cs="Times New Roman"/>
-          <w:kern w:val="0"/>
-          <w:sz w:val="24"/>
-          <w14:ligatures w14:val="none"/>
-        </w:rPr>
-        <w:t xml:space="preserve"> Branch of the First Affiliated Hospital, College of Medicine, Zhejiang University Ningbo, China</w:t>
+      <w:r>
+        <w:rPr>
+          <w:rFonts w:ascii="Times New Roman" w:eastAsia="宋体" w:hAnsi="Times New Roman" w:cs="Times New Roman"/>
+          <w:kern w:val="0"/>
+          <w:sz w:val="24"/>
+          <w14:ligatures w14:val="none"/>
+        </w:rPr>
+        <w:t>Beilun Branch of the First Affiliated Hospital, College of Medicine, Zhejiang University Ningbo, China</w:t>
       </w:r>
     </w:p>
     <w:p>
@@ -276,27 +145,7 @@
           <w:sz w:val="24"/>
           <w14:ligatures w14:val="none"/>
         </w:rPr>
-        <w:t xml:space="preserve"> </w:t>
-      </w:r>
-      <w:proofErr w:type="spellStart"/>
-      <w:r>
-        <w:rPr>
-          <w:rFonts w:ascii="Times New Roman" w:eastAsia="宋体" w:hAnsi="Times New Roman" w:cs="Times New Roman"/>
-          <w:kern w:val="0"/>
-          <w:sz w:val="24"/>
-          <w14:ligatures w14:val="none"/>
-        </w:rPr>
-        <w:t>Chunjiao</w:t>
-      </w:r>
-      <w:proofErr w:type="spellEnd"/>
-      <w:r>
-        <w:rPr>
-          <w:rFonts w:ascii="Times New Roman" w:eastAsia="宋体" w:hAnsi="Times New Roman" w:cs="Times New Roman"/>
-          <w:kern w:val="0"/>
-          <w:sz w:val="24"/>
-          <w14:ligatures w14:val="none"/>
-        </w:rPr>
-        <w:t xml:space="preserve"> Liu (liuchunjiao2022@163.com). Weihua Xiao (hua7708@126.com). Phone: +</w:t>
+        <w:t xml:space="preserve"> Chunjiao Liu (liuchunjiao2022@163.com). Weihua Xiao (hua7708@126.com). Phone: +</w:t>
       </w:r>
       <w:bookmarkStart w:id="1" w:name="OLE_LINK31"/>
       <w:r>
@@ -407,39 +256,26 @@
           <w:sz w:val="24"/>
           <w14:ligatures w14:val="none"/>
         </w:rPr>
-        <w:t xml:space="preserve">There are no molecular markers which can be used to predict the prognosis of dedifferentiated liposarcoma (DDLPS). A 6-gene lipid metabolism score (LMS) was built based on the transcriptomic data of The Cancer Genome Atlas (TCGA) (n=50) and validated on two other independent Gene Expression Omnibus (GEO) cohorts (GSE21122, n=158; GSE159659, n=45). The score is a prognostic axis specific to males: high score-males had a 5.83-fold increased risk of death (95% CI: 1.55–21.95, P &lt; 0.01), but not females. Indeed, the score is highly mechanistically associated with PPARG/CD36 pathway activity (R=0.62 and 0.58) and high score tumors have co-occurring immune suppression (interferon gamma response NES=−1.82) and cell cycle activation (mitotic </w:t>
-      </w:r>
-      <w:proofErr w:type="spellStart"/>
-      <w:r>
-        <w:rPr>
-          <w:rFonts w:ascii="Times New Roman" w:eastAsia="宋体" w:hAnsi="Times New Roman" w:cs="Times New Roman"/>
-          <w:kern w:val="0"/>
-          <w:sz w:val="24"/>
-          <w14:ligatures w14:val="none"/>
-        </w:rPr>
-        <w:t>spindlenormalized</w:t>
-      </w:r>
-      <w:proofErr w:type="spellEnd"/>
-      <w:r>
-        <w:rPr>
-          <w:rFonts w:ascii="Times New Roman" w:eastAsia="宋体" w:hAnsi="Times New Roman" w:cs="Times New Roman"/>
-          <w:kern w:val="0"/>
-          <w:sz w:val="24"/>
-          <w14:ligatures w14:val="none"/>
-        </w:rPr>
-        <w:t xml:space="preserve"> enrichment score [NES]=1.64). Predictive performance is stable (1-, 3-, 5-year area under the curve [AUC]: 0.72, 0.68, 0.65). The score is independently cohort validated to its association with aggressive histologic subtypes. The findings offer a clinically applicable risk stratification tool for lipid metabolism and patient proof for considering the PPARG/CD36 axis as a therapeutic target in </w:t>
-      </w:r>
-      <w:proofErr w:type="gramStart"/>
-      <w:r>
-        <w:rPr>
-          <w:rFonts w:ascii="Times New Roman" w:eastAsia="宋体" w:hAnsi="Times New Roman" w:cs="Times New Roman"/>
-          <w:kern w:val="0"/>
-          <w:sz w:val="24"/>
-          <w14:ligatures w14:val="none"/>
-        </w:rPr>
-        <w:t>DDLPS..</w:t>
-      </w:r>
-      <w:proofErr w:type="gramEnd"/>
+        <w:t xml:space="preserve">There are no molecular markers which can be used to predict the prognosis of dedifferentiated liposarcoma (DDLPS). A 6-gene lipid metabolism score (LMS) was built based on the transcriptomic data of The Cancer Genome Atlas (TCGA) (n=50) and </w:t>
+      </w:r>
+      <w:r>
+        <w:rPr>
+          <w:rFonts w:ascii="Times New Roman" w:eastAsia="宋体" w:hAnsi="Times New Roman" w:cs="Times New Roman"/>
+          <w:kern w:val="0"/>
+          <w:sz w:val="24"/>
+          <w14:ligatures w14:val="none"/>
+        </w:rPr>
+        <w:t>validated it in two independent GEO cohorts for expression patterns (GSE21122, n=158; GSE159659, n=45) and further confirmed its prognostic value in an external cohort of 140 liposarcomas (GSE30929; HR=3.11, 95% CI: 1.64–5.88, P=0.00049).</w:t>
+      </w:r>
+      <w:r>
+        <w:rPr>
+          <w:rFonts w:ascii="Times New Roman" w:eastAsia="宋体" w:hAnsi="Times New Roman" w:cs="Times New Roman"/>
+          <w:kern w:val="0"/>
+          <w:sz w:val="24"/>
+          <w14:ligatures w14:val="none"/>
+        </w:rPr>
+        <w:t xml:space="preserve"> The score is a prognostic axis specific to males: high score-males had a 5.83-fold increased risk of death (95% CI: 1.55–21.95, P &lt; 0.01), but not females. Indeed, the score is highly mechanistically associated with PPARG/CD36 pathway activity (R=0.62 and 0.58) and high score tumors have co-occurring immune suppression (interferon gamma response NES=−1.82) and cell cycle activation (mitotic spindlenormalized enrichment score [NES]=1.64). Predictive performance is stable (1-, 3-, 5-year area under the curve [AUC]: 0.72, 0.68, 0.65). The score is independently cohort validated to its association with aggressive histologic subtypes. The findings offer a clinically applicable risk stratification tool for lipid metabolism and patient proof for considering the PPARG/CD36 axis as a therapeutic target in DDLPS..</w:t>
+      </w:r>
     </w:p>
     <w:p>
       <w:pPr>
@@ -509,27 +345,7 @@
           <w:sz w:val="24"/>
           <w14:ligatures w14:val="none"/>
         </w:rPr>
-        <w:t xml:space="preserve">The six gene lipid metabolism score is an independent predictor of high risk DDLPS patients that </w:t>
-      </w:r>
-      <w:proofErr w:type="gramStart"/>
-      <w:r>
-        <w:rPr>
-          <w:rFonts w:ascii="Times New Roman" w:eastAsia="宋体" w:hAnsi="Times New Roman" w:cs="Times New Roman"/>
-          <w:kern w:val="0"/>
-          <w:sz w:val="24"/>
-          <w14:ligatures w14:val="none"/>
-        </w:rPr>
-        <w:t>is</w:t>
-      </w:r>
-      <w:proofErr w:type="gramEnd"/>
-      <w:r>
-        <w:rPr>
-          <w:rFonts w:ascii="Times New Roman" w:eastAsia="宋体" w:hAnsi="Times New Roman" w:cs="Times New Roman"/>
-          <w:kern w:val="0"/>
-          <w:sz w:val="24"/>
-          <w14:ligatures w14:val="none"/>
-        </w:rPr>
-        <w:t xml:space="preserve"> stable (AUC 0.65 0.72).</w:t>
+        <w:t>The six gene lipid metabolism score is an independent predictor of high risk DDLPS patients that is stable (AUC 0.65 0.72).</w:t>
       </w:r>
     </w:p>
     <w:p>
@@ -554,49 +370,7 @@
           <w:sz w:val="24"/>
           <w14:ligatures w14:val="none"/>
         </w:rPr>
-        <w:t xml:space="preserve">The score shows a male specific prognostic axis in DDLPS with high score males having </w:t>
-      </w:r>
-      <w:proofErr w:type="spellStart"/>
-      <w:proofErr w:type="gramStart"/>
-      <w:r>
-        <w:rPr>
-          <w:rFonts w:ascii="Times New Roman" w:eastAsia="宋体" w:hAnsi="Times New Roman" w:cs="Times New Roman"/>
-          <w:kern w:val="0"/>
-          <w:sz w:val="24"/>
-          <w14:ligatures w14:val="none"/>
-        </w:rPr>
-        <w:t>a</w:t>
-      </w:r>
-      <w:proofErr w:type="spellEnd"/>
-      <w:proofErr w:type="gramEnd"/>
-      <w:r>
-        <w:rPr>
-          <w:rFonts w:ascii="Times New Roman" w:eastAsia="宋体" w:hAnsi="Times New Roman" w:cs="Times New Roman"/>
-          <w:kern w:val="0"/>
-          <w:sz w:val="24"/>
-          <w14:ligatures w14:val="none"/>
-        </w:rPr>
-        <w:t xml:space="preserve"> increased risk of death by </w:t>
-      </w:r>
-      <w:proofErr w:type="gramStart"/>
-      <w:r>
-        <w:rPr>
-          <w:rFonts w:ascii="Times New Roman" w:eastAsia="宋体" w:hAnsi="Times New Roman" w:cs="Times New Roman"/>
-          <w:kern w:val="0"/>
-          <w:sz w:val="24"/>
-          <w14:ligatures w14:val="none"/>
-        </w:rPr>
-        <w:t>5.83 fold</w:t>
-      </w:r>
-      <w:proofErr w:type="gramEnd"/>
-      <w:r>
-        <w:rPr>
-          <w:rFonts w:ascii="Times New Roman" w:eastAsia="宋体" w:hAnsi="Times New Roman" w:cs="Times New Roman"/>
-          <w:kern w:val="0"/>
-          <w:sz w:val="24"/>
-          <w14:ligatures w14:val="none"/>
-        </w:rPr>
-        <w:t>.</w:t>
+        <w:t>The score shows a male specific prognostic axis in DDLPS with high score males having a increased risk of death by 5.83 fold.</w:t>
       </w:r>
     </w:p>
     <w:p>
@@ -705,47 +479,7 @@
           <w:sz w:val="24"/>
           <w14:ligatures w14:val="none"/>
         </w:rPr>
-        <w:t xml:space="preserve">Although with improvements in surgical, radiotherapy and chemotherapy, the prognosis of patients with advanced or recurrent DDLPS is still poor with </w:t>
-      </w:r>
-      <w:proofErr w:type="gramStart"/>
-      <w:r>
-        <w:rPr>
-          <w:rFonts w:ascii="Times New Roman" w:eastAsia="宋体" w:hAnsi="Times New Roman" w:cs="Times New Roman"/>
-          <w:kern w:val="0"/>
-          <w:sz w:val="24"/>
-          <w14:ligatures w14:val="none"/>
-        </w:rPr>
-        <w:t>5 year</w:t>
-      </w:r>
-      <w:proofErr w:type="gramEnd"/>
-      <w:r>
-        <w:rPr>
-          <w:rFonts w:ascii="Times New Roman" w:eastAsia="宋体" w:hAnsi="Times New Roman" w:cs="Times New Roman"/>
-          <w:kern w:val="0"/>
-          <w:sz w:val="24"/>
-          <w14:ligatures w14:val="none"/>
-        </w:rPr>
-        <w:t xml:space="preserve"> survival rate less than 30% (3,4), DDLPS is the most aggressive form of liposarcoma, with the highest rates of recurrence and metastasis (1,2). Presently, existing prognostic tools are clinicopathological (e.g. </w:t>
-      </w:r>
-      <w:proofErr w:type="spellStart"/>
-      <w:r>
-        <w:rPr>
-          <w:rFonts w:ascii="Times New Roman" w:eastAsia="宋体" w:hAnsi="Times New Roman" w:cs="Times New Roman"/>
-          <w:kern w:val="0"/>
-          <w:sz w:val="24"/>
-          <w14:ligatures w14:val="none"/>
-        </w:rPr>
-        <w:t>tumour</w:t>
-      </w:r>
-      <w:proofErr w:type="spellEnd"/>
-      <w:r>
-        <w:rPr>
-          <w:rFonts w:ascii="Times New Roman" w:eastAsia="宋体" w:hAnsi="Times New Roman" w:cs="Times New Roman"/>
-          <w:kern w:val="0"/>
-          <w:sz w:val="24"/>
-          <w14:ligatures w14:val="none"/>
-        </w:rPr>
-        <w:t xml:space="preserve"> size, grade, stage) and are only moderately accurate (AUC &lt;0.65) and still have no molecular basis (5,6,14). Thus, there is a great need for prognostic biomarkers having well-defined molecular mechanisms. </w:t>
+        <w:t xml:space="preserve">Although with improvements in surgical, radiotherapy and chemotherapy, the prognosis of patients with advanced or recurrent DDLPS is still poor with 5 year survival rate less than 30% (3,4), DDLPS is the most aggressive form of liposarcoma, with the highest rates of recurrence and metastasis (1,2). Presently, existing prognostic tools are clinicopathological (e.g. tumour size, grade, stage) and are only moderately accurate (AUC &lt;0.65) and still have no molecular basis (5,6,14). Thus, there is a great need for prognostic biomarkers having well-defined molecular mechanisms. </w:t>
       </w:r>
     </w:p>
     <w:bookmarkEnd w:id="2"/>
@@ -798,27 +532,7 @@
           <w:sz w:val="24"/>
           <w14:ligatures w14:val="none"/>
         </w:rPr>
-        <w:t xml:space="preserve">The present study was therefore aimed at filling these two gaps, establishing a quantifiable lipid metabolism score, validating its association with the activity of the PPARG/CD36 axis in patient tissues and testing its prognostic value in </w:t>
-      </w:r>
-      <w:proofErr w:type="gramStart"/>
-      <w:r>
-        <w:rPr>
-          <w:rFonts w:ascii="Times New Roman" w:eastAsia="宋体" w:hAnsi="Times New Roman" w:cs="Times New Roman"/>
-          <w:kern w:val="0"/>
-          <w:sz w:val="24"/>
-          <w14:ligatures w14:val="none"/>
-        </w:rPr>
-        <w:t>a number of</w:t>
-      </w:r>
-      <w:proofErr w:type="gramEnd"/>
-      <w:r>
-        <w:rPr>
-          <w:rFonts w:ascii="Times New Roman" w:eastAsia="宋体" w:hAnsi="Times New Roman" w:cs="Times New Roman"/>
-          <w:kern w:val="0"/>
-          <w:sz w:val="24"/>
-          <w14:ligatures w14:val="none"/>
-        </w:rPr>
-        <w:t xml:space="preserve"> independent cohorts.</w:t>
+        <w:t>The present study was therefore aimed at filling these two gaps, establishing a quantifiable lipid metabolism score, validating its association with the activity of the PPARG/CD36 axis in patient tissues and testing its prognostic value in a number of independent cohorts.</w:t>
       </w:r>
     </w:p>
     <w:p>
@@ -948,67 +662,7 @@
           <w:sz w:val="24"/>
           <w14:ligatures w14:val="none"/>
         </w:rPr>
-        <w:t xml:space="preserve">The RNA sequencing expression data and clinical information were downloaded from The Cancer Genome Atlas (TCGA) and the Gene Expression Omnibus (GEO; GSE21122 and GSE159659). In the TCGA cohort, there were 50 patients with DDLPS (33 male and 17 female) with an age of 61.5 years (median). The GEO cohorts included 158 (GSE21122) and 45 (GSE159659) patients. </w:t>
-      </w:r>
-      <w:proofErr w:type="spellStart"/>
-      <w:r>
-        <w:rPr>
-          <w:rFonts w:ascii="Times New Roman" w:eastAsia="宋体" w:hAnsi="Times New Roman" w:cs="Times New Roman"/>
-          <w:kern w:val="0"/>
-          <w:sz w:val="24"/>
-          <w14:ligatures w14:val="none"/>
-        </w:rPr>
-        <w:t>voom</w:t>
-      </w:r>
-      <w:proofErr w:type="spellEnd"/>
-      <w:r>
-        <w:rPr>
-          <w:rFonts w:ascii="Times New Roman" w:eastAsia="宋体" w:hAnsi="Times New Roman" w:cs="Times New Roman"/>
-          <w:kern w:val="0"/>
-          <w:sz w:val="24"/>
-          <w14:ligatures w14:val="none"/>
-        </w:rPr>
-        <w:t xml:space="preserve"> was used to normalize raw counts to log2 counts per million (log2CPM). Only those genes which are expressed in at least 20% of samples were retained. No </w:t>
-      </w:r>
-      <w:proofErr w:type="gramStart"/>
-      <w:r>
-        <w:rPr>
-          <w:rFonts w:ascii="Times New Roman" w:eastAsia="宋体" w:hAnsi="Times New Roman" w:cs="Times New Roman"/>
-          <w:kern w:val="0"/>
-          <w:sz w:val="24"/>
-          <w14:ligatures w14:val="none"/>
-        </w:rPr>
-        <w:t>cross cohort</w:t>
-      </w:r>
-      <w:proofErr w:type="gramEnd"/>
-      <w:r>
-        <w:rPr>
-          <w:rFonts w:ascii="Times New Roman" w:eastAsia="宋体" w:hAnsi="Times New Roman" w:cs="Times New Roman"/>
-          <w:kern w:val="0"/>
-          <w:sz w:val="24"/>
-          <w14:ligatures w14:val="none"/>
-        </w:rPr>
-        <w:t xml:space="preserve"> batch correction was performed as each cohort was </w:t>
-      </w:r>
-      <w:proofErr w:type="spellStart"/>
-      <w:r>
-        <w:rPr>
-          <w:rFonts w:ascii="Times New Roman" w:eastAsia="宋体" w:hAnsi="Times New Roman" w:cs="Times New Roman"/>
-          <w:kern w:val="0"/>
-          <w:sz w:val="24"/>
-          <w14:ligatures w14:val="none"/>
-        </w:rPr>
-        <w:t>analysed</w:t>
-      </w:r>
-      <w:proofErr w:type="spellEnd"/>
-      <w:r>
-        <w:rPr>
-          <w:rFonts w:ascii="Times New Roman" w:eastAsia="宋体" w:hAnsi="Times New Roman" w:cs="Times New Roman"/>
-          <w:kern w:val="0"/>
-          <w:sz w:val="24"/>
-          <w14:ligatures w14:val="none"/>
-        </w:rPr>
-        <w:t xml:space="preserve"> separately. A summary of the public transcriptomic cohorts, software tools and supplemental datasets produced in this study are presented in Table 1. Key Resources Table. In this retrospective analysis bioinformatic approach without the use of any antibody, cell lines, or commercial assays.</w:t>
+        <w:t>The RNA sequencing expression data and clinical information were downloaded from The Cancer Genome Atlas (TCGA) and the Gene Expression Omnibus (GEO; GSE21122 and GSE159659). In the TCGA cohort, there were 50 patients with DDLPS (33 male and 17 female) with an age of 61.5 years (median). The GEO cohorts included 158 (GSE21122) and 45 (GSE159659) patients. voom was used to normalize raw counts to log2 counts per million (log2CPM). Only those genes which are expressed in at least 20% of samples were retained. No cross cohort batch correction was performed as each cohort was analysed separately. A summary of the public transcriptomic cohorts, software tools and supplemental datasets produced in this study are presented in Table 1. Key Resources Table. In this retrospective analysis bioinformatic approach without the use of any antibody, cell lines, or commercial assays.</w:t>
       </w:r>
     </w:p>
     <w:p>
@@ -1091,27 +745,7 @@
           <w:sz w:val="24"/>
           <w14:ligatures w14:val="none"/>
         </w:rPr>
-        <w:t xml:space="preserve">The selected genes of lipid metabolism were FASN, ACLY, SCD, SREBF1, HMGCR and PPARG. In preliminary analysis (log2FC&gt;1 and adjusted p&lt;0.05), these genes were </w:t>
-      </w:r>
-      <w:proofErr w:type="gramStart"/>
-      <w:r>
-        <w:rPr>
-          <w:rFonts w:ascii="Times New Roman" w:eastAsia="宋体" w:hAnsi="Times New Roman" w:cs="Times New Roman"/>
-          <w:kern w:val="0"/>
-          <w:sz w:val="24"/>
-          <w14:ligatures w14:val="none"/>
-        </w:rPr>
-        <w:t>significantly up</w:t>
-      </w:r>
-      <w:proofErr w:type="gramEnd"/>
-      <w:r>
-        <w:rPr>
-          <w:rFonts w:ascii="Times New Roman" w:eastAsia="宋体" w:hAnsi="Times New Roman" w:cs="Times New Roman"/>
-          <w:kern w:val="0"/>
-          <w:sz w:val="24"/>
-          <w14:ligatures w14:val="none"/>
-        </w:rPr>
-        <w:t xml:space="preserve"> regulated in the high score group. Principal component analysis (PCA) of the log2CPM values of these six genes was used to create a lipid metabolism score. The score for the first principal component (which explained 48.6% of variance) was obtained. Patients were classified according to the median score.</w:t>
+        <w:t>The selected genes of lipid metabolism were FASN, ACLY, SCD, SREBF1, HMGCR and PPARG. In preliminary analysis (log2FC&gt;1 and adjusted p&lt;0.05), these genes were significantly up regulated in the high score group. Principal component analysis (PCA) of the log2CPM values of these six genes was used to create a lipid metabolism score. The score for the first principal component (which explained 48.6% of variance) was obtained. Patients were classified according to the median score.</w:t>
       </w:r>
     </w:p>
     <w:p>
@@ -1194,27 +828,7 @@
           <w:sz w:val="24"/>
           <w14:ligatures w14:val="none"/>
         </w:rPr>
-        <w:t xml:space="preserve">The differential expression was analyzed by </w:t>
-      </w:r>
-      <w:proofErr w:type="spellStart"/>
-      <w:r>
-        <w:rPr>
-          <w:rFonts w:ascii="Times New Roman" w:eastAsia="宋体" w:hAnsi="Times New Roman" w:cs="Times New Roman"/>
-          <w:kern w:val="0"/>
-          <w:sz w:val="24"/>
-          <w14:ligatures w14:val="none"/>
-        </w:rPr>
-        <w:t>limma</w:t>
-      </w:r>
-      <w:proofErr w:type="spellEnd"/>
-      <w:r>
-        <w:rPr>
-          <w:rFonts w:ascii="Times New Roman" w:eastAsia="宋体" w:hAnsi="Times New Roman" w:cs="Times New Roman"/>
-          <w:kern w:val="0"/>
-          <w:sz w:val="24"/>
-          <w14:ligatures w14:val="none"/>
-        </w:rPr>
-        <w:t xml:space="preserve"> package (version 3.56.2) with Benjamini Hochberg correction. Significant threshold: log2FC&gt;1 and adjusted p&lt;0.05.</w:t>
+        <w:t>The differential expression was analyzed by limma package (version 3.56.2) with Benjamini Hochberg correction. Significant threshold: log2FC&gt;1 and adjusted p&lt;0.05.</w:t>
       </w:r>
     </w:p>
     <w:p>
@@ -1297,47 +911,7 @@
           <w:sz w:val="24"/>
           <w14:ligatures w14:val="none"/>
         </w:rPr>
-        <w:t xml:space="preserve">The GSEA was carried out based on the gene sets in the </w:t>
-      </w:r>
-      <w:proofErr w:type="spellStart"/>
-      <w:r>
-        <w:rPr>
-          <w:rFonts w:ascii="Times New Roman" w:eastAsia="宋体" w:hAnsi="Times New Roman" w:cs="Times New Roman"/>
-          <w:kern w:val="0"/>
-          <w:sz w:val="24"/>
-          <w14:ligatures w14:val="none"/>
-        </w:rPr>
-        <w:t>MSigDB</w:t>
-      </w:r>
-      <w:proofErr w:type="spellEnd"/>
-      <w:r>
-        <w:rPr>
-          <w:rFonts w:ascii="Times New Roman" w:eastAsia="宋体" w:hAnsi="Times New Roman" w:cs="Times New Roman"/>
-          <w:kern w:val="0"/>
-          <w:sz w:val="24"/>
-          <w14:ligatures w14:val="none"/>
-        </w:rPr>
-        <w:t xml:space="preserve"> Hallmark gene set collection (v7.4) with the package </w:t>
-      </w:r>
-      <w:proofErr w:type="spellStart"/>
-      <w:r>
-        <w:rPr>
-          <w:rFonts w:ascii="Times New Roman" w:eastAsia="宋体" w:hAnsi="Times New Roman" w:cs="Times New Roman"/>
-          <w:kern w:val="0"/>
-          <w:sz w:val="24"/>
-          <w14:ligatures w14:val="none"/>
-        </w:rPr>
-        <w:t>clusterProfiler</w:t>
-      </w:r>
-      <w:proofErr w:type="spellEnd"/>
-      <w:r>
-        <w:rPr>
-          <w:rFonts w:ascii="Times New Roman" w:eastAsia="宋体" w:hAnsi="Times New Roman" w:cs="Times New Roman"/>
-          <w:kern w:val="0"/>
-          <w:sz w:val="24"/>
-          <w14:ligatures w14:val="none"/>
-        </w:rPr>
-        <w:t xml:space="preserve"> (20). Pathways with false discovery rate (FDR) &lt; 0.05 were deemed to be significantly different (1,000 permutations).</w:t>
+        <w:t>The GSEA was carried out based on the gene sets in the MSigDB Hallmark gene set collection (v7.4) with the package clusterProfiler (20). Pathways with false discovery rate (FDR) &lt; 0.05 were deemed to be significantly different (1,000 permutations).</w:t>
       </w:r>
     </w:p>
     <w:p>
@@ -1496,25 +1070,14 @@
         </w:rPr>
         <w:t xml:space="preserve">  </w:t>
       </w:r>
-      <w:proofErr w:type="spellStart"/>
-      <w:r>
-        <w:rPr>
-          <w:rFonts w:ascii="Times New Roman" w:eastAsia="宋体" w:hAnsi="Times New Roman" w:cs="Times New Roman"/>
-          <w:kern w:val="0"/>
-          <w:sz w:val="24"/>
-          <w14:ligatures w14:val="none"/>
-        </w:rPr>
-        <w:t>DoRothEA</w:t>
-      </w:r>
-      <w:proofErr w:type="spellEnd"/>
-      <w:r>
-        <w:rPr>
-          <w:rFonts w:ascii="Times New Roman" w:eastAsia="宋体" w:hAnsi="Times New Roman" w:cs="Times New Roman"/>
-          <w:kern w:val="0"/>
-          <w:sz w:val="24"/>
-          <w14:ligatures w14:val="none"/>
-        </w:rPr>
-        <w:t xml:space="preserve"> v1.0 was used to infer transcription factor (TF) activity (confidence levels A and B). The following 4 TFs were examined: PPARG, E2F1, MYC, and SREBF1.</w:t>
+      <w:r>
+        <w:rPr>
+          <w:rFonts w:ascii="Times New Roman" w:eastAsia="宋体" w:hAnsi="Times New Roman" w:cs="Times New Roman"/>
+          <w:kern w:val="0"/>
+          <w:sz w:val="24"/>
+          <w14:ligatures w14:val="none"/>
+        </w:rPr>
+        <w:t>DoRothEA v1.0 was used to infer transcription factor (TF) activity (confidence levels A and B). The following 4 TFs were examined: PPARG, E2F1, MYC, and SREBF1.</w:t>
       </w:r>
     </w:p>
     <w:p>
@@ -1682,87 +1245,7 @@
           <w:sz w:val="24"/>
           <w14:ligatures w14:val="none"/>
         </w:rPr>
-        <w:t xml:space="preserve">Overall survival (OS) was defined from diagnosis to death or last follow up. The Kaplan Meier curves were used along with log rank tests. The univariate and multivariate Cox proportional hazards models were used to assess the score, age, gender and </w:t>
-      </w:r>
-      <w:proofErr w:type="spellStart"/>
-      <w:r>
-        <w:rPr>
-          <w:rFonts w:ascii="Times New Roman" w:eastAsia="宋体" w:hAnsi="Times New Roman" w:cs="Times New Roman"/>
-          <w:kern w:val="0"/>
-          <w:sz w:val="24"/>
-          <w14:ligatures w14:val="none"/>
-        </w:rPr>
-        <w:t>tumour</w:t>
-      </w:r>
-      <w:proofErr w:type="spellEnd"/>
-      <w:r>
-        <w:rPr>
-          <w:rFonts w:ascii="Times New Roman" w:eastAsia="宋体" w:hAnsi="Times New Roman" w:cs="Times New Roman"/>
-          <w:kern w:val="0"/>
-          <w:sz w:val="24"/>
-          <w14:ligatures w14:val="none"/>
-        </w:rPr>
-        <w:t xml:space="preserve"> stage as prognostic factors. HR (95% CI) were reported. Time dependent ROC was performed using </w:t>
-      </w:r>
-      <w:proofErr w:type="spellStart"/>
-      <w:r>
-        <w:rPr>
-          <w:rFonts w:ascii="Times New Roman" w:eastAsia="宋体" w:hAnsi="Times New Roman" w:cs="Times New Roman"/>
-          <w:kern w:val="0"/>
-          <w:sz w:val="24"/>
-          <w14:ligatures w14:val="none"/>
-        </w:rPr>
-        <w:t>timeROC</w:t>
-      </w:r>
-      <w:proofErr w:type="spellEnd"/>
-      <w:r>
-        <w:rPr>
-          <w:rFonts w:ascii="Times New Roman" w:eastAsia="宋体" w:hAnsi="Times New Roman" w:cs="Times New Roman"/>
-          <w:kern w:val="0"/>
-          <w:sz w:val="24"/>
-          <w14:ligatures w14:val="none"/>
-        </w:rPr>
-        <w:t xml:space="preserve"> (</w:t>
-      </w:r>
-      <w:proofErr w:type="gramStart"/>
-      <w:r>
-        <w:rPr>
-          <w:rFonts w:ascii="Times New Roman" w:eastAsia="宋体" w:hAnsi="Times New Roman" w:cs="Times New Roman"/>
-          <w:kern w:val="0"/>
-          <w:sz w:val="24"/>
-          <w14:ligatures w14:val="none"/>
-        </w:rPr>
-        <w:t>1 ,</w:t>
-      </w:r>
-      <w:proofErr w:type="gramEnd"/>
-      <w:r>
-        <w:rPr>
-          <w:rFonts w:ascii="Times New Roman" w:eastAsia="宋体" w:hAnsi="Times New Roman" w:cs="Times New Roman"/>
-          <w:kern w:val="0"/>
-          <w:sz w:val="24"/>
-          <w14:ligatures w14:val="none"/>
-        </w:rPr>
-        <w:t xml:space="preserve"> </w:t>
-      </w:r>
-      <w:proofErr w:type="gramStart"/>
-      <w:r>
-        <w:rPr>
-          <w:rFonts w:ascii="Times New Roman" w:eastAsia="宋体" w:hAnsi="Times New Roman" w:cs="Times New Roman"/>
-          <w:kern w:val="0"/>
-          <w:sz w:val="24"/>
-          <w14:ligatures w14:val="none"/>
-        </w:rPr>
-        <w:t>3 ,</w:t>
-      </w:r>
-      <w:proofErr w:type="gramEnd"/>
-      <w:r>
-        <w:rPr>
-          <w:rFonts w:ascii="Times New Roman" w:eastAsia="宋体" w:hAnsi="Times New Roman" w:cs="Times New Roman"/>
-          <w:kern w:val="0"/>
-          <w:sz w:val="24"/>
-          <w14:ligatures w14:val="none"/>
-        </w:rPr>
-        <w:t xml:space="preserve"> 5 year) with 1000 bootstrap replicates.</w:t>
+        <w:t>Overall survival (OS) was defined from diagnosis to death or last follow up. The Kaplan Meier curves were used along with log rank tests. The univariate and multivariate Cox proportional hazards models were used to assess the score, age, gender and tumour stage as prognostic factors. HR (95% CI) were reported. Time dependent ROC was performed using timeROC (1 , 3 , 5 year) with 1000 bootstrap replicates.</w:t>
       </w:r>
     </w:p>
     <w:p>
@@ -1934,27 +1417,7 @@
           <w:sz w:val="24"/>
           <w14:ligatures w14:val="none"/>
         </w:rPr>
-        <w:t xml:space="preserve">Data were analyzed with R version 4.6.0. Wilcoxon rank sum test was used for continuous variables; chi square or Fisher's exact test for categorical variables; Spearman correlation for correlation analyses. </w:t>
-      </w:r>
-      <w:proofErr w:type="gramStart"/>
-      <w:r>
-        <w:rPr>
-          <w:rFonts w:ascii="Times New Roman" w:eastAsia="宋体" w:hAnsi="Times New Roman" w:cs="Times New Roman"/>
-          <w:kern w:val="0"/>
-          <w:sz w:val="24"/>
-          <w14:ligatures w14:val="none"/>
-        </w:rPr>
-        <w:t>Two sided</w:t>
-      </w:r>
-      <w:proofErr w:type="gramEnd"/>
-      <w:r>
-        <w:rPr>
-          <w:rFonts w:ascii="Times New Roman" w:eastAsia="宋体" w:hAnsi="Times New Roman" w:cs="Times New Roman"/>
-          <w:kern w:val="0"/>
-          <w:sz w:val="24"/>
-          <w14:ligatures w14:val="none"/>
-        </w:rPr>
-        <w:t xml:space="preserve"> p &lt; 0.05 was considered significant. Bonferroni correction for multiple comparisons performed by Benjamini FDR.</w:t>
+        <w:t>Data were analyzed with R version 4.6.0. Wilcoxon rank sum test was used for continuous variables; chi square or Fisher's exact test for categorical variables; Spearman correlation for correlation analyses. Two sided p &lt; 0.05 was considered significant. Bonferroni correction for multiple comparisons performed by Benjamini FDR.</w:t>
       </w:r>
     </w:p>
     <w:p>
@@ -2038,27 +1501,7 @@
           <w:sz w:val="24"/>
           <w14:ligatures w14:val="none"/>
         </w:rPr>
-        <w:t xml:space="preserve">  We sought to evaluate if a measurable alteration of lipid metabolism is present in DDLPS by </w:t>
-      </w:r>
-      <w:proofErr w:type="spellStart"/>
-      <w:r>
-        <w:rPr>
-          <w:rFonts w:ascii="Times New Roman" w:eastAsia="宋体" w:hAnsi="Times New Roman" w:cs="Times New Roman"/>
-          <w:kern w:val="0"/>
-          <w:sz w:val="24"/>
-          <w14:ligatures w14:val="none"/>
-        </w:rPr>
-        <w:t>analysing</w:t>
-      </w:r>
-      <w:proofErr w:type="spellEnd"/>
-      <w:r>
-        <w:rPr>
-          <w:rFonts w:ascii="Times New Roman" w:eastAsia="宋体" w:hAnsi="Times New Roman" w:cs="Times New Roman"/>
-          <w:kern w:val="0"/>
-          <w:sz w:val="24"/>
-          <w14:ligatures w14:val="none"/>
-        </w:rPr>
-        <w:t xml:space="preserve"> transcriptomic data from two GEO cohorts and TCGA. The total number of patients included in the analysis was 253 liposarcoma patients from three independent datasets (Fig. 1A). The GSE21122 cohort contributed 158 (62.5%), TCGA 50 (19.8%), and GSE159659 45 (17.8%) (Fig. 1B). DDLPS was the most common subtype (n=61, 24.1%). The TCGA cohort consisted of 61.5 years old, median age with 66% male (Fig. 1C-E). At last follow up, 27 (54%) were alive and 23 (46%) had died (Fig. 1F).</w:t>
+        <w:t xml:space="preserve">  We sought to evaluate if a measurable alteration of lipid metabolism is present in DDLPS by analysing transcriptomic data from two GEO cohorts and TCGA. The total number of patients included in the analysis was 253 liposarcoma patients from three independent datasets (Fig. 1A). The GSE21122 cohort contributed 158 (62.5%), TCGA 50 (19.8%), and GSE159659 45 (17.8%) (Fig. 1B). DDLPS was the most common subtype (n=61, 24.1%). The TCGA cohort consisted of 61.5 years old, median age with 66% male (Fig. 1C-E). At last follow up, 27 (54%) were alive and 23 (46%) had died (Fig. 1F).</w:t>
       </w:r>
     </w:p>
     <w:p>
@@ -2085,47 +1528,7 @@
           <w:sz w:val="24"/>
           <w14:ligatures w14:val="none"/>
         </w:rPr>
-        <w:t xml:space="preserve">  The first principal component of six coordinately expressed genes (FASN, ACLY, SCD, SREBF1, HMGCR, PPARG) was used to calculate the lipid metabolism score which was significantly different between the subtypes. The maximum median score was achieved by DDLPS (Fig. 2A). The scores were shown to be similar (Fig. 2B) among all three cohorts. Interestingly, scores were significantly higher in males (p &lt; 0.05; Fig. 2C) and deceased patients (p &lt; 0.05; Fig. 2D). The score was found to be near normal with median ~5.2, range 3.9 8.5, and no correlation with age (Spearman R = 0.041, p = 0.78; Fig. 2F-H). Coordinated expression of the 6 genes was confirmed by heatmap (Fig. 2G). There was no correlation between </w:t>
-      </w:r>
-      <w:proofErr w:type="spellStart"/>
-      <w:r>
-        <w:rPr>
-          <w:rFonts w:ascii="Times New Roman" w:eastAsia="宋体" w:hAnsi="Times New Roman" w:cs="Times New Roman"/>
-          <w:kern w:val="0"/>
-          <w:sz w:val="24"/>
-          <w14:ligatures w14:val="none"/>
-        </w:rPr>
-        <w:t>tumour</w:t>
-      </w:r>
-      <w:proofErr w:type="spellEnd"/>
-      <w:r>
-        <w:rPr>
-          <w:rFonts w:ascii="Times New Roman" w:eastAsia="宋体" w:hAnsi="Times New Roman" w:cs="Times New Roman"/>
-          <w:kern w:val="0"/>
-          <w:sz w:val="24"/>
-          <w14:ligatures w14:val="none"/>
-        </w:rPr>
-        <w:t xml:space="preserve"> size and Fédération Nationale des </w:t>
-      </w:r>
-      <w:proofErr w:type="spellStart"/>
-      <w:r>
-        <w:rPr>
-          <w:rFonts w:ascii="Times New Roman" w:eastAsia="宋体" w:hAnsi="Times New Roman" w:cs="Times New Roman"/>
-          <w:kern w:val="0"/>
-          <w:sz w:val="24"/>
-          <w14:ligatures w14:val="none"/>
-        </w:rPr>
-        <w:t>Centres</w:t>
-      </w:r>
-      <w:proofErr w:type="spellEnd"/>
-      <w:r>
-        <w:rPr>
-          <w:rFonts w:ascii="Times New Roman" w:eastAsia="宋体" w:hAnsi="Times New Roman" w:cs="Times New Roman"/>
-          <w:kern w:val="0"/>
-          <w:sz w:val="24"/>
-          <w14:ligatures w14:val="none"/>
-        </w:rPr>
-        <w:t xml:space="preserve"> de Lutte Contre le Cancer (FNCLCC) grade (Fig. S2A and B). Table S2 contains the names of the six core genes.</w:t>
+        <w:t xml:space="preserve">  The first principal component of six coordinately expressed genes (FASN, ACLY, SCD, SREBF1, HMGCR, PPARG) was used to calculate the lipid metabolism score which was significantly different between the subtypes. The maximum median score was achieved by DDLPS (Fig. 2A). The scores were shown to be similar (Fig. 2B) among all three cohorts. Interestingly, scores were significantly higher in males (p &lt; 0.05; Fig. 2C) and deceased patients (p &lt; 0.05; Fig. 2D). The score was found to be near normal with median ~5.2, range 3.9 8.5, and no correlation with age (Spearman R = 0.041, p = 0.78; Fig. 2F-H). Coordinated expression of the 6 genes was confirmed by heatmap (Fig. 2G). There was no correlation between tumour size and Fédération Nationale des Centres de Lutte Contre le Cancer (FNCLCC) grade (Fig. S2A and B). Table S2 contains the names of the six core genes.</w:t>
       </w:r>
     </w:p>
     <w:p>
@@ -2287,47 +1690,7 @@
           <w:sz w:val="24"/>
           <w14:ligatures w14:val="none"/>
         </w:rPr>
-        <w:t xml:space="preserve">We applied differential expression analysis to find out the </w:t>
-      </w:r>
-      <w:proofErr w:type="gramStart"/>
-      <w:r>
-        <w:rPr>
-          <w:rFonts w:ascii="Times New Roman" w:eastAsia="宋体" w:hAnsi="Times New Roman" w:cs="Times New Roman"/>
-          <w:kern w:val="0"/>
-          <w:sz w:val="24"/>
-          <w14:ligatures w14:val="none"/>
-        </w:rPr>
-        <w:t>transcriptional</w:t>
-      </w:r>
-      <w:proofErr w:type="gramEnd"/>
-      <w:r>
-        <w:rPr>
-          <w:rFonts w:ascii="Times New Roman" w:eastAsia="宋体" w:hAnsi="Times New Roman" w:cs="Times New Roman"/>
-          <w:kern w:val="0"/>
-          <w:sz w:val="24"/>
-          <w14:ligatures w14:val="none"/>
-        </w:rPr>
-        <w:t xml:space="preserve"> program underlying high score vs low score tumors. The 52 genes considered significantly up regulated and the 5 down regulated genes had a stringent threshold of log2FC &gt; 1 and an adjusted p &lt; 0.05 in the high score tumors (Fig. 4A). The core lipid metabolism genes were among the genes that were coordinately upregulated. These genes encompassed FASN, ACLY, SCD, SREBF1, HMGCR and PPARG. Among them, FASN showed the highest upregulation level, followed by ACLY (log2FC = 1.21) and SCD (log2FC = 1.15). These enzymes are </w:t>
-      </w:r>
-      <w:proofErr w:type="spellStart"/>
-      <w:r>
-        <w:rPr>
-          <w:rFonts w:ascii="Times New Roman" w:eastAsia="宋体" w:hAnsi="Times New Roman" w:cs="Times New Roman"/>
-          <w:kern w:val="0"/>
-          <w:sz w:val="24"/>
-          <w14:ligatures w14:val="none"/>
-        </w:rPr>
-        <w:t>co-ordinated</w:t>
-      </w:r>
-      <w:proofErr w:type="spellEnd"/>
-      <w:r>
-        <w:rPr>
-          <w:rFonts w:ascii="Times New Roman" w:eastAsia="宋体" w:hAnsi="Times New Roman" w:cs="Times New Roman"/>
-          <w:kern w:val="0"/>
-          <w:sz w:val="24"/>
-          <w14:ligatures w14:val="none"/>
-        </w:rPr>
-        <w:t xml:space="preserve"> upregulations, implying that these enzymes do not act as a random set of transcriptional changes.</w:t>
+        <w:t>We applied differential expression analysis to find out the transcriptional program underlying high score vs low score tumors. The 52 genes considered significantly up regulated and the 5 down regulated genes had a stringent threshold of log2FC &gt; 1 and an adjusted p &lt; 0.05 in the high score tumors (Fig. 4A). The core lipid metabolism genes were among the genes that were coordinately upregulated. These genes encompassed FASN, ACLY, SCD, SREBF1, HMGCR and PPARG. Among them, FASN showed the highest upregulation level, followed by ACLY (log2FC = 1.21) and SCD (log2FC = 1.15). These enzymes are co-ordinated upregulations, implying that these enzymes do not act as a random set of transcriptional changes.</w:t>
       </w:r>
     </w:p>
     <w:p>
@@ -2448,47 +1811,7 @@
           <w:sz w:val="24"/>
           <w14:ligatures w14:val="none"/>
         </w:rPr>
-        <w:t xml:space="preserve">The GSEA analysis was performed against the </w:t>
-      </w:r>
-      <w:proofErr w:type="spellStart"/>
-      <w:r>
-        <w:rPr>
-          <w:rFonts w:ascii="Times New Roman" w:eastAsia="宋体" w:hAnsi="Times New Roman" w:cs="Times New Roman"/>
-          <w:kern w:val="0"/>
-          <w:sz w:val="24"/>
-          <w14:ligatures w14:val="none"/>
-        </w:rPr>
-        <w:t>MSigDB</w:t>
-      </w:r>
-      <w:proofErr w:type="spellEnd"/>
-      <w:r>
-        <w:rPr>
-          <w:rFonts w:ascii="Times New Roman" w:eastAsia="宋体" w:hAnsi="Times New Roman" w:cs="Times New Roman"/>
-          <w:kern w:val="0"/>
-          <w:sz w:val="24"/>
-          <w14:ligatures w14:val="none"/>
-        </w:rPr>
-        <w:t xml:space="preserve"> Hallmark gene sets, showing a remarkable dual phenotypic signature which distinguished high score tumors from low score tumors. High score tumors had significant enrichment of cell cycle related pathways, such as </w:t>
-      </w:r>
-      <w:proofErr w:type="spellStart"/>
-      <w:r>
-        <w:rPr>
-          <w:rFonts w:ascii="Times New Roman" w:eastAsia="宋体" w:hAnsi="Times New Roman" w:cs="Times New Roman"/>
-          <w:kern w:val="0"/>
-          <w:sz w:val="24"/>
-          <w14:ligatures w14:val="none"/>
-        </w:rPr>
-        <w:t>Mitotic_Spindle</w:t>
-      </w:r>
-      <w:proofErr w:type="spellEnd"/>
-      <w:r>
-        <w:rPr>
-          <w:rFonts w:ascii="Times New Roman" w:eastAsia="宋体" w:hAnsi="Times New Roman" w:cs="Times New Roman"/>
-          <w:kern w:val="0"/>
-          <w:sz w:val="24"/>
-          <w14:ligatures w14:val="none"/>
-        </w:rPr>
-        <w:t xml:space="preserve"> (NES = 1.64, FDR &lt; 0.05), G2m_Checkpoint (NES = 1.58), E2f_Targets (NES = 1.57), Myc_Targets_V1, and Mtorc1_Signaling (Fig. 4C E). The concerted triggering of pathways involved in cell proliferation is indicative of the fact that increased lipid metabolism supplies membrane components, energy sources and signaling molecules required for quick cell proliferation. A further implication of oncogenic transcription factor networks in driving this proliferative phenotype comes from the enrichment of E2F and MYC target genes.</w:t>
+        <w:t>The GSEA analysis was performed against the MSigDB Hallmark gene sets, showing a remarkable dual phenotypic signature which distinguished high score tumors from low score tumors. High score tumors had significant enrichment of cell cycle related pathways, such as Mitotic_Spindle (NES = 1.64, FDR &lt; 0.05), G2m_Checkpoint (NES = 1.58), E2f_Targets (NES = 1.57), Myc_Targets_V1, and Mtorc1_Signaling (Fig. 4C E). The concerted triggering of pathways involved in cell proliferation is indicative of the fact that increased lipid metabolism supplies membrane components, energy sources and signaling molecules required for quick cell proliferation. A further implication of oncogenic transcription factor networks in driving this proliferative phenotype comes from the enrichment of E2F and MYC target genes.</w:t>
       </w:r>
     </w:p>
     <w:p>
@@ -2514,67 +1837,7 @@
           <w:sz w:val="24"/>
           <w14:ligatures w14:val="none"/>
         </w:rPr>
-        <w:t xml:space="preserve">  In contrast, high score </w:t>
-      </w:r>
-      <w:proofErr w:type="spellStart"/>
-      <w:r>
-        <w:rPr>
-          <w:rFonts w:ascii="Times New Roman" w:eastAsia="宋体" w:hAnsi="Times New Roman" w:cs="Times New Roman"/>
-          <w:kern w:val="0"/>
-          <w:sz w:val="24"/>
-          <w14:ligatures w14:val="none"/>
-        </w:rPr>
-        <w:t>tumours</w:t>
-      </w:r>
-      <w:proofErr w:type="spellEnd"/>
-      <w:r>
-        <w:rPr>
-          <w:rFonts w:ascii="Times New Roman" w:eastAsia="宋体" w:hAnsi="Times New Roman" w:cs="Times New Roman"/>
-          <w:kern w:val="0"/>
-          <w:sz w:val="24"/>
-          <w14:ligatures w14:val="none"/>
-        </w:rPr>
-        <w:t xml:space="preserve"> showed strong downregulation of immune related pathways. The interferon gamma response pathway was the most dramatically down-regulated pathway (NES = −1.82, FDR &lt; 0.05), followed by </w:t>
-      </w:r>
-      <w:proofErr w:type="spellStart"/>
-      <w:r>
-        <w:rPr>
-          <w:rFonts w:ascii="Times New Roman" w:eastAsia="宋体" w:hAnsi="Times New Roman" w:cs="Times New Roman"/>
-          <w:kern w:val="0"/>
-          <w:sz w:val="24"/>
-          <w14:ligatures w14:val="none"/>
-        </w:rPr>
-        <w:t>inflammatory_response</w:t>
-      </w:r>
-      <w:proofErr w:type="spellEnd"/>
-      <w:r>
-        <w:rPr>
-          <w:rFonts w:ascii="Times New Roman" w:eastAsia="宋体" w:hAnsi="Times New Roman" w:cs="Times New Roman"/>
-          <w:kern w:val="0"/>
-          <w:sz w:val="24"/>
-          <w14:ligatures w14:val="none"/>
-        </w:rPr>
-        <w:t xml:space="preserve"> (NES = −1.76), il6_jak_stat3_signaling (NES = −1.68), and </w:t>
-      </w:r>
-      <w:proofErr w:type="spellStart"/>
-      <w:r>
-        <w:rPr>
-          <w:rFonts w:ascii="Times New Roman" w:eastAsia="宋体" w:hAnsi="Times New Roman" w:cs="Times New Roman"/>
-          <w:kern w:val="0"/>
-          <w:sz w:val="24"/>
-          <w14:ligatures w14:val="none"/>
-        </w:rPr>
-        <w:t>tnf_signaling_via_nfkb</w:t>
-      </w:r>
-      <w:proofErr w:type="spellEnd"/>
-      <w:r>
-        <w:rPr>
-          <w:rFonts w:ascii="Times New Roman" w:eastAsia="宋体" w:hAnsi="Times New Roman" w:cs="Times New Roman"/>
-          <w:kern w:val="0"/>
-          <w:sz w:val="24"/>
-          <w14:ligatures w14:val="none"/>
-        </w:rPr>
-        <w:t xml:space="preserve"> (NES = −1.59) (Fig. 4H). This immune suppressive signature is especially significant given the possibility that, through metabolic competition in the tumor microenvironment or direct immune evasion mechanisms, high lipid metabolism could actively support immune evasion processes directly or indirectly.</w:t>
+        <w:t xml:space="preserve">  In contrast, high score tumours showed strong downregulation of immune related pathways. The interferon gamma response pathway was the most dramatically down-regulated pathway (NES = −1.82, FDR &lt; 0.05), followed by inflammatory_response (NES = −1.76), il6_jak_stat3_signaling (NES = −1.68), and tnf_signaling_via_nfkb (NES = −1.59) (Fig. 4H). This immune suppressive signature is especially significant given the possibility that, through metabolic competition in the tumor microenvironment or direct immune evasion mechanisms, high lipid metabolism could actively support immune evasion processes directly or indirectly.</w:t>
       </w:r>
     </w:p>
     <w:p>
@@ -2600,47 +1863,7 @@
           <w:sz w:val="24"/>
           <w14:ligatures w14:val="none"/>
         </w:rPr>
-        <w:t xml:space="preserve">  These GSEA results were multi-faceted validated with complementary visualization methods. The pathway network analysis (Supplementary Fig. S2C) was used to identify that the pathways were interlinked and showed that there was </w:t>
-      </w:r>
-      <w:proofErr w:type="spellStart"/>
-      <w:r>
-        <w:rPr>
-          <w:rFonts w:ascii="Times New Roman" w:eastAsia="宋体" w:hAnsi="Times New Roman" w:cs="Times New Roman"/>
-          <w:kern w:val="0"/>
-          <w:sz w:val="24"/>
-          <w14:ligatures w14:val="none"/>
-        </w:rPr>
-        <w:t>co-ordinated</w:t>
-      </w:r>
-      <w:proofErr w:type="spellEnd"/>
-      <w:r>
-        <w:rPr>
-          <w:rFonts w:ascii="Times New Roman" w:eastAsia="宋体" w:hAnsi="Times New Roman" w:cs="Times New Roman"/>
-          <w:kern w:val="0"/>
-          <w:sz w:val="24"/>
-          <w14:ligatures w14:val="none"/>
-        </w:rPr>
-        <w:t xml:space="preserve"> activation of pathways, rather than isolated perturbations. The forest plot of top pathways (Supplementary Fig. S2D) gave an overview of pathway level effect sizes and the ridge plots of up and down regulated pathways (Supplementary Fig. S2E and F) showed the enrichment score distribution across individual pathways. The overall results lead to the dual phenotype model. This model incorporates the activation of cell cycles and immune </w:t>
-      </w:r>
-      <w:proofErr w:type="gramStart"/>
-      <w:r>
-        <w:rPr>
-          <w:rFonts w:ascii="Times New Roman" w:eastAsia="宋体" w:hAnsi="Times New Roman" w:cs="Times New Roman"/>
-          <w:kern w:val="0"/>
-          <w:sz w:val="24"/>
-          <w14:ligatures w14:val="none"/>
-        </w:rPr>
-        <w:t>suppression, and</w:t>
-      </w:r>
-      <w:proofErr w:type="gramEnd"/>
-      <w:r>
-        <w:rPr>
-          <w:rFonts w:ascii="Times New Roman" w:eastAsia="宋体" w:hAnsi="Times New Roman" w:cs="Times New Roman"/>
-          <w:kern w:val="0"/>
-          <w:sz w:val="24"/>
-          <w14:ligatures w14:val="none"/>
-        </w:rPr>
-        <w:t xml:space="preserve"> builds a mechanistic model to explain the high score and aggressive properties of tumors. Table S3 shows all 36 Hallmark pathways that are significantly enriched.</w:t>
+        <w:t xml:space="preserve">  These GSEA results were multi-faceted validated with complementary visualization methods. The pathway network analysis (Supplementary Fig. S2C) was used to identify that the pathways were interlinked and showed that there was co-ordinated activation of pathways, rather than isolated perturbations. The forest plot of top pathways (Supplementary Fig. S2D) gave an overview of pathway level effect sizes and the ridge plots of up and down regulated pathways (Supplementary Fig. S2E and F) showed the enrichment score distribution across individual pathways. The overall results lead to the dual phenotype model. This model incorporates the activation of cell cycles and immune suppression, and builds a mechanistic model to explain the high score and aggressive properties of tumors. Table S3 shows all 36 Hallmark pathways that are significantly enriched.</w:t>
       </w:r>
     </w:p>
     <w:p>
@@ -2734,27 +1957,7 @@
           <w14:ligatures w14:val="none"/>
         </w:rPr>
         <w:lastRenderedPageBreak/>
-        <w:t xml:space="preserve">  The expression of PPARG and CD36 was significantly higher in high score patients than in low score patients. The p values were 0.004 and 0.006 respectively (Fig. 5A–5B). These are all core pathway molecules that are transcriptionally upregulated and are stable features of high score </w:t>
-      </w:r>
-      <w:proofErr w:type="spellStart"/>
-      <w:r>
-        <w:rPr>
-          <w:rFonts w:ascii="Times New Roman" w:eastAsia="宋体" w:hAnsi="Times New Roman" w:cs="Times New Roman"/>
-          <w:kern w:val="0"/>
-          <w:sz w:val="24"/>
-          <w14:ligatures w14:val="none"/>
-        </w:rPr>
-        <w:t>tumours</w:t>
-      </w:r>
-      <w:proofErr w:type="spellEnd"/>
-      <w:r>
-        <w:rPr>
-          <w:rFonts w:ascii="Times New Roman" w:eastAsia="宋体" w:hAnsi="Times New Roman" w:cs="Times New Roman"/>
-          <w:kern w:val="0"/>
-          <w:sz w:val="24"/>
-          <w14:ligatures w14:val="none"/>
-        </w:rPr>
-        <w:t>.</w:t>
+        <w:t xml:space="preserve">  The expression of PPARG and CD36 was significantly higher in high score patients than in low score patients. The p values were 0.004 and 0.006 respectively (Fig. 5A–5B). These are all core pathway molecules that are transcriptionally upregulated and are stable features of high score tumours.</w:t>
       </w:r>
     </w:p>
     <w:p>
@@ -2780,49 +1983,7 @@
           <w:sz w:val="24"/>
           <w14:ligatures w14:val="none"/>
         </w:rPr>
-        <w:t xml:space="preserve">  The gene PPARG showed strong positive correlation with lipid metabolism score (Spearman R = 0.62, p =1.2× 10⁻⁶; Fig. 5C) and gene CD36 showed strong positive correlation with lipid metabolism score (Spearman R = 0.58, p = 8.4 × 10⁻⁶; Fig. 5D). The strong correlations indicate that the score could be used as an effective surrogate in patient tissue for PPARG/CD36 axis </w:t>
-      </w:r>
-      <w:proofErr w:type="spellStart"/>
-      <w:proofErr w:type="gramStart"/>
-      <w:r>
-        <w:rPr>
-          <w:rFonts w:ascii="Times New Roman" w:eastAsia="宋体" w:hAnsi="Times New Roman" w:cs="Times New Roman"/>
-          <w:kern w:val="0"/>
-          <w:sz w:val="24"/>
-          <w14:ligatures w14:val="none"/>
-        </w:rPr>
-        <w:t>activity.Survival</w:t>
-      </w:r>
-      <w:proofErr w:type="spellEnd"/>
-      <w:proofErr w:type="gramEnd"/>
-      <w:r>
-        <w:rPr>
-          <w:rFonts w:ascii="Times New Roman" w:eastAsia="宋体" w:hAnsi="Times New Roman" w:cs="Times New Roman"/>
-          <w:kern w:val="0"/>
-          <w:sz w:val="24"/>
-          <w14:ligatures w14:val="none"/>
-        </w:rPr>
-        <w:t xml:space="preserve"> analysis was also used to confirm the prognostic value of PPARG. Patients with high expression of PPARG had significant poorer overall survival than patients with low PPARG expression (log rank p = 0.019; Fig. 5E), consistent with what was found with the composite lipid metabolism score. The core gene heatmap revealed the strong expression correlation between the selected genes: PPARG, CD36, FASN, ACLY, SCD and SREBF1 and clearly separated patients with high from low score (Fig. 5F). We combined the expression levels of PPARG and CD36 into an integrated score by normalizing their expression levels. The PPARG+CD36 ROC curve had an AUC of 0.71 (Fig. 5G), illustrating that </w:t>
-      </w:r>
-      <w:proofErr w:type="gramStart"/>
-      <w:r>
-        <w:rPr>
-          <w:rFonts w:ascii="Times New Roman" w:eastAsia="宋体" w:hAnsi="Times New Roman" w:cs="Times New Roman"/>
-          <w:kern w:val="0"/>
-          <w:sz w:val="24"/>
-          <w14:ligatures w14:val="none"/>
-        </w:rPr>
-        <w:t>both of these</w:t>
-      </w:r>
-      <w:proofErr w:type="gramEnd"/>
-      <w:r>
-        <w:rPr>
-          <w:rFonts w:ascii="Times New Roman" w:eastAsia="宋体" w:hAnsi="Times New Roman" w:cs="Times New Roman"/>
-          <w:kern w:val="0"/>
-          <w:sz w:val="24"/>
-          <w14:ligatures w14:val="none"/>
-        </w:rPr>
-        <w:t xml:space="preserve"> genes carry a significant amount of the prognostic information in the six gene signature. Finally, a high individual patient level correlation of PPARG and CD36 (Spearman R = 0.58; p &lt; 0.001; Fig. 5H) confirmed their functional interdependence.</w:t>
+        <w:t xml:space="preserve">  The gene PPARG showed strong positive correlation with lipid metabolism score (Spearman R = 0.62, p =1.2× 10⁻⁶; Fig. 5C) and gene CD36 showed strong positive correlation with lipid metabolism score (Spearman R = 0.58, p = 8.4 × 10⁻⁶; Fig. 5D). The strong correlations indicate that the score could be used as an effective surrogate in patient tissue for PPARG/CD36 axis activity.Survival analysis was also used to confirm the prognostic value of PPARG. Patients with high expression of PPARG had significant poorer overall survival than patients with low PPARG expression (log rank p = 0.019; Fig. 5E), consistent with what was found with the composite lipid metabolism score. The core gene heatmap revealed the strong expression correlation between the selected genes: PPARG, CD36, FASN, ACLY, SCD and SREBF1 and clearly separated patients with high from low score (Fig. 5F). We combined the expression levels of PPARG and CD36 into an integrated score by normalizing their expression levels. The PPARG+CD36 ROC curve had an AUC of 0.71 (Fig. 5G), illustrating that both of these genes carry a significant amount of the prognostic information in the six gene signature. Finally, a high individual patient level correlation of PPARG and CD36 (Spearman R = 0.58; p &lt; 0.001; Fig. 5H) confirmed their functional interdependence.</w:t>
       </w:r>
     </w:p>
     <w:p>
@@ -2916,27 +2077,7 @@
           <w:sz w:val="24"/>
           <w14:ligatures w14:val="none"/>
         </w:rPr>
-        <w:t xml:space="preserve">To assess whether the observed immune pathway suppression in high score tumors was due to changes in the abundance of immune cells or due to functional changes, we systematically </w:t>
-      </w:r>
-      <w:proofErr w:type="spellStart"/>
-      <w:r>
-        <w:rPr>
-          <w:rFonts w:ascii="Times New Roman" w:eastAsia="宋体" w:hAnsi="Times New Roman" w:cs="Times New Roman"/>
-          <w:kern w:val="0"/>
-          <w:sz w:val="24"/>
-          <w14:ligatures w14:val="none"/>
-        </w:rPr>
-        <w:t>analysed</w:t>
-      </w:r>
-      <w:proofErr w:type="spellEnd"/>
-      <w:r>
-        <w:rPr>
-          <w:rFonts w:ascii="Times New Roman" w:eastAsia="宋体" w:hAnsi="Times New Roman" w:cs="Times New Roman"/>
-          <w:kern w:val="0"/>
-          <w:sz w:val="24"/>
-          <w14:ligatures w14:val="none"/>
-        </w:rPr>
-        <w:t xml:space="preserve"> immune infiltration in high score tumors using six cell type specific marker gene sets, corresponding to CD8+ T cells, CD4+ T cells, regulatory T cells (Tregs), B cells, natural killer (NK) cells and macrophages (Supplementary Fig. S3A). Immune scores were defined as the average expression of validated marker genes of each cell type. Interestingly, no significant difference in immune cell infiltration scores was found in high and low score groups for any of the six immune cell types analyzed (FDR &gt; 0.05 for all comparisons; Supplementary Fig. S3B). This was repeated with an independent set of immune marker genes, thus avoiding marker gene selection bias.</w:t>
+        <w:t>To assess whether the observed immune pathway suppression in high score tumors was due to changes in the abundance of immune cells or due to functional changes, we systematically analysed immune infiltration in high score tumors using six cell type specific marker gene sets, corresponding to CD8+ T cells, CD4+ T cells, regulatory T cells (Tregs), B cells, natural killer (NK) cells and macrophages (Supplementary Fig. S3A). Immune scores were defined as the average expression of validated marker genes of each cell type. Interestingly, no significant difference in immune cell infiltration scores was found in high and low score groups for any of the six immune cell types analyzed (FDR &gt; 0.05 for all comparisons; Supplementary Fig. S3B). This was repeated with an independent set of immune marker genes, thus avoiding marker gene selection bias.</w:t>
       </w:r>
     </w:p>
     <w:p>
@@ -2991,31 +2132,7 @@
           <w:sz w:val="24"/>
           <w14:ligatures w14:val="none"/>
         </w:rPr>
-        <w:t xml:space="preserve">Does the score provide </w:t>
-      </w:r>
-      <w:proofErr w:type="gramStart"/>
-      <w:r>
-        <w:rPr>
-          <w:rFonts w:ascii="Times New Roman" w:eastAsia="宋体" w:hAnsi="Times New Roman" w:cs="Times New Roman"/>
-          <w:b/>
-          <w:bCs/>
-          <w:kern w:val="0"/>
-          <w:sz w:val="24"/>
-          <w14:ligatures w14:val="none"/>
-        </w:rPr>
-        <w:t>a clinically</w:t>
-      </w:r>
-      <w:proofErr w:type="gramEnd"/>
-      <w:r>
-        <w:rPr>
-          <w:rFonts w:ascii="Times New Roman" w:eastAsia="宋体" w:hAnsi="Times New Roman" w:cs="Times New Roman"/>
-          <w:b/>
-          <w:bCs/>
-          <w:kern w:val="0"/>
-          <w:sz w:val="24"/>
-          <w14:ligatures w14:val="none"/>
-        </w:rPr>
-        <w:t xml:space="preserve"> useful risk stratification?</w:t>
+        <w:t>Does the score provide a clinically useful risk stratification?</w:t>
       </w:r>
     </w:p>
     <w:p>
@@ -3040,67 +2157,7 @@
           <w:sz w:val="24"/>
           <w14:ligatures w14:val="none"/>
         </w:rPr>
-        <w:t xml:space="preserve">  Lipid metabolism score showed good and clinically relevant predictive power using a variety of evaluation metrics. The AUC for 1 year survival was 0.72, </w:t>
-      </w:r>
-      <w:proofErr w:type="gramStart"/>
-      <w:r>
-        <w:rPr>
-          <w:rFonts w:ascii="Times New Roman" w:eastAsia="宋体" w:hAnsi="Times New Roman" w:cs="Times New Roman"/>
-          <w:kern w:val="0"/>
-          <w:sz w:val="24"/>
-          <w14:ligatures w14:val="none"/>
-        </w:rPr>
-        <w:t>3 year</w:t>
-      </w:r>
-      <w:proofErr w:type="gramEnd"/>
-      <w:r>
-        <w:rPr>
-          <w:rFonts w:ascii="Times New Roman" w:eastAsia="宋体" w:hAnsi="Times New Roman" w:cs="Times New Roman"/>
-          <w:kern w:val="0"/>
-          <w:sz w:val="24"/>
-          <w14:ligatures w14:val="none"/>
-        </w:rPr>
-        <w:t xml:space="preserve"> survival was </w:t>
-      </w:r>
-      <w:proofErr w:type="gramStart"/>
-      <w:r>
-        <w:rPr>
-          <w:rFonts w:ascii="Times New Roman" w:eastAsia="宋体" w:hAnsi="Times New Roman" w:cs="Times New Roman"/>
-          <w:kern w:val="0"/>
-          <w:sz w:val="24"/>
-          <w14:ligatures w14:val="none"/>
-        </w:rPr>
-        <w:t>0.68 and 5 year</w:t>
-      </w:r>
-      <w:proofErr w:type="gramEnd"/>
-      <w:r>
-        <w:rPr>
-          <w:rFonts w:ascii="Times New Roman" w:eastAsia="宋体" w:hAnsi="Times New Roman" w:cs="Times New Roman"/>
-          <w:kern w:val="0"/>
-          <w:sz w:val="24"/>
-          <w14:ligatures w14:val="none"/>
-        </w:rPr>
-        <w:t xml:space="preserve"> survival was 0.65 (Fig. 6A and B) from time dependent ROC analysis. The non-monotonic decrease of AUC over time is in line with the growing impact of the </w:t>
-      </w:r>
-      <w:proofErr w:type="gramStart"/>
-      <w:r>
-        <w:rPr>
-          <w:rFonts w:ascii="Times New Roman" w:eastAsia="宋体" w:hAnsi="Times New Roman" w:cs="Times New Roman"/>
-          <w:kern w:val="0"/>
-          <w:sz w:val="24"/>
-          <w14:ligatures w14:val="none"/>
-        </w:rPr>
-        <w:t>late stage</w:t>
-      </w:r>
-      <w:proofErr w:type="gramEnd"/>
-      <w:r>
-        <w:rPr>
-          <w:rFonts w:ascii="Times New Roman" w:eastAsia="宋体" w:hAnsi="Times New Roman" w:cs="Times New Roman"/>
-          <w:kern w:val="0"/>
-          <w:sz w:val="24"/>
-          <w14:ligatures w14:val="none"/>
-        </w:rPr>
-        <w:t xml:space="preserve"> clinical events and competing risks. However, the AUC of 0.65 for the 5-year time frame is modest but is useful for risk categorization, especially when compared to the other clinicopathological tools available that have AUC of &lt;0.65.</w:t>
+        <w:t xml:space="preserve">  Lipid metabolism score showed good and clinically relevant predictive power using a variety of evaluation metrics. The AUC for 1 year survival was 0.72, 3 year survival was 0.68 and 5 year survival was 0.65 (Fig. 6A and B) from time dependent ROC analysis. The non-monotonic decrease of AUC over time is in line with the growing impact of the late stage clinical events and competing risks. However, the AUC of 0.65 for the 5-year time frame is modest but is useful for risk categorization, especially when compared to the other clinicopathological tools available that have AUC of &lt;0.65.</w:t>
       </w:r>
     </w:p>
     <w:p>
@@ -3125,87 +2182,7 @@
           <w:sz w:val="24"/>
           <w14:ligatures w14:val="none"/>
         </w:rPr>
-        <w:t xml:space="preserve">  We created a nomogram that included age, FNCLCC grade and lipid score (Supplementary Fig. S5) to offer a clinically useful tool. The nomogram can be used to predict individual </w:t>
-      </w:r>
-      <w:proofErr w:type="gramStart"/>
-      <w:r>
-        <w:rPr>
-          <w:rFonts w:ascii="Times New Roman" w:eastAsia="宋体" w:hAnsi="Times New Roman" w:cs="Times New Roman"/>
-          <w:kern w:val="0"/>
-          <w:sz w:val="24"/>
-          <w14:ligatures w14:val="none"/>
-        </w:rPr>
-        <w:t>1, 3 and 5 year</w:t>
-      </w:r>
-      <w:proofErr w:type="gramEnd"/>
-      <w:r>
-        <w:rPr>
-          <w:rFonts w:ascii="Times New Roman" w:eastAsia="宋体" w:hAnsi="Times New Roman" w:cs="Times New Roman"/>
-          <w:kern w:val="0"/>
-          <w:sz w:val="24"/>
-          <w14:ligatures w14:val="none"/>
-        </w:rPr>
-        <w:t xml:space="preserve"> survival probability by adding the points given for each variable. Despite the small sample size, calibration curves for the nomogram showed good agreement between the predicted and observed survival at the three timepoints with the bootstrap corrected nomogram calibration curves close to the diagonal reference line (Supplementary Fig. S6), suggesting that the model was well calibrated. Decision curve analysis also confirmed the clinical usefulness of the score, showing positive net benefit over a broad range of threshold probabilities (Fig. 6C), indicating that clinical decision making based on the score would be better than </w:t>
-      </w:r>
-      <w:proofErr w:type="gramStart"/>
-      <w:r>
-        <w:rPr>
-          <w:rFonts w:ascii="Times New Roman" w:eastAsia="宋体" w:hAnsi="Times New Roman" w:cs="Times New Roman"/>
-          <w:kern w:val="0"/>
-          <w:sz w:val="24"/>
-          <w14:ligatures w14:val="none"/>
-        </w:rPr>
-        <w:t>treat</w:t>
-      </w:r>
-      <w:proofErr w:type="gramEnd"/>
-      <w:r>
-        <w:rPr>
-          <w:rFonts w:ascii="Times New Roman" w:eastAsia="宋体" w:hAnsi="Times New Roman" w:cs="Times New Roman"/>
-          <w:kern w:val="0"/>
-          <w:sz w:val="24"/>
-          <w14:ligatures w14:val="none"/>
-        </w:rPr>
-        <w:t xml:space="preserve"> all or </w:t>
-      </w:r>
-      <w:proofErr w:type="gramStart"/>
-      <w:r>
-        <w:rPr>
-          <w:rFonts w:ascii="Times New Roman" w:eastAsia="宋体" w:hAnsi="Times New Roman" w:cs="Times New Roman"/>
-          <w:kern w:val="0"/>
-          <w:sz w:val="24"/>
-          <w14:ligatures w14:val="none"/>
-        </w:rPr>
-        <w:t>treat</w:t>
-      </w:r>
-      <w:proofErr w:type="gramEnd"/>
-      <w:r>
-        <w:rPr>
-          <w:rFonts w:ascii="Times New Roman" w:eastAsia="宋体" w:hAnsi="Times New Roman" w:cs="Times New Roman"/>
-          <w:kern w:val="0"/>
-          <w:sz w:val="24"/>
-          <w14:ligatures w14:val="none"/>
-        </w:rPr>
-        <w:t xml:space="preserve"> </w:t>
-      </w:r>
-      <w:proofErr w:type="gramStart"/>
-      <w:r>
-        <w:rPr>
-          <w:rFonts w:ascii="Times New Roman" w:eastAsia="宋体" w:hAnsi="Times New Roman" w:cs="Times New Roman"/>
-          <w:kern w:val="0"/>
-          <w:sz w:val="24"/>
-          <w14:ligatures w14:val="none"/>
-        </w:rPr>
-        <w:t>none</w:t>
-      </w:r>
-      <w:proofErr w:type="gramEnd"/>
-      <w:r>
-        <w:rPr>
-          <w:rFonts w:ascii="Times New Roman" w:eastAsia="宋体" w:hAnsi="Times New Roman" w:cs="Times New Roman"/>
-          <w:kern w:val="0"/>
-          <w:sz w:val="24"/>
-          <w14:ligatures w14:val="none"/>
-        </w:rPr>
-        <w:t xml:space="preserve"> strategies.</w:t>
+        <w:t xml:space="preserve">  We created a nomogram that included age, FNCLCC grade and lipid score (Supplementary Fig. S5) to offer a clinically useful tool. The nomogram can be used to predict individual 1, 3 and 5 year survival probability by adding the points given for each variable. Despite the small sample size, calibration curves for the nomogram showed good agreement between the predicted and observed survival at the three timepoints with the bootstrap corrected nomogram calibration curves close to the diagonal reference line (Supplementary Fig. S6), suggesting that the model was well calibrated. Decision curve analysis also confirmed the clinical usefulness of the score, showing positive net benefit over a broad range of threshold probabilities (Fig. 6C), indicating that clinical decision making based on the score would be better than treat all or treat none strategies.</w:t>
       </w:r>
     </w:p>
     <w:p>
@@ -3231,147 +2208,7 @@
           <w14:ligatures w14:val="none"/>
         </w:rPr>
         <w:lastRenderedPageBreak/>
-        <w:t xml:space="preserve">  Six core lipid metabolism genes were significantly up-regulated (all p &lt; 0.001) in the high score patients; the most highly up-regulated genes were FASN (</w:t>
-      </w:r>
-      <w:proofErr w:type="gramStart"/>
-      <w:r>
-        <w:rPr>
-          <w:rFonts w:ascii="Times New Roman" w:eastAsia="宋体" w:hAnsi="Times New Roman" w:cs="Times New Roman"/>
-          <w:kern w:val="0"/>
-          <w:sz w:val="24"/>
-          <w14:ligatures w14:val="none"/>
-        </w:rPr>
-        <w:t>2.8 fold</w:t>
-      </w:r>
-      <w:proofErr w:type="gramEnd"/>
-      <w:r>
-        <w:rPr>
-          <w:rFonts w:ascii="Times New Roman" w:eastAsia="宋体" w:hAnsi="Times New Roman" w:cs="Times New Roman"/>
-          <w:kern w:val="0"/>
-          <w:sz w:val="24"/>
-          <w14:ligatures w14:val="none"/>
-        </w:rPr>
-        <w:t>), ACLY (</w:t>
-      </w:r>
-      <w:proofErr w:type="gramStart"/>
-      <w:r>
-        <w:rPr>
-          <w:rFonts w:ascii="Times New Roman" w:eastAsia="宋体" w:hAnsi="Times New Roman" w:cs="Times New Roman"/>
-          <w:kern w:val="0"/>
-          <w:sz w:val="24"/>
-          <w14:ligatures w14:val="none"/>
-        </w:rPr>
-        <w:t>2.3 fold</w:t>
-      </w:r>
-      <w:proofErr w:type="gramEnd"/>
-      <w:r>
-        <w:rPr>
-          <w:rFonts w:ascii="Times New Roman" w:eastAsia="宋体" w:hAnsi="Times New Roman" w:cs="Times New Roman"/>
-          <w:kern w:val="0"/>
-          <w:sz w:val="24"/>
-          <w14:ligatures w14:val="none"/>
-        </w:rPr>
-        <w:t>), SCD (</w:t>
-      </w:r>
-      <w:proofErr w:type="gramStart"/>
-      <w:r>
-        <w:rPr>
-          <w:rFonts w:ascii="Times New Roman" w:eastAsia="宋体" w:hAnsi="Times New Roman" w:cs="Times New Roman"/>
-          <w:kern w:val="0"/>
-          <w:sz w:val="24"/>
-          <w14:ligatures w14:val="none"/>
-        </w:rPr>
-        <w:t>2.1 fold</w:t>
-      </w:r>
-      <w:proofErr w:type="gramEnd"/>
-      <w:r>
-        <w:rPr>
-          <w:rFonts w:ascii="Times New Roman" w:eastAsia="宋体" w:hAnsi="Times New Roman" w:cs="Times New Roman"/>
-          <w:kern w:val="0"/>
-          <w:sz w:val="24"/>
-          <w14:ligatures w14:val="none"/>
-        </w:rPr>
-        <w:t>) and SREBF1 (</w:t>
-      </w:r>
-      <w:proofErr w:type="gramStart"/>
-      <w:r>
-        <w:rPr>
-          <w:rFonts w:ascii="Times New Roman" w:eastAsia="宋体" w:hAnsi="Times New Roman" w:cs="Times New Roman"/>
-          <w:kern w:val="0"/>
-          <w:sz w:val="24"/>
-          <w14:ligatures w14:val="none"/>
-        </w:rPr>
-        <w:t>1.9 fold</w:t>
-      </w:r>
-      <w:proofErr w:type="gramEnd"/>
-      <w:r>
-        <w:rPr>
-          <w:rFonts w:ascii="Times New Roman" w:eastAsia="宋体" w:hAnsi="Times New Roman" w:cs="Times New Roman"/>
-          <w:kern w:val="0"/>
-          <w:sz w:val="24"/>
-          <w14:ligatures w14:val="none"/>
-        </w:rPr>
-        <w:t xml:space="preserve">) (Fig. 6D). </w:t>
-      </w:r>
-      <w:proofErr w:type="gramStart"/>
-      <w:r>
-        <w:rPr>
-          <w:rFonts w:ascii="Times New Roman" w:eastAsia="宋体" w:hAnsi="Times New Roman" w:cs="Times New Roman"/>
-          <w:kern w:val="0"/>
-          <w:sz w:val="24"/>
-          <w14:ligatures w14:val="none"/>
-        </w:rPr>
-        <w:t>All of</w:t>
-      </w:r>
-      <w:proofErr w:type="gramEnd"/>
-      <w:r>
-        <w:rPr>
-          <w:rFonts w:ascii="Times New Roman" w:eastAsia="宋体" w:hAnsi="Times New Roman" w:cs="Times New Roman"/>
-          <w:kern w:val="0"/>
-          <w:sz w:val="24"/>
-          <w14:ligatures w14:val="none"/>
-        </w:rPr>
-        <w:t xml:space="preserve"> these genes constituted a </w:t>
-      </w:r>
-      <w:proofErr w:type="gramStart"/>
-      <w:r>
-        <w:rPr>
-          <w:rFonts w:ascii="Times New Roman" w:eastAsia="宋体" w:hAnsi="Times New Roman" w:cs="Times New Roman"/>
-          <w:kern w:val="0"/>
-          <w:sz w:val="24"/>
-          <w14:ligatures w14:val="none"/>
-        </w:rPr>
-        <w:t>highly-coordinated</w:t>
-      </w:r>
-      <w:proofErr w:type="gramEnd"/>
-      <w:r>
-        <w:rPr>
-          <w:rFonts w:ascii="Times New Roman" w:eastAsia="宋体" w:hAnsi="Times New Roman" w:cs="Times New Roman"/>
-          <w:kern w:val="0"/>
-          <w:sz w:val="24"/>
-          <w14:ligatures w14:val="none"/>
-        </w:rPr>
-        <w:t xml:space="preserve"> gene expression network in which FASN was highly correlated with ACLY (R = 0.78) and SCD (R= 0.72; Fig. 6E; Supplementary Fig. S3D). Transcription factor activity inference showed the differential activation of important transcription factor networks, with PPARG showing the activation with the highest Log2FC (1.19, p-value 0.008), followed by E2F1 (Log2FC 0.50, p-value 0.012) and SREBF1 (Log2FC 0.30, p-value 0.026) (Fig. 6F). High score patients were predicted to be sensitive to FASN inhibitors, SCD inhibitors, and CDK4/6 inhibitors, while low score patients might be more sensitive to immune checkpoint inhibitors (ICIs) (Supplementary Fig. S3C). Our approach to scoring showed good correlation with four alternatives, as the simple mean, median, weighted mean and PCA recalculation correlated well with the original PCA based score (Spearman R &gt; 0.7) and discriminated well between </w:t>
-      </w:r>
-      <w:proofErr w:type="gramStart"/>
-      <w:r>
-        <w:rPr>
-          <w:rFonts w:ascii="Times New Roman" w:eastAsia="宋体" w:hAnsi="Times New Roman" w:cs="Times New Roman"/>
-          <w:kern w:val="0"/>
-          <w:sz w:val="24"/>
-          <w14:ligatures w14:val="none"/>
-        </w:rPr>
-        <w:t>high risk</w:t>
-      </w:r>
-      <w:proofErr w:type="gramEnd"/>
-      <w:r>
-        <w:rPr>
-          <w:rFonts w:ascii="Times New Roman" w:eastAsia="宋体" w:hAnsi="Times New Roman" w:cs="Times New Roman"/>
-          <w:kern w:val="0"/>
-          <w:sz w:val="24"/>
-          <w14:ligatures w14:val="none"/>
-        </w:rPr>
-        <w:t xml:space="preserve"> patients (HR range 2.3–2.9).</w:t>
+        <w:t xml:space="preserve">  Six core lipid metabolism genes were significantly up-regulated (all p &lt; 0.001) in the high score patients; the most highly up-regulated genes were FASN (2.8 fold), ACLY (2.3 fold), SCD (2.1 fold) and SREBF1 (1.9 fold) (Fig. 6D). All of these genes constituted a highly-coordinated gene expression network in which FASN was highly correlated with ACLY (R = 0.78) and SCD (R= 0.72; Fig. 6E; Supplementary Fig. S3D). Transcription factor activity inference showed the differential activation of important transcription factor networks, with PPARG showing the activation with the highest Log2FC (1.19, p-value 0.008), followed by E2F1 (Log2FC 0.50, p-value 0.012) and SREBF1 (Log2FC 0.30, p-value 0.026) (Fig. 6F). High score patients were predicted to be sensitive to FASN inhibitors, SCD inhibitors, and CDK4/6 inhibitors, while low score patients might be more sensitive to immune checkpoint inhibitors (ICIs) (Supplementary Fig. S3C). Our approach to scoring showed good correlation with four alternatives, as the simple mean, median, weighted mean and PCA recalculation correlated well with the original PCA based score (Spearman R &gt; 0.7) and discriminated well between high risk patients (HR range 2.3–2.9).</w:t>
       </w:r>
     </w:p>
     <w:p>
@@ -3496,27 +2333,7 @@
           <w:sz w:val="24"/>
           <w14:ligatures w14:val="none"/>
         </w:rPr>
-        <w:t xml:space="preserve">  Our results give clinical evidence of the involvement of the PPARG/CD36 axis in the progression of DDLPS. The excellent correlation between the score and PPARG/CD36 expression indicates that the score might be useful as a surrogate for axis activation. This is in line with the recent experimental evidence that the PPARγ/CD36 axis supports liposarcoma by inducing mTORC2-driven metabolic switch of tumor associated macrophages (10). CD36 and PPARγ have been related to cancer cell metabolism and </w:t>
-      </w:r>
-      <w:proofErr w:type="spellStart"/>
-      <w:r>
-        <w:rPr>
-          <w:rFonts w:ascii="Times New Roman" w:eastAsia="宋体" w:hAnsi="Times New Roman" w:cs="Times New Roman"/>
-          <w:kern w:val="0"/>
-          <w:sz w:val="24"/>
-          <w14:ligatures w14:val="none"/>
-        </w:rPr>
-        <w:t>tumour</w:t>
-      </w:r>
-      <w:proofErr w:type="spellEnd"/>
-      <w:r>
-        <w:rPr>
-          <w:rFonts w:ascii="Times New Roman" w:eastAsia="宋体" w:hAnsi="Times New Roman" w:cs="Times New Roman"/>
-          <w:kern w:val="0"/>
-          <w:sz w:val="24"/>
-          <w14:ligatures w14:val="none"/>
-        </w:rPr>
-        <w:t xml:space="preserve"> progression (15, 17). PPARG+CD36 signature also had an AUC of 0.71, further emphasizing the signature's potential as a diagnostic biomarker. Our prognostic signature performed as well or better than published prognostic signatures in sarcoma (14). Sensitivity analysis was performed, which confirmed robustness (Supplementary Fig. S6 and S7).</w:t>
+        <w:t xml:space="preserve">  Our results give clinical evidence of the involvement of the PPARG/CD36 axis in the progression of DDLPS. The excellent correlation between the score and PPARG/CD36 expression indicates that the score might be useful as a surrogate for axis activation. This is in line with the recent experimental evidence that the PPARγ/CD36 axis supports liposarcoma by inducing mTORC2-driven metabolic switch of tumor associated macrophages (10). CD36 and PPARγ have been related to cancer cell metabolism and tumour progression (15, 17). PPARG+CD36 signature also had an AUC of 0.71, further emphasizing the signature's potential as a diagnostic biomarker. Our prognostic signature performed as well or better than published prognostic signatures in sarcoma (14). Sensitivity analysis was performed, which confirmed robustness (Supplementary Fig. S6 and S7).</w:t>
       </w:r>
     </w:p>
     <w:p>
@@ -3542,47 +2359,7 @@
           <w14:ligatures w14:val="none"/>
         </w:rPr>
         <w:lastRenderedPageBreak/>
-        <w:t xml:space="preserve">  The other phenotype of cell cycle activation and immune suppression observed in tumors with high scores indicates that lipid metabolism is not only important for cell cycle activation and </w:t>
-      </w:r>
-      <w:proofErr w:type="gramStart"/>
-      <w:r>
-        <w:rPr>
-          <w:rFonts w:ascii="Times New Roman" w:eastAsia="宋体" w:hAnsi="Times New Roman" w:cs="Times New Roman"/>
-          <w:kern w:val="0"/>
-          <w:sz w:val="24"/>
-          <w14:ligatures w14:val="none"/>
-        </w:rPr>
-        <w:t>proliferation, but</w:t>
-      </w:r>
-      <w:proofErr w:type="gramEnd"/>
-      <w:r>
-        <w:rPr>
-          <w:rFonts w:ascii="Times New Roman" w:eastAsia="宋体" w:hAnsi="Times New Roman" w:cs="Times New Roman"/>
-          <w:kern w:val="0"/>
-          <w:sz w:val="24"/>
-          <w14:ligatures w14:val="none"/>
-        </w:rPr>
-        <w:t xml:space="preserve"> might also be important for immune suppression. The enrichment of cell cycle pathways is consistent with the studies elucidating that lipid metabolism delivers intermediates for cell signaling and membrane building blocks for rapid cell proliferation (18,19). In DDLPS, a high expression of PPARG is associated with poor prognosis, as opposed to being tumor suppressive in epithelial cancers (20-22). Down-regulation of interferon gamma and inflammatory response pathways, the immune suppression signature, is consistent with metabolic reprogramming promoting immune evasion (23,24). Significant differences in immune cell infiltration were not </w:t>
-      </w:r>
-      <w:proofErr w:type="gramStart"/>
-      <w:r>
-        <w:rPr>
-          <w:rFonts w:ascii="Times New Roman" w:eastAsia="宋体" w:hAnsi="Times New Roman" w:cs="Times New Roman"/>
-          <w:kern w:val="0"/>
-          <w:sz w:val="24"/>
-          <w14:ligatures w14:val="none"/>
-        </w:rPr>
-        <w:t>observed</w:t>
-      </w:r>
-      <w:proofErr w:type="gramEnd"/>
-      <w:r>
-        <w:rPr>
-          <w:rFonts w:ascii="Times New Roman" w:eastAsia="宋体" w:hAnsi="Times New Roman" w:cs="Times New Roman"/>
-          <w:kern w:val="0"/>
-          <w:sz w:val="24"/>
-          <w14:ligatures w14:val="none"/>
-        </w:rPr>
-        <w:t xml:space="preserve"> and the score is thought to be mainly influenced by the intrinsic properties of the tumor cells, not the abundance of immune cells (3,25). The sex specific prognostic effect has not been reported before; sex differences in cancer metabolism have been reported (8,26), but this is the first time the male specific metabolic prognostic axis has been demonstrated in DDLPS.</w:t>
+        <w:t xml:space="preserve">  The other phenotype of cell cycle activation and immune suppression observed in tumors with high scores indicates that lipid metabolism is not only important for cell cycle activation and proliferation, but might also be important for immune suppression. The enrichment of cell cycle pathways is consistent with the studies elucidating that lipid metabolism delivers intermediates for cell signaling and membrane building blocks for rapid cell proliferation (18,19). In DDLPS, a high expression of PPARG is associated with poor prognosis, as opposed to being tumor suppressive in epithelial cancers (20-22). Down-regulation of interferon gamma and inflammatory response pathways, the immune suppression signature, is consistent with metabolic reprogramming promoting immune evasion (23,24). Significant differences in immune cell infiltration were not observed and the score is thought to be mainly influenced by the intrinsic properties of the tumor cells, not the abundance of immune cells (3,25). The sex specific prognostic effect has not been reported before; sex differences in cancer metabolism have been reported (8,26), but this is the first time the male specific metabolic prognostic axis has been demonstrated in DDLPS.</w:t>
       </w:r>
     </w:p>
     <w:p>
@@ -4642,27 +3419,7 @@
                 <w:sz w:val="24"/>
                 <w14:ligatures w14:val="none"/>
               </w:rPr>
-              <w:t xml:space="preserve">Fédération Nationale des </w:t>
-            </w:r>
-            <w:proofErr w:type="spellStart"/>
-            <w:r>
-              <w:rPr>
-                <w:rFonts w:ascii="Times New Roman" w:eastAsia="宋体" w:hAnsi="Times New Roman" w:cs="Times New Roman"/>
-                <w:kern w:val="0"/>
-                <w:sz w:val="24"/>
-                <w14:ligatures w14:val="none"/>
-              </w:rPr>
-              <w:t>Centres</w:t>
-            </w:r>
-            <w:proofErr w:type="spellEnd"/>
-            <w:r>
-              <w:rPr>
-                <w:rFonts w:ascii="Times New Roman" w:eastAsia="宋体" w:hAnsi="Times New Roman" w:cs="Times New Roman"/>
-                <w:kern w:val="0"/>
-                <w:sz w:val="24"/>
-                <w14:ligatures w14:val="none"/>
-              </w:rPr>
-              <w:t xml:space="preserve"> de Lutte Contre le Cancer</w:t>
+              <w:t>Fédération Nationale des Centres de Lutte Contre le Cancer</w:t>
             </w:r>
           </w:p>
         </w:tc>
@@ -5059,7 +3816,6 @@
                 <w14:ligatures w14:val="none"/>
               </w:rPr>
             </w:pPr>
-            <w:proofErr w:type="spellStart"/>
             <w:r>
               <w:rPr>
                 <w:rFonts w:ascii="Times New Roman" w:eastAsia="宋体" w:hAnsi="Times New Roman" w:cs="Times New Roman"/>
@@ -5069,7 +3825,6 @@
               </w:rPr>
               <w:t>MSigDB</w:t>
             </w:r>
-            <w:proofErr w:type="spellEnd"/>
           </w:p>
         </w:tc>
         <w:tc>
@@ -5431,67 +4186,7 @@
           <w:sz w:val="24"/>
           <w14:ligatures w14:val="none"/>
         </w:rPr>
-        <w:t xml:space="preserve">The transcriptomic and clinical data from the TCGA-SARC are available at the Genomic Data Commons portal (https://portal.gdc.cancer.gov/). Gene Expression Omnibus </w:t>
-      </w:r>
-      <w:proofErr w:type="gramStart"/>
-      <w:r>
-        <w:rPr>
-          <w:rFonts w:ascii="Times New Roman" w:eastAsia="宋体" w:hAnsi="Times New Roman" w:cs="Times New Roman"/>
-          <w:kern w:val="0"/>
-          <w:sz w:val="24"/>
-          <w14:ligatures w14:val="none"/>
-        </w:rPr>
-        <w:t>(https://www.ncbi.nlm.nih.gov/geo/) GSE21122 and GSE159659 are available.</w:t>
-      </w:r>
-      <w:proofErr w:type="gramEnd"/>
-      <w:r>
-        <w:rPr>
-          <w:rFonts w:ascii="Times New Roman" w:eastAsia="宋体" w:hAnsi="Times New Roman" w:cs="Times New Roman"/>
-          <w:kern w:val="0"/>
-          <w:sz w:val="24"/>
-          <w14:ligatures w14:val="none"/>
-        </w:rPr>
-        <w:t xml:space="preserve"> The Supplementary Materials contain all of the processed data underlying this study, including a list of the genes that were determined to be differentially expressed (Table S1), a list of the core genes (Table S2), results of the GSEA enrichment (Table S3), and a list of the genes used to mark the immune cell types (Table S4). The analysis code has been uploaded to GitHub (https://github.com/wqxrmyy/LipidScore_DDLPS). The annotation files for the platform can be downloaded from the GEO record associated with the platform (GPL570, GPL23159). The additional information needed to </w:t>
-      </w:r>
-      <w:proofErr w:type="spellStart"/>
-      <w:r>
-        <w:rPr>
-          <w:rFonts w:ascii="Times New Roman" w:eastAsia="宋体" w:hAnsi="Times New Roman" w:cs="Times New Roman"/>
-          <w:kern w:val="0"/>
-          <w:sz w:val="24"/>
-          <w14:ligatures w14:val="none"/>
-        </w:rPr>
-        <w:t>reanalyse</w:t>
-      </w:r>
-      <w:proofErr w:type="spellEnd"/>
-      <w:r>
-        <w:rPr>
-          <w:rFonts w:ascii="Times New Roman" w:eastAsia="宋体" w:hAnsi="Times New Roman" w:cs="Times New Roman"/>
-          <w:kern w:val="0"/>
-          <w:sz w:val="24"/>
-          <w14:ligatures w14:val="none"/>
-        </w:rPr>
-        <w:t xml:space="preserve"> the data reported in this study </w:t>
-      </w:r>
-      <w:proofErr w:type="gramStart"/>
-      <w:r>
-        <w:rPr>
-          <w:rFonts w:ascii="Times New Roman" w:eastAsia="宋体" w:hAnsi="Times New Roman" w:cs="Times New Roman"/>
-          <w:kern w:val="0"/>
-          <w:sz w:val="24"/>
-          <w14:ligatures w14:val="none"/>
-        </w:rPr>
-        <w:t>are</w:t>
-      </w:r>
-      <w:proofErr w:type="gramEnd"/>
-      <w:r>
-        <w:rPr>
-          <w:rFonts w:ascii="Times New Roman" w:eastAsia="宋体" w:hAnsi="Times New Roman" w:cs="Times New Roman"/>
-          <w:kern w:val="0"/>
-          <w:sz w:val="24"/>
-          <w14:ligatures w14:val="none"/>
-        </w:rPr>
-        <w:t xml:space="preserve"> available from the corresponding author on reasonable request.</w:t>
+        <w:t>The transcriptomic and clinical data from the TCGA-SARC are available at the Genomic Data Commons portal (https://portal.gdc.cancer.gov/). Gene Expression Omnibus (https://www.ncbi.nlm.nih.gov/geo/) GSE21122 and GSE159659 are available. The Supplementary Materials contain all of the processed data underlying this study, including a list of the genes that were determined to be differentially expressed (Table S1), a list of the core genes (Table S2), results of the GSEA enrichment (Table S3), and a list of the genes used to mark the immune cell types (Table S4). The analysis code has been uploaded to GitHub (https://github.com/wqxrmyy/LipidScore_DDLPS). The annotation files for the platform can be downloaded from the GEO record associated with the platform (GPL570, GPL23159). The additional information needed to reanalyse the data reported in this study are available from the corresponding author on reasonable request.</w:t>
       </w:r>
     </w:p>
     <w:p>
@@ -5736,21 +4431,8 @@
           <w:sz w:val="24"/>
           <w14:ligatures w14:val="none"/>
         </w:rPr>
-        <w:t>Declaration of generative ai and ai-</w:t>
-      </w:r>
-      <w:proofErr w:type="spellStart"/>
-      <w:r>
-        <w:rPr>
-          <w:rFonts w:ascii="Times New Roman" w:eastAsia="宋体" w:hAnsi="Times New Roman" w:cs="Times New Roman"/>
-          <w:b/>
-          <w:bCs/>
-          <w:kern w:val="0"/>
-          <w:sz w:val="24"/>
-          <w14:ligatures w14:val="none"/>
-        </w:rPr>
-        <w:t>assis</w:t>
-      </w:r>
-      <w:proofErr w:type="spellEnd"/>
+        <w:t>Declaration of generative ai and ai-assis</w:t>
+      </w:r>
     </w:p>
     <w:p>
       <w:pPr>
@@ -5775,27 +4457,7 @@
           <w:sz w:val="24"/>
           <w14:ligatures w14:val="none"/>
         </w:rPr>
-        <w:t xml:space="preserve">  </w:t>
-      </w:r>
-      <w:proofErr w:type="gramStart"/>
-      <w:r>
-        <w:rPr>
-          <w:rFonts w:ascii="Times New Roman" w:eastAsia="宋体" w:hAnsi="Times New Roman" w:cs="Times New Roman"/>
-          <w:kern w:val="0"/>
-          <w:sz w:val="24"/>
-          <w14:ligatures w14:val="none"/>
-        </w:rPr>
-        <w:t>In the course of</w:t>
-      </w:r>
-      <w:proofErr w:type="gramEnd"/>
-      <w:r>
-        <w:rPr>
-          <w:rFonts w:ascii="Times New Roman" w:eastAsia="宋体" w:hAnsi="Times New Roman" w:cs="Times New Roman"/>
-          <w:kern w:val="0"/>
-          <w:sz w:val="24"/>
-          <w14:ligatures w14:val="none"/>
-        </w:rPr>
-        <w:t xml:space="preserve"> creating this work, AI-assisted tools were utilized to enhance the clarity and quality of the text. </w:t>
+        <w:t xml:space="preserve">  In the course of creating this work, AI-assisted tools were utilized to enhance the clarity and quality of the text. </w:t>
       </w:r>
     </w:p>
     <w:p>
@@ -5927,67 +4589,7 @@
           <w:sz w:val="24"/>
           <w14:ligatures w14:val="none"/>
         </w:rPr>
-        <w:t xml:space="preserve"> T, Yamada Y, Kinoshita I, </w:t>
-      </w:r>
-      <w:proofErr w:type="spellStart"/>
-      <w:r>
-        <w:rPr>
-          <w:rFonts w:ascii="Times New Roman" w:eastAsia="宋体" w:hAnsi="Times New Roman" w:cs="Times New Roman"/>
-          <w:kern w:val="0"/>
-          <w:sz w:val="24"/>
-          <w14:ligatures w14:val="none"/>
-        </w:rPr>
-        <w:t>Kohashi</w:t>
-      </w:r>
-      <w:proofErr w:type="spellEnd"/>
-      <w:r>
-        <w:rPr>
-          <w:rFonts w:ascii="Times New Roman" w:eastAsia="宋体" w:hAnsi="Times New Roman" w:cs="Times New Roman"/>
-          <w:kern w:val="0"/>
-          <w:sz w:val="24"/>
-          <w14:ligatures w14:val="none"/>
-        </w:rPr>
-        <w:t xml:space="preserve"> K, Yamamoto H, Ito Y, et al. Clinicopathological and histopathological review of dedifferentiated liposarcoma: a comprehensive study of 123 primary </w:t>
-      </w:r>
-      <w:proofErr w:type="spellStart"/>
-      <w:r>
-        <w:rPr>
-          <w:rFonts w:ascii="Times New Roman" w:eastAsia="宋体" w:hAnsi="Times New Roman" w:cs="Times New Roman"/>
-          <w:kern w:val="0"/>
-          <w:sz w:val="24"/>
-          <w14:ligatures w14:val="none"/>
-        </w:rPr>
-        <w:t>tumours</w:t>
-      </w:r>
-      <w:proofErr w:type="spellEnd"/>
-      <w:r>
-        <w:rPr>
-          <w:rFonts w:ascii="Times New Roman" w:eastAsia="宋体" w:hAnsi="Times New Roman" w:cs="Times New Roman"/>
-          <w:kern w:val="0"/>
-          <w:sz w:val="24"/>
-          <w14:ligatures w14:val="none"/>
-        </w:rPr>
-        <w:t xml:space="preserve">. Histopathology. England; </w:t>
-      </w:r>
-      <w:proofErr w:type="gramStart"/>
-      <w:r>
-        <w:rPr>
-          <w:rFonts w:ascii="Times New Roman" w:eastAsia="宋体" w:hAnsi="Times New Roman" w:cs="Times New Roman"/>
-          <w:kern w:val="0"/>
-          <w:sz w:val="24"/>
-          <w14:ligatures w14:val="none"/>
-        </w:rPr>
-        <w:t>2022;80:538</w:t>
-      </w:r>
-      <w:proofErr w:type="gramEnd"/>
-      <w:r>
-        <w:rPr>
-          <w:rFonts w:ascii="Times New Roman" w:eastAsia="宋体" w:hAnsi="Times New Roman" w:cs="Times New Roman"/>
-          <w:kern w:val="0"/>
-          <w:sz w:val="24"/>
-          <w14:ligatures w14:val="none"/>
-        </w:rPr>
-        <w:t>–57.</w:t>
+        <w:t xml:space="preserve"> T, Yamada Y, Kinoshita I, Kohashi K, Yamamoto H, Ito Y, et al. Clinicopathological and histopathological review of dedifferentiated liposarcoma: a comprehensive study of 123 primary tumours. Histopathology. England; 2022;80:538–57.</w:t>
       </w:r>
     </w:p>
     <w:p>
@@ -6032,67 +4634,7 @@
           <w:sz w:val="24"/>
           <w14:ligatures w14:val="none"/>
         </w:rPr>
-        <w:t xml:space="preserve"> A, Flaman A, Godbout E, Serrano D, </w:t>
-      </w:r>
-      <w:proofErr w:type="spellStart"/>
-      <w:r>
-        <w:rPr>
-          <w:rFonts w:ascii="Times New Roman" w:eastAsia="宋体" w:hAnsi="Times New Roman" w:cs="Times New Roman"/>
-          <w:kern w:val="0"/>
-          <w:sz w:val="24"/>
-          <w14:ligatures w14:val="none"/>
-        </w:rPr>
-        <w:t>Werier</w:t>
-      </w:r>
-      <w:proofErr w:type="spellEnd"/>
-      <w:r>
-        <w:rPr>
-          <w:rFonts w:ascii="Times New Roman" w:eastAsia="宋体" w:hAnsi="Times New Roman" w:cs="Times New Roman"/>
-          <w:kern w:val="0"/>
-          <w:sz w:val="24"/>
-          <w14:ligatures w14:val="none"/>
-        </w:rPr>
-        <w:t xml:space="preserve"> J, </w:t>
-      </w:r>
-      <w:proofErr w:type="spellStart"/>
-      <w:r>
-        <w:rPr>
-          <w:rFonts w:ascii="Times New Roman" w:eastAsia="宋体" w:hAnsi="Times New Roman" w:cs="Times New Roman"/>
-          <w:kern w:val="0"/>
-          <w:sz w:val="24"/>
-          <w14:ligatures w14:val="none"/>
-        </w:rPr>
-        <w:t>Purgina</w:t>
-      </w:r>
-      <w:proofErr w:type="spellEnd"/>
-      <w:r>
-        <w:rPr>
-          <w:rFonts w:ascii="Times New Roman" w:eastAsia="宋体" w:hAnsi="Times New Roman" w:cs="Times New Roman"/>
-          <w:kern w:val="0"/>
-          <w:sz w:val="24"/>
-          <w14:ligatures w14:val="none"/>
-        </w:rPr>
-        <w:t xml:space="preserve"> B, et al. Immune profiling of dedifferentiated liposarcoma and identification of novel antigens for targeted immunotherapy. Sci Rep. England; </w:t>
-      </w:r>
-      <w:proofErr w:type="gramStart"/>
-      <w:r>
-        <w:rPr>
-          <w:rFonts w:ascii="Times New Roman" w:eastAsia="宋体" w:hAnsi="Times New Roman" w:cs="Times New Roman"/>
-          <w:kern w:val="0"/>
-          <w:sz w:val="24"/>
-          <w14:ligatures w14:val="none"/>
-        </w:rPr>
-        <w:t>2024;14:11254</w:t>
-      </w:r>
-      <w:proofErr w:type="gramEnd"/>
-      <w:r>
-        <w:rPr>
-          <w:rFonts w:ascii="Times New Roman" w:eastAsia="宋体" w:hAnsi="Times New Roman" w:cs="Times New Roman"/>
-          <w:kern w:val="0"/>
-          <w:sz w:val="24"/>
-          <w14:ligatures w14:val="none"/>
-        </w:rPr>
-        <w:t>.</w:t>
+        <w:t xml:space="preserve"> A, Flaman A, Godbout E, Serrano D, Werier J, Purgina B, et al. Immune profiling of dedifferentiated liposarcoma and identification of novel antigens for targeted immunotherapy. Sci Rep. England; 2024;14:11254.</w:t>
       </w:r>
     </w:p>
     <w:p>
@@ -6138,47 +4680,7 @@
           <w:sz w:val="24"/>
           <w14:ligatures w14:val="none"/>
         </w:rPr>
-        <w:t xml:space="preserve"> BA, </w:t>
-      </w:r>
-      <w:proofErr w:type="spellStart"/>
-      <w:r>
-        <w:rPr>
-          <w:rFonts w:ascii="Times New Roman" w:eastAsia="宋体" w:hAnsi="Times New Roman" w:cs="Times New Roman"/>
-          <w:kern w:val="0"/>
-          <w:sz w:val="24"/>
-          <w14:ligatures w14:val="none"/>
-        </w:rPr>
-        <w:t>LaFranzo</w:t>
-      </w:r>
-      <w:proofErr w:type="spellEnd"/>
-      <w:r>
-        <w:rPr>
-          <w:rFonts w:ascii="Times New Roman" w:eastAsia="宋体" w:hAnsi="Times New Roman" w:cs="Times New Roman"/>
-          <w:kern w:val="0"/>
-          <w:sz w:val="24"/>
-          <w14:ligatures w14:val="none"/>
-        </w:rPr>
-        <w:t xml:space="preserve"> NA, LaFleur BJ, Gittelman RM, Vignali M, Zhang S, et al. CD4+ T cell and M2 macrophage infiltration predict dedifferentiated liposarcoma patient outcomes. J </w:t>
-      </w:r>
-      <w:proofErr w:type="spellStart"/>
-      <w:r>
-        <w:rPr>
-          <w:rFonts w:ascii="Times New Roman" w:eastAsia="宋体" w:hAnsi="Times New Roman" w:cs="Times New Roman"/>
-          <w:kern w:val="0"/>
-          <w:sz w:val="24"/>
-          <w14:ligatures w14:val="none"/>
-        </w:rPr>
-        <w:t>Immunother</w:t>
-      </w:r>
-      <w:proofErr w:type="spellEnd"/>
-      <w:r>
-        <w:rPr>
-          <w:rFonts w:ascii="Times New Roman" w:eastAsia="宋体" w:hAnsi="Times New Roman" w:cs="Times New Roman"/>
-          <w:kern w:val="0"/>
-          <w:sz w:val="24"/>
-          <w14:ligatures w14:val="none"/>
-        </w:rPr>
-        <w:t xml:space="preserve"> Cancer. England; 2021;9.</w:t>
+        <w:t xml:space="preserve"> BA, LaFranzo NA, LaFleur BJ, Gittelman RM, Vignali M, Zhang S, et al. CD4+ T cell and M2 macrophage infiltration predict dedifferentiated liposarcoma patient outcomes. J Immunother Cancer. England; 2021;9.</w:t>
       </w:r>
     </w:p>
     <w:p>
@@ -6223,87 +4725,7 @@
           <w:sz w:val="24"/>
           <w14:ligatures w14:val="none"/>
         </w:rPr>
-        <w:t xml:space="preserve"> R, Hayward RL, </w:t>
-      </w:r>
-      <w:proofErr w:type="spellStart"/>
-      <w:r>
-        <w:rPr>
-          <w:rFonts w:ascii="Times New Roman" w:eastAsia="宋体" w:hAnsi="Times New Roman" w:cs="Times New Roman"/>
-          <w:kern w:val="0"/>
-          <w:sz w:val="24"/>
-          <w14:ligatures w14:val="none"/>
-        </w:rPr>
-        <w:t>Musoro</w:t>
-      </w:r>
-      <w:proofErr w:type="spellEnd"/>
-      <w:r>
-        <w:rPr>
-          <w:rFonts w:ascii="Times New Roman" w:eastAsia="宋体" w:hAnsi="Times New Roman" w:cs="Times New Roman"/>
-          <w:kern w:val="0"/>
-          <w:sz w:val="24"/>
-          <w14:ligatures w14:val="none"/>
-        </w:rPr>
-        <w:t xml:space="preserve"> J, Benson C, Leahy MG, Brunello A, et al. Activity of </w:t>
-      </w:r>
-      <w:proofErr w:type="spellStart"/>
-      <w:r>
-        <w:rPr>
-          <w:rFonts w:ascii="Times New Roman" w:eastAsia="宋体" w:hAnsi="Times New Roman" w:cs="Times New Roman"/>
-          <w:kern w:val="0"/>
-          <w:sz w:val="24"/>
-          <w14:ligatures w14:val="none"/>
-        </w:rPr>
-        <w:t>Cabazitaxel</w:t>
-      </w:r>
-      <w:proofErr w:type="spellEnd"/>
-      <w:r>
-        <w:rPr>
-          <w:rFonts w:ascii="Times New Roman" w:eastAsia="宋体" w:hAnsi="Times New Roman" w:cs="Times New Roman"/>
-          <w:kern w:val="0"/>
-          <w:sz w:val="24"/>
-          <w14:ligatures w14:val="none"/>
-        </w:rPr>
-        <w:t xml:space="preserve"> in Metastatic or Inoperable Locally Advanced Dedifferentiated Liposarcoma: A Phase 2 Study of the EORTC Soft Tissue and </w:t>
-      </w:r>
-      <w:proofErr w:type="gramStart"/>
-      <w:r>
-        <w:rPr>
-          <w:rFonts w:ascii="Times New Roman" w:eastAsia="宋体" w:hAnsi="Times New Roman" w:cs="Times New Roman"/>
-          <w:kern w:val="0"/>
-          <w:sz w:val="24"/>
-          <w14:ligatures w14:val="none"/>
-        </w:rPr>
-        <w:t>Bone  Sarcoma</w:t>
-      </w:r>
-      <w:proofErr w:type="gramEnd"/>
-      <w:r>
-        <w:rPr>
-          <w:rFonts w:ascii="Times New Roman" w:eastAsia="宋体" w:hAnsi="Times New Roman" w:cs="Times New Roman"/>
-          <w:kern w:val="0"/>
-          <w:sz w:val="24"/>
-          <w14:ligatures w14:val="none"/>
-        </w:rPr>
-        <w:t xml:space="preserve"> Group (STBSG). JAMA Oncol. United States; </w:t>
-      </w:r>
-      <w:proofErr w:type="gramStart"/>
-      <w:r>
-        <w:rPr>
-          <w:rFonts w:ascii="Times New Roman" w:eastAsia="宋体" w:hAnsi="Times New Roman" w:cs="Times New Roman"/>
-          <w:kern w:val="0"/>
-          <w:sz w:val="24"/>
-          <w14:ligatures w14:val="none"/>
-        </w:rPr>
-        <w:t>2022;8:1420</w:t>
-      </w:r>
-      <w:proofErr w:type="gramEnd"/>
-      <w:r>
-        <w:rPr>
-          <w:rFonts w:ascii="Times New Roman" w:eastAsia="宋体" w:hAnsi="Times New Roman" w:cs="Times New Roman"/>
-          <w:kern w:val="0"/>
-          <w:sz w:val="24"/>
-          <w14:ligatures w14:val="none"/>
-        </w:rPr>
-        <w:t>–5.</w:t>
+        <w:t xml:space="preserve"> R, Hayward RL, Musoro J, Benson C, Leahy MG, Brunello A, et al. Activity of Cabazitaxel in Metastatic or Inoperable Locally Advanced Dedifferentiated Liposarcoma: A Phase 2 Study of the EORTC Soft Tissue and Bone  Sarcoma Group (STBSG). JAMA Oncol. United States; 2022;8:1420–5.</w:t>
       </w:r>
     </w:p>
     <w:p>
@@ -6348,47 +4770,7 @@
           <w:sz w:val="24"/>
           <w14:ligatures w14:val="none"/>
         </w:rPr>
-        <w:t xml:space="preserve"> MM, Razak AA, Somaiah N, Chawla S, Martin-Broto J, </w:t>
-      </w:r>
-      <w:proofErr w:type="spellStart"/>
-      <w:r>
-        <w:rPr>
-          <w:rFonts w:ascii="Times New Roman" w:eastAsia="宋体" w:hAnsi="Times New Roman" w:cs="Times New Roman"/>
-          <w:kern w:val="0"/>
-          <w:sz w:val="24"/>
-          <w14:ligatures w14:val="none"/>
-        </w:rPr>
-        <w:t>Grignani</w:t>
-      </w:r>
-      <w:proofErr w:type="spellEnd"/>
-      <w:r>
-        <w:rPr>
-          <w:rFonts w:ascii="Times New Roman" w:eastAsia="宋体" w:hAnsi="Times New Roman" w:cs="Times New Roman"/>
-          <w:kern w:val="0"/>
-          <w:sz w:val="24"/>
-          <w14:ligatures w14:val="none"/>
-        </w:rPr>
-        <w:t xml:space="preserve"> G, et al. Selinexor in Advanced, Metastatic Dedifferentiated Liposarcoma: A Multinational, Randomized, Double-Blind, Placebo-Controlled Trial. J Clin Oncol. United States; </w:t>
-      </w:r>
-      <w:proofErr w:type="gramStart"/>
-      <w:r>
-        <w:rPr>
-          <w:rFonts w:ascii="Times New Roman" w:eastAsia="宋体" w:hAnsi="Times New Roman" w:cs="Times New Roman"/>
-          <w:kern w:val="0"/>
-          <w:sz w:val="24"/>
-          <w14:ligatures w14:val="none"/>
-        </w:rPr>
-        <w:t>2022;40:2479</w:t>
-      </w:r>
-      <w:proofErr w:type="gramEnd"/>
-      <w:r>
-        <w:rPr>
-          <w:rFonts w:ascii="Times New Roman" w:eastAsia="宋体" w:hAnsi="Times New Roman" w:cs="Times New Roman"/>
-          <w:kern w:val="0"/>
-          <w:sz w:val="24"/>
-          <w14:ligatures w14:val="none"/>
-        </w:rPr>
-        <w:t>–90.</w:t>
+        <w:t xml:space="preserve"> MM, Razak AA, Somaiah N, Chawla S, Martin-Broto J, Grignani G, et al. Selinexor in Advanced, Metastatic Dedifferentiated Liposarcoma: A Multinational, Randomized, Double-Blind, Placebo-Controlled Trial. J Clin Oncol. United States; 2022;40:2479–90.</w:t>
       </w:r>
     </w:p>
     <w:p>
@@ -6416,25 +4798,14 @@
         <w:t xml:space="preserve">6. </w:t>
       </w:r>
       <w:bookmarkStart w:id="21" w:name="OLE_LINK77"/>
-      <w:proofErr w:type="spellStart"/>
-      <w:r>
-        <w:rPr>
-          <w:rFonts w:ascii="Times New Roman" w:eastAsia="宋体" w:hAnsi="Times New Roman" w:cs="Times New Roman"/>
-          <w:kern w:val="0"/>
-          <w:sz w:val="24"/>
-          <w14:ligatures w14:val="none"/>
-        </w:rPr>
-        <w:t>Casier</w:t>
-      </w:r>
-      <w:proofErr w:type="spellEnd"/>
-      <w:r>
-        <w:rPr>
-          <w:rFonts w:ascii="Times New Roman" w:eastAsia="宋体" w:hAnsi="Times New Roman" w:cs="Times New Roman"/>
-          <w:kern w:val="0"/>
-          <w:sz w:val="24"/>
-          <w14:ligatures w14:val="none"/>
-        </w:rPr>
-        <w:t xml:space="preserve"> J</w:t>
+      <w:r>
+        <w:rPr>
+          <w:rFonts w:ascii="Times New Roman" w:eastAsia="宋体" w:hAnsi="Times New Roman" w:cs="Times New Roman"/>
+          <w:kern w:val="0"/>
+          <w:sz w:val="24"/>
+          <w14:ligatures w14:val="none"/>
+        </w:rPr>
+        <w:t>Casier J</w:t>
       </w:r>
       <w:bookmarkEnd w:id="21"/>
       <w:r>
@@ -6444,87 +4815,7 @@
           <w:sz w:val="24"/>
           <w14:ligatures w14:val="none"/>
         </w:rPr>
-        <w:t xml:space="preserve">, Timmermans I, </w:t>
-      </w:r>
-      <w:proofErr w:type="spellStart"/>
-      <w:r>
-        <w:rPr>
-          <w:rFonts w:ascii="Times New Roman" w:eastAsia="宋体" w:hAnsi="Times New Roman" w:cs="Times New Roman"/>
-          <w:kern w:val="0"/>
-          <w:sz w:val="24"/>
-          <w14:ligatures w14:val="none"/>
-        </w:rPr>
-        <w:t>Laenen</w:t>
-      </w:r>
-      <w:proofErr w:type="spellEnd"/>
-      <w:r>
-        <w:rPr>
-          <w:rFonts w:ascii="Times New Roman" w:eastAsia="宋体" w:hAnsi="Times New Roman" w:cs="Times New Roman"/>
-          <w:kern w:val="0"/>
-          <w:sz w:val="24"/>
-          <w14:ligatures w14:val="none"/>
-        </w:rPr>
-        <w:t xml:space="preserve"> A, </w:t>
-      </w:r>
-      <w:proofErr w:type="spellStart"/>
-      <w:r>
-        <w:rPr>
-          <w:rFonts w:ascii="Times New Roman" w:eastAsia="宋体" w:hAnsi="Times New Roman" w:cs="Times New Roman"/>
-          <w:kern w:val="0"/>
-          <w:sz w:val="24"/>
-          <w14:ligatures w14:val="none"/>
-        </w:rPr>
-        <w:t>Hompes</w:t>
-      </w:r>
-      <w:proofErr w:type="spellEnd"/>
-      <w:r>
-        <w:rPr>
-          <w:rFonts w:ascii="Times New Roman" w:eastAsia="宋体" w:hAnsi="Times New Roman" w:cs="Times New Roman"/>
-          <w:kern w:val="0"/>
-          <w:sz w:val="24"/>
-          <w14:ligatures w14:val="none"/>
-        </w:rPr>
-        <w:t xml:space="preserve"> D, </w:t>
-      </w:r>
-      <w:proofErr w:type="spellStart"/>
-      <w:r>
-        <w:rPr>
-          <w:rFonts w:ascii="Times New Roman" w:eastAsia="宋体" w:hAnsi="Times New Roman" w:cs="Times New Roman"/>
-          <w:kern w:val="0"/>
-          <w:sz w:val="24"/>
-          <w14:ligatures w14:val="none"/>
-        </w:rPr>
-        <w:t>Douchy</w:t>
-      </w:r>
-      <w:proofErr w:type="spellEnd"/>
-      <w:r>
-        <w:rPr>
-          <w:rFonts w:ascii="Times New Roman" w:eastAsia="宋体" w:hAnsi="Times New Roman" w:cs="Times New Roman"/>
-          <w:kern w:val="0"/>
-          <w:sz w:val="24"/>
-          <w14:ligatures w14:val="none"/>
-        </w:rPr>
-        <w:t xml:space="preserve"> T, Sciot R, et al. Clinical course and prognostic factors of patients with dedifferentiated liposarcoma: a retrospective analysis. BMC Cancer. England; </w:t>
-      </w:r>
-      <w:proofErr w:type="gramStart"/>
-      <w:r>
-        <w:rPr>
-          <w:rFonts w:ascii="Times New Roman" w:eastAsia="宋体" w:hAnsi="Times New Roman" w:cs="Times New Roman"/>
-          <w:kern w:val="0"/>
-          <w:sz w:val="24"/>
-          <w14:ligatures w14:val="none"/>
-        </w:rPr>
-        <w:t>2025;25:517</w:t>
-      </w:r>
-      <w:proofErr w:type="gramEnd"/>
-      <w:r>
-        <w:rPr>
-          <w:rFonts w:ascii="Times New Roman" w:eastAsia="宋体" w:hAnsi="Times New Roman" w:cs="Times New Roman"/>
-          <w:kern w:val="0"/>
-          <w:sz w:val="24"/>
-          <w14:ligatures w14:val="none"/>
-        </w:rPr>
-        <w:t>.</w:t>
+        <w:t>, Timmermans I, Laenen A, Hompes D, Douchy T, Sciot R, et al. Clinical course and prognostic factors of patients with dedifferentiated liposarcoma: a retrospective analysis. BMC Cancer. England; 2025;25:517.</w:t>
       </w:r>
     </w:p>
     <w:p>
@@ -6549,47 +4840,7 @@
           <w:sz w:val="24"/>
           <w14:ligatures w14:val="none"/>
         </w:rPr>
-        <w:t xml:space="preserve">7. Wang X, Ye J, Wu Y, Zhang H, Li C, Liu B, et al. Integrated </w:t>
-      </w:r>
-      <w:proofErr w:type="spellStart"/>
-      <w:r>
-        <w:rPr>
-          <w:rFonts w:ascii="Times New Roman" w:eastAsia="宋体" w:hAnsi="Times New Roman" w:cs="Times New Roman"/>
-          <w:kern w:val="0"/>
-          <w:sz w:val="24"/>
-          <w14:ligatures w14:val="none"/>
-        </w:rPr>
-        <w:t>lipidomics</w:t>
-      </w:r>
-      <w:proofErr w:type="spellEnd"/>
-      <w:r>
-        <w:rPr>
-          <w:rFonts w:ascii="Times New Roman" w:eastAsia="宋体" w:hAnsi="Times New Roman" w:cs="Times New Roman"/>
-          <w:kern w:val="0"/>
-          <w:sz w:val="24"/>
-          <w14:ligatures w14:val="none"/>
-        </w:rPr>
-        <w:t xml:space="preserve"> and RNA-seq reveal prognostic biomarkers in well-differentiated and dedifferentiated retroperitoneal liposarcoma. Cancer Cell Int. England; </w:t>
-      </w:r>
-      <w:proofErr w:type="gramStart"/>
-      <w:r>
-        <w:rPr>
-          <w:rFonts w:ascii="Times New Roman" w:eastAsia="宋体" w:hAnsi="Times New Roman" w:cs="Times New Roman"/>
-          <w:kern w:val="0"/>
-          <w:sz w:val="24"/>
-          <w14:ligatures w14:val="none"/>
-        </w:rPr>
-        <w:t>2024;24:404</w:t>
-      </w:r>
-      <w:proofErr w:type="gramEnd"/>
-      <w:r>
-        <w:rPr>
-          <w:rFonts w:ascii="Times New Roman" w:eastAsia="宋体" w:hAnsi="Times New Roman" w:cs="Times New Roman"/>
-          <w:kern w:val="0"/>
-          <w:sz w:val="24"/>
-          <w14:ligatures w14:val="none"/>
-        </w:rPr>
-        <w:t>.</w:t>
+        <w:t>7. Wang X, Ye J, Wu Y, Zhang H, Li C, Liu B, et al. Integrated lipidomics and RNA-seq reveal prognostic biomarkers in well-differentiated and dedifferentiated retroperitoneal liposarcoma. Cancer Cell Int. England; 2024;24:404.</w:t>
       </w:r>
     </w:p>
     <w:p>
@@ -6634,67 +4885,7 @@
           <w:sz w:val="24"/>
           <w14:ligatures w14:val="none"/>
         </w:rPr>
-        <w:t xml:space="preserve"> G, Amsel A, Riquier-Morcant B, Prieto Romero J, </w:t>
-      </w:r>
-      <w:proofErr w:type="spellStart"/>
-      <w:r>
-        <w:rPr>
-          <w:rFonts w:ascii="Times New Roman" w:eastAsia="宋体" w:hAnsi="Times New Roman" w:cs="Times New Roman"/>
-          <w:kern w:val="0"/>
-          <w:sz w:val="24"/>
-          <w14:ligatures w14:val="none"/>
-        </w:rPr>
-        <w:t>Gayte</w:t>
-      </w:r>
-      <w:proofErr w:type="spellEnd"/>
-      <w:r>
-        <w:rPr>
-          <w:rFonts w:ascii="Times New Roman" w:eastAsia="宋体" w:hAnsi="Times New Roman" w:cs="Times New Roman"/>
-          <w:kern w:val="0"/>
-          <w:sz w:val="24"/>
-          <w14:ligatures w14:val="none"/>
-        </w:rPr>
-        <w:t xml:space="preserve"> L, </w:t>
-      </w:r>
-      <w:proofErr w:type="spellStart"/>
-      <w:r>
-        <w:rPr>
-          <w:rFonts w:ascii="Times New Roman" w:eastAsia="宋体" w:hAnsi="Times New Roman" w:cs="Times New Roman"/>
-          <w:kern w:val="0"/>
-          <w:sz w:val="24"/>
-          <w14:ligatures w14:val="none"/>
-        </w:rPr>
-        <w:t>Fourneaux</w:t>
-      </w:r>
-      <w:proofErr w:type="spellEnd"/>
-      <w:r>
-        <w:rPr>
-          <w:rFonts w:ascii="Times New Roman" w:eastAsia="宋体" w:hAnsi="Times New Roman" w:cs="Times New Roman"/>
-          <w:kern w:val="0"/>
-          <w:sz w:val="24"/>
-          <w14:ligatures w14:val="none"/>
-        </w:rPr>
-        <w:t xml:space="preserve"> B, et al. A metabolic crosstalk between liposarcoma and muscle sustains tumor growth. Nat Commun. England; </w:t>
-      </w:r>
-      <w:proofErr w:type="gramStart"/>
-      <w:r>
-        <w:rPr>
-          <w:rFonts w:ascii="Times New Roman" w:eastAsia="宋体" w:hAnsi="Times New Roman" w:cs="Times New Roman"/>
-          <w:kern w:val="0"/>
-          <w:sz w:val="24"/>
-          <w14:ligatures w14:val="none"/>
-        </w:rPr>
-        <w:t>2024;15:7940</w:t>
-      </w:r>
-      <w:proofErr w:type="gramEnd"/>
-      <w:r>
-        <w:rPr>
-          <w:rFonts w:ascii="Times New Roman" w:eastAsia="宋体" w:hAnsi="Times New Roman" w:cs="Times New Roman"/>
-          <w:kern w:val="0"/>
-          <w:sz w:val="24"/>
-          <w14:ligatures w14:val="none"/>
-        </w:rPr>
-        <w:t>.</w:t>
+        <w:t xml:space="preserve"> G, Amsel A, Riquier-Morcant B, Prieto Romero J, Gayte L, Fourneaux B, et al. A metabolic crosstalk between liposarcoma and muscle sustains tumor growth. Nat Commun. England; 2024;15:7940.</w:t>
       </w:r>
     </w:p>
     <w:p>
@@ -6739,27 +4930,7 @@
           <w:sz w:val="24"/>
           <w14:ligatures w14:val="none"/>
         </w:rPr>
-        <w:t xml:space="preserve"> LE, Dixon SJ. Regulation of ferroptosis by lipid metabolism. Trends Cell Biol. England; </w:t>
-      </w:r>
-      <w:proofErr w:type="gramStart"/>
-      <w:r>
-        <w:rPr>
-          <w:rFonts w:ascii="Times New Roman" w:eastAsia="宋体" w:hAnsi="Times New Roman" w:cs="Times New Roman"/>
-          <w:kern w:val="0"/>
-          <w:sz w:val="24"/>
-          <w14:ligatures w14:val="none"/>
-        </w:rPr>
-        <w:t>2023;33:1077</w:t>
-      </w:r>
-      <w:proofErr w:type="gramEnd"/>
-      <w:r>
-        <w:rPr>
-          <w:rFonts w:ascii="Times New Roman" w:eastAsia="宋体" w:hAnsi="Times New Roman" w:cs="Times New Roman"/>
-          <w:kern w:val="0"/>
-          <w:sz w:val="24"/>
-          <w14:ligatures w14:val="none"/>
-        </w:rPr>
-        <w:t>–87.</w:t>
+        <w:t xml:space="preserve"> LE, Dixon SJ. Regulation of ferroptosis by lipid metabolism. Trends Cell Biol. England; 2023;33:1077–87.</w:t>
       </w:r>
     </w:p>
     <w:p>
@@ -6804,27 +4975,7 @@
           <w:sz w:val="24"/>
           <w14:ligatures w14:val="none"/>
         </w:rPr>
-        <w:t xml:space="preserve"> W, Sheng J, Liu C, Li J, Shu P, Jiang M, et al. mTORC2 regulates lipid metabolism-driven TAMs via the PPAR-γ/CD36 pathway to promote liposarcoma progression. Adipocyte. United States; </w:t>
-      </w:r>
-      <w:proofErr w:type="gramStart"/>
-      <w:r>
-        <w:rPr>
-          <w:rFonts w:ascii="Times New Roman" w:eastAsia="宋体" w:hAnsi="Times New Roman" w:cs="Times New Roman"/>
-          <w:kern w:val="0"/>
-          <w:sz w:val="24"/>
-          <w14:ligatures w14:val="none"/>
-        </w:rPr>
-        <w:t>2026;15:2665903</w:t>
-      </w:r>
-      <w:proofErr w:type="gramEnd"/>
-      <w:r>
-        <w:rPr>
-          <w:rFonts w:ascii="Times New Roman" w:eastAsia="宋体" w:hAnsi="Times New Roman" w:cs="Times New Roman"/>
-          <w:kern w:val="0"/>
-          <w:sz w:val="24"/>
-          <w14:ligatures w14:val="none"/>
-        </w:rPr>
-        <w:t>.</w:t>
+        <w:t xml:space="preserve"> W, Sheng J, Liu C, Li J, Shu P, Jiang M, et al. mTORC2 regulates lipid metabolism-driven TAMs via the PPAR-γ/CD36 pathway to promote liposarcoma progression. Adipocyte. United States; 2026;15:2665903.</w:t>
       </w:r>
     </w:p>
     <w:p>
@@ -6869,27 +5020,7 @@
           <w:sz w:val="24"/>
           <w14:ligatures w14:val="none"/>
         </w:rPr>
-        <w:t xml:space="preserve">, Ramsey S, Veenstra D, Pan </w:t>
-      </w:r>
-      <w:proofErr w:type="spellStart"/>
-      <w:r>
-        <w:rPr>
-          <w:rFonts w:ascii="Times New Roman" w:eastAsia="宋体" w:hAnsi="Times New Roman" w:cs="Times New Roman"/>
-          <w:kern w:val="0"/>
-          <w:sz w:val="24"/>
-          <w14:ligatures w14:val="none"/>
-        </w:rPr>
-        <w:t>M</w:t>
-      </w:r>
-      <w:proofErr w:type="spellEnd"/>
-      <w:r>
-        <w:rPr>
-          <w:rFonts w:ascii="Times New Roman" w:eastAsia="宋体" w:hAnsi="Times New Roman" w:cs="Times New Roman"/>
-          <w:kern w:val="0"/>
-          <w:sz w:val="24"/>
-          <w14:ligatures w14:val="none"/>
-        </w:rPr>
-        <w:t>, Sen S, Litton G, et al. Diagnosis, Treatment, and Unmet Needs of Dedifferentiated Liposarcoma in the United States: A Multidisciplinary Delphi Study. Cancers (Basel). Switzerland; 2025;17.</w:t>
+        <w:t>, Ramsey S, Veenstra D, Pan M, Sen S, Litton G, et al. Diagnosis, Treatment, and Unmet Needs of Dedifferentiated Liposarcoma in the United States: A Multidisciplinary Delphi Study. Cancers (Basel). Switzerland; 2025;17.</w:t>
       </w:r>
     </w:p>
     <w:p>
@@ -6917,7 +5048,6 @@
         <w:t xml:space="preserve">12. </w:t>
       </w:r>
       <w:bookmarkStart w:id="26" w:name="OLE_LINK83"/>
-      <w:proofErr w:type="spellStart"/>
       <w:r>
         <w:rPr>
           <w:rFonts w:ascii="Times New Roman" w:eastAsia="宋体" w:hAnsi="Times New Roman" w:cs="Times New Roman"/>
@@ -6928,75 +5058,14 @@
         <w:t>Frapolli</w:t>
       </w:r>
       <w:bookmarkEnd w:id="26"/>
-      <w:proofErr w:type="spellEnd"/>
-      <w:r>
-        <w:rPr>
-          <w:rFonts w:ascii="Times New Roman" w:eastAsia="宋体" w:hAnsi="Times New Roman" w:cs="Times New Roman"/>
-          <w:kern w:val="0"/>
-          <w:sz w:val="24"/>
-          <w14:ligatures w14:val="none"/>
-        </w:rPr>
-        <w:t xml:space="preserve"> R, Bello E, Ponzo M, Craparotta I, Mannarino L, Ballabio S, et al. Correction: Combination of </w:t>
-      </w:r>
-      <w:proofErr w:type="spellStart"/>
-      <w:r>
-        <w:rPr>
-          <w:rFonts w:ascii="Times New Roman" w:eastAsia="宋体" w:hAnsi="Times New Roman" w:cs="Times New Roman"/>
-          <w:kern w:val="0"/>
-          <w:sz w:val="24"/>
-          <w14:ligatures w14:val="none"/>
-        </w:rPr>
-        <w:t>PPARγ</w:t>
-      </w:r>
-      <w:proofErr w:type="spellEnd"/>
-      <w:r>
-        <w:rPr>
-          <w:rFonts w:ascii="Times New Roman" w:eastAsia="宋体" w:hAnsi="Times New Roman" w:cs="Times New Roman"/>
-          <w:kern w:val="0"/>
-          <w:sz w:val="24"/>
-          <w14:ligatures w14:val="none"/>
-        </w:rPr>
-        <w:t xml:space="preserve"> Agonist Pioglitazone and Trabectedin Induce Adipocyte Differentiation to Overcome Trabectedin Resistance in </w:t>
-      </w:r>
-      <w:proofErr w:type="gramStart"/>
-      <w:r>
-        <w:rPr>
-          <w:rFonts w:ascii="Times New Roman" w:eastAsia="宋体" w:hAnsi="Times New Roman" w:cs="Times New Roman"/>
-          <w:kern w:val="0"/>
-          <w:sz w:val="24"/>
-          <w14:ligatures w14:val="none"/>
-        </w:rPr>
-        <w:t>Myxoid  Liposarcomas</w:t>
-      </w:r>
-      <w:proofErr w:type="gramEnd"/>
-      <w:r>
-        <w:rPr>
-          <w:rFonts w:ascii="Times New Roman" w:eastAsia="宋体" w:hAnsi="Times New Roman" w:cs="Times New Roman"/>
-          <w:kern w:val="0"/>
-          <w:sz w:val="24"/>
-          <w14:ligatures w14:val="none"/>
-        </w:rPr>
-        <w:t xml:space="preserve">. Clin Cancer Res. United States; </w:t>
-      </w:r>
-      <w:proofErr w:type="gramStart"/>
-      <w:r>
-        <w:rPr>
-          <w:rFonts w:ascii="Times New Roman" w:eastAsia="宋体" w:hAnsi="Times New Roman" w:cs="Times New Roman"/>
-          <w:kern w:val="0"/>
-          <w:sz w:val="24"/>
-          <w14:ligatures w14:val="none"/>
-        </w:rPr>
-        <w:t>2020;26:1199</w:t>
-      </w:r>
-      <w:proofErr w:type="gramEnd"/>
-      <w:r>
-        <w:rPr>
-          <w:rFonts w:ascii="Times New Roman" w:eastAsia="宋体" w:hAnsi="Times New Roman" w:cs="Times New Roman"/>
-          <w:kern w:val="0"/>
-          <w:sz w:val="24"/>
-          <w14:ligatures w14:val="none"/>
-        </w:rPr>
-        <w:t>.</w:t>
+      <w:r>
+        <w:rPr>
+          <w:rFonts w:ascii="Times New Roman" w:eastAsia="宋体" w:hAnsi="Times New Roman" w:cs="Times New Roman"/>
+          <w:kern w:val="0"/>
+          <w:sz w:val="24"/>
+          <w14:ligatures w14:val="none"/>
+        </w:rPr>
+        <w:t xml:space="preserve"> R, Bello E, Ponzo M, Craparotta I, Mannarino L, Ballabio S, et al. Correction: Combination of PPARγ Agonist Pioglitazone and Trabectedin Induce Adipocyte Differentiation to Overcome Trabectedin Resistance in Myxoid  Liposarcomas. Clin Cancer Res. United States; 2020;26:1199.</w:t>
       </w:r>
     </w:p>
     <w:p>
@@ -7041,107 +5110,7 @@
           <w:sz w:val="24"/>
           <w14:ligatures w14:val="none"/>
         </w:rPr>
-        <w:t xml:space="preserve"> D, Saieva C, Loi M, </w:t>
-      </w:r>
-      <w:proofErr w:type="spellStart"/>
-      <w:r>
-        <w:rPr>
-          <w:rFonts w:ascii="Times New Roman" w:eastAsia="宋体" w:hAnsi="Times New Roman" w:cs="Times New Roman"/>
-          <w:kern w:val="0"/>
-          <w:sz w:val="24"/>
-          <w14:ligatures w14:val="none"/>
-        </w:rPr>
-        <w:t>Terziani</w:t>
-      </w:r>
-      <w:proofErr w:type="spellEnd"/>
-      <w:r>
-        <w:rPr>
-          <w:rFonts w:ascii="Times New Roman" w:eastAsia="宋体" w:hAnsi="Times New Roman" w:cs="Times New Roman"/>
-          <w:kern w:val="0"/>
-          <w:sz w:val="24"/>
-          <w14:ligatures w14:val="none"/>
-        </w:rPr>
-        <w:t xml:space="preserve"> F, </w:t>
-      </w:r>
-      <w:proofErr w:type="spellStart"/>
-      <w:r>
-        <w:rPr>
-          <w:rFonts w:ascii="Times New Roman" w:eastAsia="宋体" w:hAnsi="Times New Roman" w:cs="Times New Roman"/>
-          <w:kern w:val="0"/>
-          <w:sz w:val="24"/>
-          <w14:ligatures w14:val="none"/>
-        </w:rPr>
-        <w:t>Visani</w:t>
-      </w:r>
-      <w:proofErr w:type="spellEnd"/>
-      <w:r>
-        <w:rPr>
-          <w:rFonts w:ascii="Times New Roman" w:eastAsia="宋体" w:hAnsi="Times New Roman" w:cs="Times New Roman"/>
-          <w:kern w:val="0"/>
-          <w:sz w:val="24"/>
-          <w14:ligatures w14:val="none"/>
-        </w:rPr>
-        <w:t xml:space="preserve"> L, </w:t>
-      </w:r>
-      <w:proofErr w:type="spellStart"/>
-      <w:r>
-        <w:rPr>
-          <w:rFonts w:ascii="Times New Roman" w:eastAsia="宋体" w:hAnsi="Times New Roman" w:cs="Times New Roman"/>
-          <w:kern w:val="0"/>
-          <w:sz w:val="24"/>
-          <w14:ligatures w14:val="none"/>
-        </w:rPr>
-        <w:t>Garlatti</w:t>
-      </w:r>
-      <w:proofErr w:type="spellEnd"/>
-      <w:r>
-        <w:rPr>
-          <w:rFonts w:ascii="Times New Roman" w:eastAsia="宋体" w:hAnsi="Times New Roman" w:cs="Times New Roman"/>
-          <w:kern w:val="0"/>
-          <w:sz w:val="24"/>
-          <w14:ligatures w14:val="none"/>
-        </w:rPr>
-        <w:t xml:space="preserve"> P, et al. Influence of age and subtype in outcome of operable liposarcoma. </w:t>
-      </w:r>
-      <w:proofErr w:type="spellStart"/>
-      <w:r>
-        <w:rPr>
-          <w:rFonts w:ascii="Times New Roman" w:eastAsia="宋体" w:hAnsi="Times New Roman" w:cs="Times New Roman"/>
-          <w:kern w:val="0"/>
-          <w:sz w:val="24"/>
-          <w14:ligatures w14:val="none"/>
-        </w:rPr>
-        <w:t>Radiol</w:t>
-      </w:r>
-      <w:proofErr w:type="spellEnd"/>
-      <w:r>
-        <w:rPr>
-          <w:rFonts w:ascii="Times New Roman" w:eastAsia="宋体" w:hAnsi="Times New Roman" w:cs="Times New Roman"/>
-          <w:kern w:val="0"/>
-          <w:sz w:val="24"/>
-          <w14:ligatures w14:val="none"/>
-        </w:rPr>
-        <w:t xml:space="preserve"> Med. Italy; </w:t>
-      </w:r>
-      <w:proofErr w:type="gramStart"/>
-      <w:r>
-        <w:rPr>
-          <w:rFonts w:ascii="Times New Roman" w:eastAsia="宋体" w:hAnsi="Times New Roman" w:cs="Times New Roman"/>
-          <w:kern w:val="0"/>
-          <w:sz w:val="24"/>
-          <w14:ligatures w14:val="none"/>
-        </w:rPr>
-        <w:t>2019;124:290</w:t>
-      </w:r>
-      <w:proofErr w:type="gramEnd"/>
-      <w:r>
-        <w:rPr>
-          <w:rFonts w:ascii="Times New Roman" w:eastAsia="宋体" w:hAnsi="Times New Roman" w:cs="Times New Roman"/>
-          <w:kern w:val="0"/>
-          <w:sz w:val="24"/>
-          <w14:ligatures w14:val="none"/>
-        </w:rPr>
-        <w:t>–300.</w:t>
+        <w:t xml:space="preserve"> D, Saieva C, Loi M, Terziani F, Visani L, Garlatti P, et al. Influence of age and subtype in outcome of operable liposarcoma. Radiol Med. Italy; 2019;124:290–300.</w:t>
       </w:r>
     </w:p>
     <w:p>
@@ -7186,27 +5155,7 @@
           <w:sz w:val="24"/>
           <w14:ligatures w14:val="none"/>
         </w:rPr>
-        <w:t xml:space="preserve">, Zhou MY, Jiang C, Zhang Z, Bui NQ, Bien J, et al. Sex-dependent Prognosis of Patients with Advanced Soft Tissue Sarcoma. Clin Cancer Res. United States; </w:t>
-      </w:r>
-      <w:proofErr w:type="gramStart"/>
-      <w:r>
-        <w:rPr>
-          <w:rFonts w:ascii="Times New Roman" w:eastAsia="宋体" w:hAnsi="Times New Roman" w:cs="Times New Roman"/>
-          <w:kern w:val="0"/>
-          <w:sz w:val="24"/>
-          <w14:ligatures w14:val="none"/>
-        </w:rPr>
-        <w:t>2024;30:413</w:t>
-      </w:r>
-      <w:proofErr w:type="gramEnd"/>
-      <w:r>
-        <w:rPr>
-          <w:rFonts w:ascii="Times New Roman" w:eastAsia="宋体" w:hAnsi="Times New Roman" w:cs="Times New Roman"/>
-          <w:kern w:val="0"/>
-          <w:sz w:val="24"/>
-          <w14:ligatures w14:val="none"/>
-        </w:rPr>
-        <w:t>–9.</w:t>
+        <w:t>, Zhou MY, Jiang C, Zhang Z, Bui NQ, Bien J, et al. Sex-dependent Prognosis of Patients with Advanced Soft Tissue Sarcoma. Clin Cancer Res. United States; 2024;30:413–9.</w:t>
       </w:r>
     </w:p>
     <w:p>
@@ -7251,58 +5200,7 @@
           <w:sz w:val="24"/>
           <w14:ligatures w14:val="none"/>
         </w:rPr>
-        <w:t xml:space="preserve"> ED, Spiegelman BM. </w:t>
-      </w:r>
-      <w:proofErr w:type="spellStart"/>
-      <w:proofErr w:type="gramStart"/>
-      <w:r>
-        <w:rPr>
-          <w:rFonts w:ascii="Times New Roman" w:eastAsia="宋体" w:hAnsi="Times New Roman" w:cs="Times New Roman"/>
-          <w:kern w:val="0"/>
-          <w:sz w:val="24"/>
-          <w14:ligatures w14:val="none"/>
-        </w:rPr>
-        <w:t>PPARgamma</w:t>
-      </w:r>
-      <w:proofErr w:type="spellEnd"/>
-      <w:r>
-        <w:rPr>
-          <w:rFonts w:ascii="Times New Roman" w:eastAsia="宋体" w:hAnsi="Times New Roman" w:cs="Times New Roman"/>
-          <w:kern w:val="0"/>
-          <w:sz w:val="24"/>
-          <w14:ligatures w14:val="none"/>
-        </w:rPr>
-        <w:t> :</w:t>
-      </w:r>
-      <w:proofErr w:type="gramEnd"/>
-      <w:r>
-        <w:rPr>
-          <w:rFonts w:ascii="Times New Roman" w:eastAsia="宋体" w:hAnsi="Times New Roman" w:cs="Times New Roman"/>
-          <w:kern w:val="0"/>
-          <w:sz w:val="24"/>
-          <w14:ligatures w14:val="none"/>
-        </w:rPr>
-        <w:t xml:space="preserve"> a nuclear regulator of metabolism, differentiation, and cell growth. J Biol Chem. United States; </w:t>
-      </w:r>
-      <w:proofErr w:type="gramStart"/>
-      <w:r>
-        <w:rPr>
-          <w:rFonts w:ascii="Times New Roman" w:eastAsia="宋体" w:hAnsi="Times New Roman" w:cs="Times New Roman"/>
-          <w:kern w:val="0"/>
-          <w:sz w:val="24"/>
-          <w14:ligatures w14:val="none"/>
-        </w:rPr>
-        <w:t>2001;276:37731</w:t>
-      </w:r>
-      <w:proofErr w:type="gramEnd"/>
-      <w:r>
-        <w:rPr>
-          <w:rFonts w:ascii="Times New Roman" w:eastAsia="宋体" w:hAnsi="Times New Roman" w:cs="Times New Roman"/>
-          <w:kern w:val="0"/>
-          <w:sz w:val="24"/>
-          <w14:ligatures w14:val="none"/>
-        </w:rPr>
-        <w:t>–4.</w:t>
+        <w:t xml:space="preserve"> ED, Spiegelman BM. PPARgamma : a nuclear regulator of metabolism, differentiation, and cell growth. J Biol Chem. United States; 2001;276:37731–4.</w:t>
       </w:r>
     </w:p>
     <w:p>
@@ -7348,27 +5246,7 @@
           <w:sz w:val="24"/>
           <w14:ligatures w14:val="none"/>
         </w:rPr>
-        <w:t xml:space="preserve">, Liu X, Yang D, Li L, Li S, Lu S, et al. Interplay of CD36, autophagy, and lipid metabolism: insights into cancer progression. Metabolism. United States; </w:t>
-      </w:r>
-      <w:proofErr w:type="gramStart"/>
-      <w:r>
-        <w:rPr>
-          <w:rFonts w:ascii="Times New Roman" w:eastAsia="宋体" w:hAnsi="Times New Roman" w:cs="Times New Roman"/>
-          <w:kern w:val="0"/>
-          <w:sz w:val="24"/>
-          <w14:ligatures w14:val="none"/>
-        </w:rPr>
-        <w:t>2024;155:155905</w:t>
-      </w:r>
-      <w:proofErr w:type="gramEnd"/>
-      <w:r>
-        <w:rPr>
-          <w:rFonts w:ascii="Times New Roman" w:eastAsia="宋体" w:hAnsi="Times New Roman" w:cs="Times New Roman"/>
-          <w:kern w:val="0"/>
-          <w:sz w:val="24"/>
-          <w14:ligatures w14:val="none"/>
-        </w:rPr>
-        <w:t>.</w:t>
+        <w:t>, Liu X, Yang D, Li L, Li S, Lu S, et al. Interplay of CD36, autophagy, and lipid metabolism: insights into cancer progression. Metabolism. United States; 2024;155:155905.</w:t>
       </w:r>
     </w:p>
     <w:p>
@@ -7458,27 +5336,7 @@
           <w:sz w:val="24"/>
           <w14:ligatures w14:val="none"/>
         </w:rPr>
-        <w:t xml:space="preserve"> MM, Lazarides AL, Pittman PD, Flamant EM, Stoeber KL, Stoeber K, et al. Cell-cycle phase progression analysis identifies three unique phenotypes in soft tissue sarcoma. BMC Cancer. England; </w:t>
-      </w:r>
-      <w:proofErr w:type="gramStart"/>
-      <w:r>
-        <w:rPr>
-          <w:rFonts w:ascii="Times New Roman" w:eastAsia="宋体" w:hAnsi="Times New Roman" w:cs="Times New Roman"/>
-          <w:kern w:val="0"/>
-          <w:sz w:val="24"/>
-          <w14:ligatures w14:val="none"/>
-        </w:rPr>
-        <w:t>2024;24:1288</w:t>
-      </w:r>
-      <w:proofErr w:type="gramEnd"/>
-      <w:r>
-        <w:rPr>
-          <w:rFonts w:ascii="Times New Roman" w:eastAsia="宋体" w:hAnsi="Times New Roman" w:cs="Times New Roman"/>
-          <w:kern w:val="0"/>
-          <w:sz w:val="24"/>
-          <w14:ligatures w14:val="none"/>
-        </w:rPr>
-        <w:t>.</w:t>
+        <w:t xml:space="preserve"> MM, Lazarides AL, Pittman PD, Flamant EM, Stoeber KL, Stoeber K, et al. Cell-cycle phase progression analysis identifies three unique phenotypes in soft tissue sarcoma. BMC Cancer. England; 2024;24:1288.</w:t>
       </w:r>
     </w:p>
     <w:p>
@@ -7523,27 +5381,7 @@
           <w:sz w:val="24"/>
           <w14:ligatures w14:val="none"/>
         </w:rPr>
-        <w:t xml:space="preserve"> J, Lian Y, Zhao B, Han J, Li X, Wu J, et al. Deciphering the Prognostic and Therapeutic Significance of Cell Cycle Regulator CENPF: A Potential Biomarker of Prognosis and Immune Microenvironment </w:t>
-      </w:r>
-      <w:proofErr w:type="gramStart"/>
-      <w:r>
-        <w:rPr>
-          <w:rFonts w:ascii="Times New Roman" w:eastAsia="宋体" w:hAnsi="Times New Roman" w:cs="Times New Roman"/>
-          <w:kern w:val="0"/>
-          <w:sz w:val="24"/>
-          <w14:ligatures w14:val="none"/>
-        </w:rPr>
-        <w:t>for  Patients</w:t>
-      </w:r>
-      <w:proofErr w:type="gramEnd"/>
-      <w:r>
-        <w:rPr>
-          <w:rFonts w:ascii="Times New Roman" w:eastAsia="宋体" w:hAnsi="Times New Roman" w:cs="Times New Roman"/>
-          <w:kern w:val="0"/>
-          <w:sz w:val="24"/>
-          <w14:ligatures w14:val="none"/>
-        </w:rPr>
-        <w:t xml:space="preserve"> with Liposarcoma. Int J Mol Sci. Switzerland; 2023;24.</w:t>
+        <w:t xml:space="preserve"> J, Lian Y, Zhao B, Han J, Li X, Wu J, et al. Deciphering the Prognostic and Therapeutic Significance of Cell Cycle Regulator CENPF: A Potential Biomarker of Prognosis and Immune Microenvironment for  Patients with Liposarcoma. Int J Mol Sci. Switzerland; 2023;24.</w:t>
       </w:r>
     </w:p>
     <w:p>
@@ -7588,67 +5426,7 @@
           <w:sz w:val="24"/>
           <w14:ligatures w14:val="none"/>
         </w:rPr>
-        <w:t xml:space="preserve"> EM, Garza AE, Camp SY, Park J, Hoffman SE, </w:t>
-      </w:r>
-      <w:proofErr w:type="spellStart"/>
-      <w:r>
-        <w:rPr>
-          <w:rFonts w:ascii="Times New Roman" w:eastAsia="宋体" w:hAnsi="Times New Roman" w:cs="Times New Roman"/>
-          <w:kern w:val="0"/>
-          <w:sz w:val="24"/>
-          <w14:ligatures w14:val="none"/>
-        </w:rPr>
-        <w:t>Valderrábano</w:t>
-      </w:r>
-      <w:proofErr w:type="spellEnd"/>
-      <w:r>
-        <w:rPr>
-          <w:rFonts w:ascii="Times New Roman" w:eastAsia="宋体" w:hAnsi="Times New Roman" w:cs="Times New Roman"/>
-          <w:kern w:val="0"/>
-          <w:sz w:val="24"/>
-          <w14:ligatures w14:val="none"/>
-        </w:rPr>
-        <w:t xml:space="preserve"> L, et al. Epigenetic dysregulation of metabolic programs mediates liposarcoma cell plasticity. Sci </w:t>
-      </w:r>
-      <w:proofErr w:type="spellStart"/>
-      <w:r>
-        <w:rPr>
-          <w:rFonts w:ascii="Times New Roman" w:eastAsia="宋体" w:hAnsi="Times New Roman" w:cs="Times New Roman"/>
-          <w:kern w:val="0"/>
-          <w:sz w:val="24"/>
-          <w14:ligatures w14:val="none"/>
-        </w:rPr>
-        <w:t>Transl</w:t>
-      </w:r>
-      <w:proofErr w:type="spellEnd"/>
-      <w:r>
-        <w:rPr>
-          <w:rFonts w:ascii="Times New Roman" w:eastAsia="宋体" w:hAnsi="Times New Roman" w:cs="Times New Roman"/>
-          <w:kern w:val="0"/>
-          <w:sz w:val="24"/>
-          <w14:ligatures w14:val="none"/>
-        </w:rPr>
-        <w:t xml:space="preserve"> Med. United States; 2026;</w:t>
-      </w:r>
-      <w:proofErr w:type="gramStart"/>
-      <w:r>
-        <w:rPr>
-          <w:rFonts w:ascii="Times New Roman" w:eastAsia="宋体" w:hAnsi="Times New Roman" w:cs="Times New Roman"/>
-          <w:kern w:val="0"/>
-          <w:sz w:val="24"/>
-          <w14:ligatures w14:val="none"/>
-        </w:rPr>
-        <w:t>18:eadw</w:t>
-      </w:r>
-      <w:proofErr w:type="gramEnd"/>
-      <w:r>
-        <w:rPr>
-          <w:rFonts w:ascii="Times New Roman" w:eastAsia="宋体" w:hAnsi="Times New Roman" w:cs="Times New Roman"/>
-          <w:kern w:val="0"/>
-          <w:sz w:val="24"/>
-          <w14:ligatures w14:val="none"/>
-        </w:rPr>
-        <w:t>4689.</w:t>
+        <w:t xml:space="preserve"> EM, Garza AE, Camp SY, Park J, Hoffman SE, Valderrábano L, et al. Epigenetic dysregulation of metabolic programs mediates liposarcoma cell plasticity. Sci Transl Med. United States; 2026;18:eadw4689.</w:t>
       </w:r>
     </w:p>
     <w:p>
@@ -7693,27 +5471,7 @@
           <w:sz w:val="24"/>
           <w14:ligatures w14:val="none"/>
         </w:rPr>
-        <w:t xml:space="preserve"> J, Zhao B, Han X, Sun T, Yue M, Hou M, et al. Comprehensive Analysis of a Six-Gene Signature Predicting Survival and Immune Infiltration of Liposarcoma Patients and Deciphering Its </w:t>
-      </w:r>
-      <w:proofErr w:type="gramStart"/>
-      <w:r>
-        <w:rPr>
-          <w:rFonts w:ascii="Times New Roman" w:eastAsia="宋体" w:hAnsi="Times New Roman" w:cs="Times New Roman"/>
-          <w:kern w:val="0"/>
-          <w:sz w:val="24"/>
-          <w14:ligatures w14:val="none"/>
-        </w:rPr>
-        <w:t>Therapeutic  Significance</w:t>
-      </w:r>
-      <w:proofErr w:type="gramEnd"/>
-      <w:r>
-        <w:rPr>
-          <w:rFonts w:ascii="Times New Roman" w:eastAsia="宋体" w:hAnsi="Times New Roman" w:cs="Times New Roman"/>
-          <w:kern w:val="0"/>
-          <w:sz w:val="24"/>
-          <w14:ligatures w14:val="none"/>
-        </w:rPr>
-        <w:t>. Int J Mol Sci. Switzerland; 2024;25.</w:t>
+        <w:t xml:space="preserve"> J, Zhao B, Han X, Sun T, Yue M, Hou M, et al. Comprehensive Analysis of a Six-Gene Signature Predicting Survival and Immune Infiltration of Liposarcoma Patients and Deciphering Its Therapeutic  Significance. Int J Mol Sci. Switzerland; 2024;25.</w:t>
       </w:r>
     </w:p>
     <w:p>
@@ -7758,27 +5516,7 @@
           <w:sz w:val="24"/>
           <w14:ligatures w14:val="none"/>
         </w:rPr>
-        <w:t xml:space="preserve"> TN, Tiongco RP, Brown LM, Taylor JL, Lyons JM, Lau FH, et al. Expression of the preadipocyte marker ZFP423 is dysregulated between well-differentiated and dedifferentiated liposarcoma. BMC Cancer. England; </w:t>
-      </w:r>
-      <w:proofErr w:type="gramStart"/>
-      <w:r>
-        <w:rPr>
-          <w:rFonts w:ascii="Times New Roman" w:eastAsia="宋体" w:hAnsi="Times New Roman" w:cs="Times New Roman"/>
-          <w:kern w:val="0"/>
-          <w:sz w:val="24"/>
-          <w14:ligatures w14:val="none"/>
-        </w:rPr>
-        <w:t>2022;22:300</w:t>
-      </w:r>
-      <w:proofErr w:type="gramEnd"/>
-      <w:r>
-        <w:rPr>
-          <w:rFonts w:ascii="Times New Roman" w:eastAsia="宋体" w:hAnsi="Times New Roman" w:cs="Times New Roman"/>
-          <w:kern w:val="0"/>
-          <w:sz w:val="24"/>
-          <w14:ligatures w14:val="none"/>
-        </w:rPr>
-        <w:t>.</w:t>
+        <w:t xml:space="preserve"> TN, Tiongco RP, Brown LM, Taylor JL, Lyons JM, Lau FH, et al. Expression of the preadipocyte marker ZFP423 is dysregulated between well-differentiated and dedifferentiated liposarcoma. BMC Cancer. England; 2022;22:300.</w:t>
       </w:r>
     </w:p>
     <w:p>
@@ -7848,27 +5586,7 @@
           <w:sz w:val="24"/>
           <w14:ligatures w14:val="none"/>
         </w:rPr>
-        <w:t xml:space="preserve"> J, Cheu JW-S, Wong CC-L. The Diverse Roles of Lipid Metabolism Reprogramming in Shaping the Tumor Immune Microenvironment. Cancer Res. United States; </w:t>
-      </w:r>
-      <w:proofErr w:type="gramStart"/>
-      <w:r>
-        <w:rPr>
-          <w:rFonts w:ascii="Times New Roman" w:eastAsia="宋体" w:hAnsi="Times New Roman" w:cs="Times New Roman"/>
-          <w:kern w:val="0"/>
-          <w:sz w:val="24"/>
-          <w14:ligatures w14:val="none"/>
-        </w:rPr>
-        <w:t>2026;86:834</w:t>
-      </w:r>
-      <w:proofErr w:type="gramEnd"/>
-      <w:r>
-        <w:rPr>
-          <w:rFonts w:ascii="Times New Roman" w:eastAsia="宋体" w:hAnsi="Times New Roman" w:cs="Times New Roman"/>
-          <w:kern w:val="0"/>
-          <w:sz w:val="24"/>
-          <w14:ligatures w14:val="none"/>
-        </w:rPr>
-        <w:t>–44.</w:t>
+        <w:t xml:space="preserve"> J, Cheu JW-S, Wong CC-L. The Diverse Roles of Lipid Metabolism Reprogramming in Shaping the Tumor Immune Microenvironment. Cancer Res. United States; 2026;86:834–44.</w:t>
       </w:r>
     </w:p>
     <w:p>
@@ -7896,7 +5614,6 @@
         <w:t xml:space="preserve">25. </w:t>
       </w:r>
       <w:bookmarkStart w:id="38" w:name="OLE_LINK97"/>
-      <w:proofErr w:type="spellStart"/>
       <w:r>
         <w:rPr>
           <w:rFonts w:ascii="Times New Roman" w:eastAsia="宋体" w:hAnsi="Times New Roman" w:cs="Times New Roman"/>
@@ -7907,75 +5624,14 @@
         <w:t>Resag</w:t>
       </w:r>
       <w:bookmarkEnd w:id="38"/>
-      <w:proofErr w:type="spellEnd"/>
-      <w:r>
-        <w:rPr>
-          <w:rFonts w:ascii="Times New Roman" w:eastAsia="宋体" w:hAnsi="Times New Roman" w:cs="Times New Roman"/>
-          <w:kern w:val="0"/>
-          <w:sz w:val="24"/>
-          <w14:ligatures w14:val="none"/>
-        </w:rPr>
-        <w:t xml:space="preserve"> A, </w:t>
-      </w:r>
-      <w:proofErr w:type="spellStart"/>
-      <w:r>
-        <w:rPr>
-          <w:rFonts w:ascii="Times New Roman" w:eastAsia="宋体" w:hAnsi="Times New Roman" w:cs="Times New Roman"/>
-          <w:kern w:val="0"/>
-          <w:sz w:val="24"/>
-          <w14:ligatures w14:val="none"/>
-        </w:rPr>
-        <w:t>Toffanin</w:t>
-      </w:r>
-      <w:proofErr w:type="spellEnd"/>
-      <w:r>
-        <w:rPr>
-          <w:rFonts w:ascii="Times New Roman" w:eastAsia="宋体" w:hAnsi="Times New Roman" w:cs="Times New Roman"/>
-          <w:kern w:val="0"/>
-          <w:sz w:val="24"/>
-          <w14:ligatures w14:val="none"/>
-        </w:rPr>
-        <w:t xml:space="preserve"> G, Benešová I, Müller L, </w:t>
-      </w:r>
-      <w:proofErr w:type="spellStart"/>
-      <w:r>
-        <w:rPr>
-          <w:rFonts w:ascii="Times New Roman" w:eastAsia="宋体" w:hAnsi="Times New Roman" w:cs="Times New Roman"/>
-          <w:kern w:val="0"/>
-          <w:sz w:val="24"/>
-          <w14:ligatures w14:val="none"/>
-        </w:rPr>
-        <w:t>Potkrajcic</w:t>
-      </w:r>
-      <w:proofErr w:type="spellEnd"/>
-      <w:r>
-        <w:rPr>
-          <w:rFonts w:ascii="Times New Roman" w:eastAsia="宋体" w:hAnsi="Times New Roman" w:cs="Times New Roman"/>
-          <w:kern w:val="0"/>
-          <w:sz w:val="24"/>
-          <w14:ligatures w14:val="none"/>
-        </w:rPr>
-        <w:t xml:space="preserve"> V, </w:t>
-      </w:r>
-      <w:proofErr w:type="spellStart"/>
-      <w:r>
-        <w:rPr>
-          <w:rFonts w:ascii="Times New Roman" w:eastAsia="宋体" w:hAnsi="Times New Roman" w:cs="Times New Roman"/>
-          <w:kern w:val="0"/>
-          <w:sz w:val="24"/>
-          <w14:ligatures w14:val="none"/>
-        </w:rPr>
-        <w:t>Ozaniak</w:t>
-      </w:r>
-      <w:proofErr w:type="spellEnd"/>
-      <w:r>
-        <w:rPr>
-          <w:rFonts w:ascii="Times New Roman" w:eastAsia="宋体" w:hAnsi="Times New Roman" w:cs="Times New Roman"/>
-          <w:kern w:val="0"/>
-          <w:sz w:val="24"/>
-          <w14:ligatures w14:val="none"/>
-        </w:rPr>
-        <w:t xml:space="preserve"> A, et al. The Immune Contexture of Liposarcoma and Its Clinical Implications. Cancers (Basel). Switzerland; 2022;14.</w:t>
+      <w:r>
+        <w:rPr>
+          <w:rFonts w:ascii="Times New Roman" w:eastAsia="宋体" w:hAnsi="Times New Roman" w:cs="Times New Roman"/>
+          <w:kern w:val="0"/>
+          <w:sz w:val="24"/>
+          <w14:ligatures w14:val="none"/>
+        </w:rPr>
+        <w:t xml:space="preserve"> A, Toffanin G, Benešová I, Müller L, Potkrajcic V, Ozaniak A, et al. The Immune Contexture of Liposarcoma and Its Clinical Implications. Cancers (Basel). Switzerland; 2022;14.</w:t>
       </w:r>
     </w:p>
     <w:p>
@@ -8020,87 +5676,7 @@
           <w:sz w:val="24"/>
           <w14:ligatures w14:val="none"/>
         </w:rPr>
-        <w:t xml:space="preserve"> FM, WINSLOW DJ. Liposarcoma. A study of 103 cases. </w:t>
-      </w:r>
-      <w:proofErr w:type="spellStart"/>
-      <w:r>
-        <w:rPr>
-          <w:rFonts w:ascii="Times New Roman" w:eastAsia="宋体" w:hAnsi="Times New Roman" w:cs="Times New Roman"/>
-          <w:kern w:val="0"/>
-          <w:sz w:val="24"/>
-          <w14:ligatures w14:val="none"/>
-        </w:rPr>
-        <w:t>Virchows</w:t>
-      </w:r>
-      <w:proofErr w:type="spellEnd"/>
-      <w:r>
-        <w:rPr>
-          <w:rFonts w:ascii="Times New Roman" w:eastAsia="宋体" w:hAnsi="Times New Roman" w:cs="Times New Roman"/>
-          <w:kern w:val="0"/>
-          <w:sz w:val="24"/>
-          <w14:ligatures w14:val="none"/>
-        </w:rPr>
-        <w:t xml:space="preserve"> Arch </w:t>
-      </w:r>
-      <w:proofErr w:type="spellStart"/>
-      <w:r>
-        <w:rPr>
-          <w:rFonts w:ascii="Times New Roman" w:eastAsia="宋体" w:hAnsi="Times New Roman" w:cs="Times New Roman"/>
-          <w:kern w:val="0"/>
-          <w:sz w:val="24"/>
-          <w14:ligatures w14:val="none"/>
-        </w:rPr>
-        <w:t>Pathol</w:t>
-      </w:r>
-      <w:proofErr w:type="spellEnd"/>
-      <w:r>
-        <w:rPr>
-          <w:rFonts w:ascii="Times New Roman" w:eastAsia="宋体" w:hAnsi="Times New Roman" w:cs="Times New Roman"/>
-          <w:kern w:val="0"/>
-          <w:sz w:val="24"/>
-          <w14:ligatures w14:val="none"/>
-        </w:rPr>
-        <w:t xml:space="preserve"> Anat </w:t>
-      </w:r>
-      <w:proofErr w:type="spellStart"/>
-      <w:r>
-        <w:rPr>
-          <w:rFonts w:ascii="Times New Roman" w:eastAsia="宋体" w:hAnsi="Times New Roman" w:cs="Times New Roman"/>
-          <w:kern w:val="0"/>
-          <w:sz w:val="24"/>
-          <w14:ligatures w14:val="none"/>
-        </w:rPr>
-        <w:t>Physiol</w:t>
-      </w:r>
-      <w:proofErr w:type="spellEnd"/>
-      <w:r>
-        <w:rPr>
-          <w:rFonts w:ascii="Times New Roman" w:eastAsia="宋体" w:hAnsi="Times New Roman" w:cs="Times New Roman"/>
-          <w:kern w:val="0"/>
-          <w:sz w:val="24"/>
-          <w14:ligatures w14:val="none"/>
-        </w:rPr>
-        <w:t xml:space="preserve"> Klin Med. Germany; </w:t>
-      </w:r>
-      <w:proofErr w:type="gramStart"/>
-      <w:r>
-        <w:rPr>
-          <w:rFonts w:ascii="Times New Roman" w:eastAsia="宋体" w:hAnsi="Times New Roman" w:cs="Times New Roman"/>
-          <w:kern w:val="0"/>
-          <w:sz w:val="24"/>
-          <w14:ligatures w14:val="none"/>
-        </w:rPr>
-        <w:t>1962;335:367</w:t>
-      </w:r>
-      <w:proofErr w:type="gramEnd"/>
-      <w:r>
-        <w:rPr>
-          <w:rFonts w:ascii="Times New Roman" w:eastAsia="宋体" w:hAnsi="Times New Roman" w:cs="Times New Roman"/>
-          <w:kern w:val="0"/>
-          <w:sz w:val="24"/>
-          <w14:ligatures w14:val="none"/>
-        </w:rPr>
-        <w:t>–88.</w:t>
+        <w:t xml:space="preserve"> FM, WINSLOW DJ. Liposarcoma. A study of 103 cases. Virchows Arch Pathol Anat Physiol Klin Med. Germany; 1962;335:367–88.</w:t>
       </w:r>
     </w:p>
     <w:p>
@@ -8128,7 +5704,6 @@
         <w:t xml:space="preserve">27. </w:t>
       </w:r>
       <w:bookmarkStart w:id="40" w:name="OLE_LINK104"/>
-      <w:proofErr w:type="spellStart"/>
       <w:r>
         <w:rPr>
           <w:rFonts w:ascii="Times New Roman" w:eastAsia="宋体" w:hAnsi="Times New Roman" w:cs="Times New Roman"/>
@@ -8139,55 +5714,14 @@
         <w:t>Vasella</w:t>
       </w:r>
       <w:bookmarkEnd w:id="40"/>
-      <w:proofErr w:type="spellEnd"/>
-      <w:r>
-        <w:rPr>
-          <w:rFonts w:ascii="Times New Roman" w:eastAsia="宋体" w:hAnsi="Times New Roman" w:cs="Times New Roman"/>
-          <w:kern w:val="0"/>
-          <w:sz w:val="24"/>
-          <w14:ligatures w14:val="none"/>
-        </w:rPr>
-        <w:t xml:space="preserve"> M, </w:t>
-      </w:r>
-      <w:proofErr w:type="spellStart"/>
-      <w:r>
-        <w:rPr>
-          <w:rFonts w:ascii="Times New Roman" w:eastAsia="宋体" w:hAnsi="Times New Roman" w:cs="Times New Roman"/>
-          <w:kern w:val="0"/>
-          <w:sz w:val="24"/>
-          <w14:ligatures w14:val="none"/>
-        </w:rPr>
-        <w:t>Gousopoulos</w:t>
-      </w:r>
-      <w:proofErr w:type="spellEnd"/>
-      <w:r>
-        <w:rPr>
-          <w:rFonts w:ascii="Times New Roman" w:eastAsia="宋体" w:hAnsi="Times New Roman" w:cs="Times New Roman"/>
-          <w:kern w:val="0"/>
-          <w:sz w:val="24"/>
-          <w14:ligatures w14:val="none"/>
-        </w:rPr>
-        <w:t xml:space="preserve"> E, Guidi M, Storti G, Song SY, Grieb G, et al. Targeted therapies and checkpoint inhibitors in sarcoma. QJM. England; </w:t>
-      </w:r>
-      <w:proofErr w:type="gramStart"/>
-      <w:r>
-        <w:rPr>
-          <w:rFonts w:ascii="Times New Roman" w:eastAsia="宋体" w:hAnsi="Times New Roman" w:cs="Times New Roman"/>
-          <w:kern w:val="0"/>
-          <w:sz w:val="24"/>
-          <w14:ligatures w14:val="none"/>
-        </w:rPr>
-        <w:t>2022;115:793</w:t>
-      </w:r>
-      <w:proofErr w:type="gramEnd"/>
-      <w:r>
-        <w:rPr>
-          <w:rFonts w:ascii="Times New Roman" w:eastAsia="宋体" w:hAnsi="Times New Roman" w:cs="Times New Roman"/>
-          <w:kern w:val="0"/>
-          <w:sz w:val="24"/>
-          <w14:ligatures w14:val="none"/>
-        </w:rPr>
-        <w:t>–805.</w:t>
+      <w:r>
+        <w:rPr>
+          <w:rFonts w:ascii="Times New Roman" w:eastAsia="宋体" w:hAnsi="Times New Roman" w:cs="Times New Roman"/>
+          <w:kern w:val="0"/>
+          <w:sz w:val="24"/>
+          <w14:ligatures w14:val="none"/>
+        </w:rPr>
+        <w:t xml:space="preserve"> M, Gousopoulos E, Guidi M, Storti G, Song SY, Grieb G, et al. Targeted therapies and checkpoint inhibitors in sarcoma. QJM. England; 2022;115:793–805.</w:t>
       </w:r>
     </w:p>
     <w:p>
@@ -8232,27 +5766,7 @@
           <w:sz w:val="24"/>
           <w14:ligatures w14:val="none"/>
         </w:rPr>
-        <w:t xml:space="preserve"> MB, Leung CH, Zoghbi M, Lazcano R, Ingram D, Wani K, et al. Dedifferentiated liposarcomas treated with immune checkpoint blockade: the MD Anderson experience. Front Immunol. Switzerland; </w:t>
-      </w:r>
-      <w:proofErr w:type="gramStart"/>
-      <w:r>
-        <w:rPr>
-          <w:rFonts w:ascii="Times New Roman" w:eastAsia="宋体" w:hAnsi="Times New Roman" w:cs="Times New Roman"/>
-          <w:kern w:val="0"/>
-          <w:sz w:val="24"/>
-          <w14:ligatures w14:val="none"/>
-        </w:rPr>
-        <w:t>2025;16:1567736</w:t>
-      </w:r>
-      <w:proofErr w:type="gramEnd"/>
-      <w:r>
-        <w:rPr>
-          <w:rFonts w:ascii="Times New Roman" w:eastAsia="宋体" w:hAnsi="Times New Roman" w:cs="Times New Roman"/>
-          <w:kern w:val="0"/>
-          <w:sz w:val="24"/>
-          <w14:ligatures w14:val="none"/>
-        </w:rPr>
-        <w:t>.</w:t>
+        <w:t xml:space="preserve"> MB, Leung CH, Zoghbi M, Lazcano R, Ingram D, Wani K, et al. Dedifferentiated liposarcomas treated with immune checkpoint blockade: the MD Anderson experience. Front Immunol. Switzerland; 2025;16:1567736.</w:t>
       </w:r>
     </w:p>
     <w:p>
@@ -8297,87 +5811,7 @@
           <w:sz w:val="24"/>
           <w14:ligatures w14:val="none"/>
         </w:rPr>
-        <w:t xml:space="preserve">E, Gularte-Mérida R, </w:t>
-      </w:r>
-      <w:proofErr w:type="spellStart"/>
-      <w:r>
-        <w:rPr>
-          <w:rFonts w:ascii="Times New Roman" w:eastAsia="宋体" w:hAnsi="Times New Roman" w:cs="Times New Roman"/>
-          <w:kern w:val="0"/>
-          <w:sz w:val="24"/>
-          <w14:ligatures w14:val="none"/>
-        </w:rPr>
-        <w:t>Seffar</w:t>
-      </w:r>
-      <w:proofErr w:type="spellEnd"/>
-      <w:r>
-        <w:rPr>
-          <w:rFonts w:ascii="Times New Roman" w:eastAsia="宋体" w:hAnsi="Times New Roman" w:cs="Times New Roman"/>
-          <w:kern w:val="0"/>
-          <w:sz w:val="24"/>
-          <w14:ligatures w14:val="none"/>
-        </w:rPr>
-        <w:t xml:space="preserve"> E, Lee J, </w:t>
-      </w:r>
-      <w:proofErr w:type="spellStart"/>
-      <w:r>
-        <w:rPr>
-          <w:rFonts w:ascii="Times New Roman" w:eastAsia="宋体" w:hAnsi="Times New Roman" w:cs="Times New Roman"/>
-          <w:kern w:val="0"/>
-          <w:sz w:val="24"/>
-          <w14:ligatures w14:val="none"/>
-        </w:rPr>
-        <w:t>Adamow</w:t>
-      </w:r>
-      <w:proofErr w:type="spellEnd"/>
-      <w:r>
-        <w:rPr>
-          <w:rFonts w:ascii="Times New Roman" w:eastAsia="宋体" w:hAnsi="Times New Roman" w:cs="Times New Roman"/>
-          <w:kern w:val="0"/>
-          <w:sz w:val="24"/>
-          <w14:ligatures w14:val="none"/>
-        </w:rPr>
-        <w:t xml:space="preserve"> M, </w:t>
-      </w:r>
-      <w:proofErr w:type="spellStart"/>
-      <w:r>
-        <w:rPr>
-          <w:rFonts w:ascii="Times New Roman" w:eastAsia="宋体" w:hAnsi="Times New Roman" w:cs="Times New Roman"/>
-          <w:kern w:val="0"/>
-          <w:sz w:val="24"/>
-          <w14:ligatures w14:val="none"/>
-        </w:rPr>
-        <w:t>Bradic</w:t>
-      </w:r>
-      <w:proofErr w:type="spellEnd"/>
-      <w:r>
-        <w:rPr>
-          <w:rFonts w:ascii="Times New Roman" w:eastAsia="宋体" w:hAnsi="Times New Roman" w:cs="Times New Roman"/>
-          <w:kern w:val="0"/>
-          <w:sz w:val="24"/>
-          <w14:ligatures w14:val="none"/>
-        </w:rPr>
-        <w:t xml:space="preserve"> M, et al. Tumor and Immune Dynamics Following Sequential CDK4/6 and PD-1 Inhibition: Results from a Phase 2 Study in Dedifferentiated Liposarcoma. Cancer Res Commun. United States; </w:t>
-      </w:r>
-      <w:proofErr w:type="gramStart"/>
-      <w:r>
-        <w:rPr>
-          <w:rFonts w:ascii="Times New Roman" w:eastAsia="宋体" w:hAnsi="Times New Roman" w:cs="Times New Roman"/>
-          <w:kern w:val="0"/>
-          <w:sz w:val="24"/>
-          <w14:ligatures w14:val="none"/>
-        </w:rPr>
-        <w:t>2026;6:437</w:t>
-      </w:r>
-      <w:proofErr w:type="gramEnd"/>
-      <w:r>
-        <w:rPr>
-          <w:rFonts w:ascii="Times New Roman" w:eastAsia="宋体" w:hAnsi="Times New Roman" w:cs="Times New Roman"/>
-          <w:kern w:val="0"/>
-          <w:sz w:val="24"/>
-          <w14:ligatures w14:val="none"/>
-        </w:rPr>
-        <w:t>–46.</w:t>
+        <w:t>E, Gularte-Mérida R, Seffar E, Lee J, Adamow M, Bradic M, et al. Tumor and Immune Dynamics Following Sequential CDK4/6 and PD-1 Inhibition: Results from a Phase 2 Study in Dedifferentiated Liposarcoma. Cancer Res Commun. United States; 2026;6:437–46.</w:t>
       </w:r>
     </w:p>
     <w:p>
@@ -8403,47 +5837,7 @@
           <w14:ligatures w14:val="none"/>
         </w:rPr>
         <w:lastRenderedPageBreak/>
-        <w:t xml:space="preserve">30. Zhang Y-X, </w:t>
-      </w:r>
-      <w:proofErr w:type="spellStart"/>
-      <w:r>
-        <w:rPr>
-          <w:rFonts w:ascii="Times New Roman" w:eastAsia="宋体" w:hAnsi="Times New Roman" w:cs="Times New Roman"/>
-          <w:kern w:val="0"/>
-          <w:sz w:val="24"/>
-          <w14:ligatures w14:val="none"/>
-        </w:rPr>
-        <w:t>Sicinska</w:t>
-      </w:r>
-      <w:proofErr w:type="spellEnd"/>
-      <w:r>
-        <w:rPr>
-          <w:rFonts w:ascii="Times New Roman" w:eastAsia="宋体" w:hAnsi="Times New Roman" w:cs="Times New Roman"/>
-          <w:kern w:val="0"/>
-          <w:sz w:val="24"/>
-          <w14:ligatures w14:val="none"/>
-        </w:rPr>
-        <w:t xml:space="preserve"> E, Czaplinski JT, Remillard SP, Moss S, Wang Y, et al. Antiproliferative effects of CDK4/6 inhibition in CDK4-amplified human liposarcoma in vitro and in vivo. Mol Cancer Ther. United States; </w:t>
-      </w:r>
-      <w:proofErr w:type="gramStart"/>
-      <w:r>
-        <w:rPr>
-          <w:rFonts w:ascii="Times New Roman" w:eastAsia="宋体" w:hAnsi="Times New Roman" w:cs="Times New Roman"/>
-          <w:kern w:val="0"/>
-          <w:sz w:val="24"/>
-          <w14:ligatures w14:val="none"/>
-        </w:rPr>
-        <w:t>2014;13:2184</w:t>
-      </w:r>
-      <w:proofErr w:type="gramEnd"/>
-      <w:r>
-        <w:rPr>
-          <w:rFonts w:ascii="Times New Roman" w:eastAsia="宋体" w:hAnsi="Times New Roman" w:cs="Times New Roman"/>
-          <w:kern w:val="0"/>
-          <w:sz w:val="24"/>
-          <w14:ligatures w14:val="none"/>
-        </w:rPr>
-        <w:t>–93.</w:t>
+        <w:t>30. Zhang Y-X, Sicinska E, Czaplinski JT, Remillard SP, Moss S, Wang Y, et al. Antiproliferative effects of CDK4/6 inhibition in CDK4-amplified human liposarcoma in vitro and in vivo. Mol Cancer Ther. United States; 2014;13:2184–93.</w:t>
       </w:r>
     </w:p>
     <w:p>
@@ -8488,27 +5882,7 @@
           <w:sz w:val="24"/>
           <w14:ligatures w14:val="none"/>
         </w:rPr>
-        <w:t xml:space="preserve"> H, Zhou Y, Xu H, Wang X, Zhang Y, Shang R, et al. Therapeutic efficacy of FASN inhibition in preclinical models of HCC. Hepatology. United States; </w:t>
-      </w:r>
-      <w:proofErr w:type="gramStart"/>
-      <w:r>
-        <w:rPr>
-          <w:rFonts w:ascii="Times New Roman" w:eastAsia="宋体" w:hAnsi="Times New Roman" w:cs="Times New Roman"/>
-          <w:kern w:val="0"/>
-          <w:sz w:val="24"/>
-          <w14:ligatures w14:val="none"/>
-        </w:rPr>
-        <w:t>2022;76:951</w:t>
-      </w:r>
-      <w:proofErr w:type="gramEnd"/>
-      <w:r>
-        <w:rPr>
-          <w:rFonts w:ascii="Times New Roman" w:eastAsia="宋体" w:hAnsi="Times New Roman" w:cs="Times New Roman"/>
-          <w:kern w:val="0"/>
-          <w:sz w:val="24"/>
-          <w14:ligatures w14:val="none"/>
-        </w:rPr>
-        <w:t>–66.</w:t>
+        <w:t xml:space="preserve"> H, Zhou Y, Xu H, Wang X, Zhang Y, Shang R, et al. Therapeutic efficacy of FASN inhibition in preclinical models of HCC. Hepatology. United States; 2022;76:951–66.</w:t>
       </w:r>
     </w:p>
     <w:p>
@@ -8553,47 +5927,7 @@
           <w:sz w:val="24"/>
           <w14:ligatures w14:val="none"/>
         </w:rPr>
-        <w:t xml:space="preserve"> CE, Dickson MA, Klein Dooley ME, Antonescu CR, Gularte-Mérida R, Benitez M, et al. Therapy-Induced Senescence Contributes to the Efficacy of </w:t>
-      </w:r>
-      <w:proofErr w:type="spellStart"/>
-      <w:r>
-        <w:rPr>
-          <w:rFonts w:ascii="Times New Roman" w:eastAsia="宋体" w:hAnsi="Times New Roman" w:cs="Times New Roman"/>
-          <w:kern w:val="0"/>
-          <w:sz w:val="24"/>
-          <w14:ligatures w14:val="none"/>
-        </w:rPr>
-        <w:t>Abemaciclib</w:t>
-      </w:r>
-      <w:proofErr w:type="spellEnd"/>
-      <w:r>
-        <w:rPr>
-          <w:rFonts w:ascii="Times New Roman" w:eastAsia="宋体" w:hAnsi="Times New Roman" w:cs="Times New Roman"/>
-          <w:kern w:val="0"/>
-          <w:sz w:val="24"/>
-          <w14:ligatures w14:val="none"/>
-        </w:rPr>
-        <w:t xml:space="preserve"> in Patients with Dedifferentiated Liposarcoma. Clin Cancer Res. United States; </w:t>
-      </w:r>
-      <w:proofErr w:type="gramStart"/>
-      <w:r>
-        <w:rPr>
-          <w:rFonts w:ascii="Times New Roman" w:eastAsia="宋体" w:hAnsi="Times New Roman" w:cs="Times New Roman"/>
-          <w:kern w:val="0"/>
-          <w:sz w:val="24"/>
-          <w14:ligatures w14:val="none"/>
-        </w:rPr>
-        <w:t>2024;30:703</w:t>
-      </w:r>
-      <w:proofErr w:type="gramEnd"/>
-      <w:r>
-        <w:rPr>
-          <w:rFonts w:ascii="Times New Roman" w:eastAsia="宋体" w:hAnsi="Times New Roman" w:cs="Times New Roman"/>
-          <w:kern w:val="0"/>
-          <w:sz w:val="24"/>
-          <w14:ligatures w14:val="none"/>
-        </w:rPr>
-        <w:t>–18.</w:t>
+        <w:t xml:space="preserve"> CE, Dickson MA, Klein Dooley ME, Antonescu CR, Gularte-Mérida R, Benitez M, et al. Therapy-Induced Senescence Contributes to the Efficacy of Abemaciclib in Patients with Dedifferentiated Liposarcoma. Clin Cancer Res. United States; 2024;30:703–18.</w:t>
       </w:r>
     </w:p>
     <w:p>
@@ -8638,107 +5972,7 @@
           <w:sz w:val="24"/>
           <w14:ligatures w14:val="none"/>
         </w:rPr>
-        <w:t xml:space="preserve"> DS, </w:t>
-      </w:r>
-      <w:proofErr w:type="spellStart"/>
-      <w:r>
-        <w:rPr>
-          <w:rFonts w:ascii="Times New Roman" w:eastAsia="宋体" w:hAnsi="Times New Roman" w:cs="Times New Roman"/>
-          <w:kern w:val="0"/>
-          <w:sz w:val="24"/>
-          <w14:ligatures w14:val="none"/>
-        </w:rPr>
-        <w:t>Qorbani</w:t>
-      </w:r>
-      <w:proofErr w:type="spellEnd"/>
-      <w:r>
-        <w:rPr>
-          <w:rFonts w:ascii="Times New Roman" w:eastAsia="宋体" w:hAnsi="Times New Roman" w:cs="Times New Roman"/>
-          <w:kern w:val="0"/>
-          <w:sz w:val="24"/>
-          <w14:ligatures w14:val="none"/>
-        </w:rPr>
-        <w:t xml:space="preserve"> A, Eckardt MA, Klingbeil KD, Chen LY, Chopra S, et al. Does “Low-Grade” Dedifferentiated Liposarcoma Exist? The Role of Mitotic Index in Separating Dedifferentiated Liposarcoma </w:t>
-      </w:r>
-      <w:proofErr w:type="gramStart"/>
-      <w:r>
-        <w:rPr>
-          <w:rFonts w:ascii="Times New Roman" w:eastAsia="宋体" w:hAnsi="Times New Roman" w:cs="Times New Roman"/>
-          <w:kern w:val="0"/>
-          <w:sz w:val="24"/>
-          <w14:ligatures w14:val="none"/>
-        </w:rPr>
-        <w:t>From</w:t>
-      </w:r>
-      <w:proofErr w:type="gramEnd"/>
-      <w:r>
-        <w:rPr>
-          <w:rFonts w:ascii="Times New Roman" w:eastAsia="宋体" w:hAnsi="Times New Roman" w:cs="Times New Roman"/>
-          <w:kern w:val="0"/>
-          <w:sz w:val="24"/>
-          <w14:ligatures w14:val="none"/>
-        </w:rPr>
-        <w:t xml:space="preserve"> Cellular Well-</w:t>
-      </w:r>
-      <w:proofErr w:type="gramStart"/>
-      <w:r>
-        <w:rPr>
-          <w:rFonts w:ascii="Times New Roman" w:eastAsia="宋体" w:hAnsi="Times New Roman" w:cs="Times New Roman"/>
-          <w:kern w:val="0"/>
-          <w:sz w:val="24"/>
-          <w14:ligatures w14:val="none"/>
-        </w:rPr>
-        <w:t>differentiated  Liposarcoma</w:t>
-      </w:r>
-      <w:proofErr w:type="gramEnd"/>
-      <w:r>
-        <w:rPr>
-          <w:rFonts w:ascii="Times New Roman" w:eastAsia="宋体" w:hAnsi="Times New Roman" w:cs="Times New Roman"/>
-          <w:kern w:val="0"/>
-          <w:sz w:val="24"/>
-          <w14:ligatures w14:val="none"/>
-        </w:rPr>
-        <w:t xml:space="preserve">. Am J Surg </w:t>
-      </w:r>
-      <w:proofErr w:type="spellStart"/>
-      <w:r>
-        <w:rPr>
-          <w:rFonts w:ascii="Times New Roman" w:eastAsia="宋体" w:hAnsi="Times New Roman" w:cs="Times New Roman"/>
-          <w:kern w:val="0"/>
-          <w:sz w:val="24"/>
-          <w14:ligatures w14:val="none"/>
-        </w:rPr>
-        <w:t>Pathol</w:t>
-      </w:r>
-      <w:proofErr w:type="spellEnd"/>
-      <w:r>
-        <w:rPr>
-          <w:rFonts w:ascii="Times New Roman" w:eastAsia="宋体" w:hAnsi="Times New Roman" w:cs="Times New Roman"/>
-          <w:kern w:val="0"/>
-          <w:sz w:val="24"/>
-          <w14:ligatures w14:val="none"/>
-        </w:rPr>
-        <w:t xml:space="preserve">. United States; </w:t>
-      </w:r>
-      <w:proofErr w:type="gramStart"/>
-      <w:r>
-        <w:rPr>
-          <w:rFonts w:ascii="Times New Roman" w:eastAsia="宋体" w:hAnsi="Times New Roman" w:cs="Times New Roman"/>
-          <w:kern w:val="0"/>
-          <w:sz w:val="24"/>
-          <w14:ligatures w14:val="none"/>
-        </w:rPr>
-        <w:t>2023;47:649</w:t>
-      </w:r>
-      <w:proofErr w:type="gramEnd"/>
-      <w:r>
-        <w:rPr>
-          <w:rFonts w:ascii="Times New Roman" w:eastAsia="宋体" w:hAnsi="Times New Roman" w:cs="Times New Roman"/>
-          <w:kern w:val="0"/>
-          <w:sz w:val="24"/>
-          <w14:ligatures w14:val="none"/>
-        </w:rPr>
-        <w:t>–60.</w:t>
+        <w:t xml:space="preserve"> DS, Qorbani A, Eckardt MA, Klingbeil KD, Chen LY, Chopra S, et al. Does “Low-Grade” Dedifferentiated Liposarcoma Exist? The Role of Mitotic Index in Separating Dedifferentiated Liposarcoma From Cellular Well-differentiated  Liposarcoma. Am J Surg Pathol. United States; 2023;47:649–60.</w:t>
       </w:r>
     </w:p>
     <w:p>
@@ -8783,27 +6017,7 @@
           <w:sz w:val="24"/>
           <w14:ligatures w14:val="none"/>
         </w:rPr>
-        <w:t xml:space="preserve"> PG, Hetty S, Vranic M, Almby K, Castillejo-López C, Abalo XM, et al. Proof-of-concept for CRISPR/Cas9 gene editing in human preadipocytes: Deletion of FKBP5 and PPARG and effects on adipocyte differentiation and metabolism. Sci Rep. England; </w:t>
-      </w:r>
-      <w:proofErr w:type="gramStart"/>
-      <w:r>
-        <w:rPr>
-          <w:rFonts w:ascii="Times New Roman" w:eastAsia="宋体" w:hAnsi="Times New Roman" w:cs="Times New Roman"/>
-          <w:kern w:val="0"/>
-          <w:sz w:val="24"/>
-          <w14:ligatures w14:val="none"/>
-        </w:rPr>
-        <w:t>2020;10:10565</w:t>
-      </w:r>
-      <w:proofErr w:type="gramEnd"/>
-      <w:r>
-        <w:rPr>
-          <w:rFonts w:ascii="Times New Roman" w:eastAsia="宋体" w:hAnsi="Times New Roman" w:cs="Times New Roman"/>
-          <w:kern w:val="0"/>
-          <w:sz w:val="24"/>
-          <w14:ligatures w14:val="none"/>
-        </w:rPr>
-        <w:t>.</w:t>
+        <w:t xml:space="preserve"> PG, Hetty S, Vranic M, Almby K, Castillejo-López C, Abalo XM, et al. Proof-of-concept for CRISPR/Cas9 gene editing in human preadipocytes: Deletion of FKBP5 and PPARG and effects on adipocyte differentiation and metabolism. Sci Rep. England; 2020;10:10565.</w:t>
       </w:r>
     </w:p>
     <w:p>
@@ -8848,47 +6062,7 @@
           <w:sz w:val="24"/>
           <w14:ligatures w14:val="none"/>
         </w:rPr>
-        <w:t xml:space="preserve"> CL, Nassif Haddad EF, Keung EZ, Wang W-L, Lazar AJ, Lin H, et al. A randomized, non-comparative phase 2 study of neoadjuvant immune-checkpoint blockade in retroperitoneal dedifferentiated liposarcoma and extremity/</w:t>
-      </w:r>
-      <w:proofErr w:type="gramStart"/>
-      <w:r>
-        <w:rPr>
-          <w:rFonts w:ascii="Times New Roman" w:eastAsia="宋体" w:hAnsi="Times New Roman" w:cs="Times New Roman"/>
-          <w:kern w:val="0"/>
-          <w:sz w:val="24"/>
-          <w14:ligatures w14:val="none"/>
-        </w:rPr>
-        <w:t>truncal  undifferentiated</w:t>
-      </w:r>
-      <w:proofErr w:type="gramEnd"/>
-      <w:r>
-        <w:rPr>
-          <w:rFonts w:ascii="Times New Roman" w:eastAsia="宋体" w:hAnsi="Times New Roman" w:cs="Times New Roman"/>
-          <w:kern w:val="0"/>
-          <w:sz w:val="24"/>
-          <w14:ligatures w14:val="none"/>
-        </w:rPr>
-        <w:t xml:space="preserve"> pleomorphic sarcoma. Nat Cancer. England; </w:t>
-      </w:r>
-      <w:proofErr w:type="gramStart"/>
-      <w:r>
-        <w:rPr>
-          <w:rFonts w:ascii="Times New Roman" w:eastAsia="宋体" w:hAnsi="Times New Roman" w:cs="Times New Roman"/>
-          <w:kern w:val="0"/>
-          <w:sz w:val="24"/>
-          <w14:ligatures w14:val="none"/>
-        </w:rPr>
-        <w:t>2024;5:625</w:t>
-      </w:r>
-      <w:proofErr w:type="gramEnd"/>
-      <w:r>
-        <w:rPr>
-          <w:rFonts w:ascii="Times New Roman" w:eastAsia="宋体" w:hAnsi="Times New Roman" w:cs="Times New Roman"/>
-          <w:kern w:val="0"/>
-          <w:sz w:val="24"/>
-          <w14:ligatures w14:val="none"/>
-        </w:rPr>
-        <w:t>–41.</w:t>
+        <w:t xml:space="preserve"> CL, Nassif Haddad EF, Keung EZ, Wang W-L, Lazar AJ, Lin H, et al. A randomized, non-comparative phase 2 study of neoadjuvant immune-checkpoint blockade in retroperitoneal dedifferentiated liposarcoma and extremity/truncal  undifferentiated pleomorphic sarcoma. Nat Cancer. England; 2024;5:625–41.</w:t>
       </w:r>
     </w:p>
     <w:p>
@@ -8933,67 +6107,7 @@
           <w:sz w:val="24"/>
           <w14:ligatures w14:val="none"/>
         </w:rPr>
-        <w:t xml:space="preserve">, </w:t>
-      </w:r>
-      <w:proofErr w:type="spellStart"/>
-      <w:r>
-        <w:rPr>
-          <w:rFonts w:ascii="Times New Roman" w:eastAsia="宋体" w:hAnsi="Times New Roman" w:cs="Times New Roman"/>
-          <w:kern w:val="0"/>
-          <w:sz w:val="24"/>
-          <w14:ligatures w14:val="none"/>
-        </w:rPr>
-        <w:t>Toulmonde</w:t>
-      </w:r>
-      <w:proofErr w:type="spellEnd"/>
-      <w:r>
-        <w:rPr>
-          <w:rFonts w:ascii="Times New Roman" w:eastAsia="宋体" w:hAnsi="Times New Roman" w:cs="Times New Roman"/>
-          <w:kern w:val="0"/>
-          <w:sz w:val="24"/>
-          <w14:ligatures w14:val="none"/>
-        </w:rPr>
-        <w:t xml:space="preserve"> M, Valentin T, Firmin N, Watson S, </w:t>
-      </w:r>
-      <w:proofErr w:type="spellStart"/>
-      <w:r>
-        <w:rPr>
-          <w:rFonts w:ascii="Times New Roman" w:eastAsia="宋体" w:hAnsi="Times New Roman" w:cs="Times New Roman"/>
-          <w:kern w:val="0"/>
-          <w:sz w:val="24"/>
-          <w14:ligatures w14:val="none"/>
-        </w:rPr>
-        <w:t>Duffaud</w:t>
-      </w:r>
-      <w:proofErr w:type="spellEnd"/>
-      <w:r>
-        <w:rPr>
-          <w:rFonts w:ascii="Times New Roman" w:eastAsia="宋体" w:hAnsi="Times New Roman" w:cs="Times New Roman"/>
-          <w:kern w:val="0"/>
-          <w:sz w:val="24"/>
-          <w14:ligatures w14:val="none"/>
-        </w:rPr>
-        <w:t xml:space="preserve"> F, et al. Clinical presentation, management and outcome of 11,132 patients with liposarcoma patients: a population-based study from the NETSARC+ registry. Lancet Reg Health Eur. England; </w:t>
-      </w:r>
-      <w:proofErr w:type="gramStart"/>
-      <w:r>
-        <w:rPr>
-          <w:rFonts w:ascii="Times New Roman" w:eastAsia="宋体" w:hAnsi="Times New Roman" w:cs="Times New Roman"/>
-          <w:kern w:val="0"/>
-          <w:sz w:val="24"/>
-          <w14:ligatures w14:val="none"/>
-        </w:rPr>
-        <w:t>2025;57:101403</w:t>
-      </w:r>
-      <w:proofErr w:type="gramEnd"/>
-      <w:r>
-        <w:rPr>
-          <w:rFonts w:ascii="Times New Roman" w:eastAsia="宋体" w:hAnsi="Times New Roman" w:cs="Times New Roman"/>
-          <w:kern w:val="0"/>
-          <w:sz w:val="24"/>
-          <w14:ligatures w14:val="none"/>
-        </w:rPr>
-        <w:t>.</w:t>
+        <w:t>, Toulmonde M, Valentin T, Firmin N, Watson S, Duffaud F, et al. Clinical presentation, management and outcome of 11,132 patients with liposarcoma patients: a population-based study from the NETSARC+ registry. Lancet Reg Health Eur. England; 2025;57:101403.</w:t>
       </w:r>
     </w:p>
     <w:p>
@@ -9038,27 +6152,7 @@
           <w:sz w:val="24"/>
           <w14:ligatures w14:val="none"/>
         </w:rPr>
-        <w:t xml:space="preserve">, Jin J, Yang Y, Sun H, Wu L, Shen M, et al. Androgen receptor-mediated CD8(+) T cell stemness programs drive sex differences in antitumor immunity. Immunity. United States; </w:t>
-      </w:r>
-      <w:proofErr w:type="gramStart"/>
-      <w:r>
-        <w:rPr>
-          <w:rFonts w:ascii="Times New Roman" w:eastAsia="宋体" w:hAnsi="Times New Roman" w:cs="Times New Roman"/>
-          <w:kern w:val="0"/>
-          <w:sz w:val="24"/>
-          <w14:ligatures w14:val="none"/>
-        </w:rPr>
-        <w:t>2022;55:1268</w:t>
-      </w:r>
-      <w:proofErr w:type="gramEnd"/>
-      <w:r>
-        <w:rPr>
-          <w:rFonts w:ascii="Times New Roman" w:eastAsia="宋体" w:hAnsi="Times New Roman" w:cs="Times New Roman"/>
-          <w:kern w:val="0"/>
-          <w:sz w:val="24"/>
-          <w14:ligatures w14:val="none"/>
-        </w:rPr>
-        <w:t>-1283.e9.</w:t>
+        <w:t>, Jin J, Yang Y, Sun H, Wu L, Shen M, et al. Androgen receptor-mediated CD8(+) T cell stemness programs drive sex differences in antitumor immunity. Immunity. United States; 2022;55:1268-1283.e9.</w:t>
       </w:r>
     </w:p>
     <w:p>
@@ -9348,27 +6442,7 @@
           <w:sz w:val="24"/>
           <w14:ligatures w14:val="none"/>
         </w:rPr>
-        <w:t xml:space="preserve">Figure 2. Landscape of lipid metabolism. Ridge plot showing lipid scores for each subtype; highest median score was for DDLPS. (B) Ridge plot of scores by cohort to show even-distributed scores. (C) Boxplot of scores for males and females (Wilcoxon test p &lt; 0.05, males are significantly higher than females). Boxplot of scores by death status: the scores of the deceased patients are significantly higher than those of survivors (p &lt; 0.05, Wilcoxon test). (E) Distribution of scores in a histogram (median ~5.2, range 3.9–8.5). (F) Scatter plot of scores and age with no correlation (Spearman R = 0.041, p = 0.78). Representative heatmap of 6 core genes showing separation of the high and low score groups. Waterfall plot (H) shows the continuous spectrum of scores. Color schemes are optimized for color-blind </w:t>
-      </w:r>
-      <w:proofErr w:type="gramStart"/>
-      <w:r>
-        <w:rPr>
-          <w:rFonts w:ascii="Times New Roman" w:eastAsia="宋体" w:hAnsi="Times New Roman" w:cs="Times New Roman"/>
-          <w:kern w:val="0"/>
-          <w:sz w:val="24"/>
-          <w14:ligatures w14:val="none"/>
-        </w:rPr>
-        <w:t>reader</w:t>
-      </w:r>
-      <w:proofErr w:type="gramEnd"/>
-      <w:r>
-        <w:rPr>
-          <w:rFonts w:ascii="Times New Roman" w:eastAsia="宋体" w:hAnsi="Times New Roman" w:cs="Times New Roman"/>
-          <w:kern w:val="0"/>
-          <w:sz w:val="24"/>
-          <w14:ligatures w14:val="none"/>
-        </w:rPr>
-        <w:t>.</w:t>
+        <w:t>Figure 2. Landscape of lipid metabolism. Ridge plot showing lipid scores for each subtype; highest median score was for DDLPS. (B) Ridge plot of scores by cohort to show even-distributed scores. (C) Boxplot of scores for males and females (Wilcoxon test p &lt; 0.05, males are significantly higher than females). Boxplot of scores by death status: the scores of the deceased patients are significantly higher than those of survivors (p &lt; 0.05, Wilcoxon test). (E) Distribution of scores in a histogram (median ~5.2, range 3.9–8.5). (F) Scatter plot of scores and age with no correlation (Spearman R = 0.041, p = 0.78). Representative heatmap of 6 core genes showing separation of the high and low score groups. Waterfall plot (H) shows the continuous spectrum of scores. Color schemes are optimized for color-blind reader.</w:t>
       </w:r>
     </w:p>
     <w:p>
@@ -9533,27 +6607,7 @@
           <w:sz w:val="24"/>
           <w14:ligatures w14:val="none"/>
         </w:rPr>
-        <w:t>Figure 6. Prognostic performance and molecular regulatory network. Time dependent ROC curves at 1, 3 &amp; 5 years. (B) Time-dependent AUC trajectory (0.5–8 years): 1-year AUC = 0.72, 3-year AUC = 0.68, 5-year AUC = 0.65. Random prediction level is shown as a dashed line. (C) Decision curve demonstrating positive net benefit over most thresholds. (D) Grouped expression of four core genes; all were significantly higher in the high score patients (all p &lt; 0.001, Wilcoxon test); FASN (2.8-fold), ACLY (2.3-fold), SCD (2.1-fold) and SREBF1 (1.9-fold). (E) Heatmap of the gene correlation network with strong correlation between FASN and ACLY (R = 0.78) and between FASN and SCD (R = 0.72). (F) Transcription factor activity (</w:t>
-      </w:r>
-      <w:proofErr w:type="spellStart"/>
-      <w:r>
-        <w:rPr>
-          <w:rFonts w:ascii="Times New Roman" w:eastAsia="宋体" w:hAnsi="Times New Roman" w:cs="Times New Roman"/>
-          <w:kern w:val="0"/>
-          <w:sz w:val="24"/>
-          <w14:ligatures w14:val="none"/>
-        </w:rPr>
-        <w:t>DoRothEA</w:t>
-      </w:r>
-      <w:proofErr w:type="spellEnd"/>
-      <w:r>
-        <w:rPr>
-          <w:rFonts w:ascii="Times New Roman" w:eastAsia="宋体" w:hAnsi="Times New Roman" w:cs="Times New Roman"/>
-          <w:kern w:val="0"/>
-          <w:sz w:val="24"/>
-          <w14:ligatures w14:val="none"/>
-        </w:rPr>
-        <w:t>): PPARG (Log2FC = 1.19, p = 0.008), E2F1 (Log2FC = 0.50, p = 0.012), and SREBF1 (Log2FC = 0.30, p = 0.026) were significantly activated in high-score tumors. (G) Immune score correlations: none of the six immune cell types showed significant correlation (FDR &gt; 0.05).</w:t>
+        <w:t>Figure 6. Prognostic performance and molecular regulatory network. Time dependent ROC curves at 1, 3 &amp; 5 years. (B) Time-dependent AUC trajectory (0.5–8 years): 1-year AUC = 0.72, 3-year AUC = 0.68, 5-year AUC = 0.65. Random prediction level is shown as a dashed line. (C) Decision curve demonstrating positive net benefit over most thresholds. (D) Grouped expression of four core genes; all were significantly higher in the high score patients (all p &lt; 0.001, Wilcoxon test); FASN (2.8-fold), ACLY (2.3-fold), SCD (2.1-fold) and SREBF1 (1.9-fold). (E) Heatmap of the gene correlation network with strong correlation between FASN and ACLY (R = 0.78) and between FASN and SCD (R = 0.72). (F) Transcription factor activity (DoRothEA): PPARG (Log2FC = 1.19, p = 0.008), E2F1 (Log2FC = 0.50, p = 0.012), and SREBF1 (Log2FC = 0.30, p = 0.026) were significantly activated in high-score tumors. (G) Immune score correlations: none of the six immune cell types showed significant correlation (FDR &gt; 0.05).</w:t>
       </w:r>
     </w:p>
     <w:p>
@@ -10029,27 +7083,7 @@
           <w:sz w:val="24"/>
           <w14:ligatures w14:val="none"/>
         </w:rPr>
-        <w:t xml:space="preserve">Figure S3. Immune infiltration and drug sensitivity. (A) No obvious distinction between each group in heatmap of immune infiltration scores per patient. All boxplots show no significant differences (FDR &gt; 0.05; Wilcoxon test) in immune scores between groups. Drug sensitivity predictions: (C) high-score </w:t>
-      </w:r>
-      <w:proofErr w:type="gramStart"/>
-      <w:r>
-        <w:rPr>
-          <w:rFonts w:ascii="Times New Roman" w:eastAsia="宋体" w:hAnsi="Times New Roman" w:cs="Times New Roman"/>
-          <w:kern w:val="0"/>
-          <w:sz w:val="24"/>
-          <w14:ligatures w14:val="none"/>
-        </w:rPr>
-        <w:t>sensitive</w:t>
-      </w:r>
-      <w:proofErr w:type="gramEnd"/>
-      <w:r>
-        <w:rPr>
-          <w:rFonts w:ascii="Times New Roman" w:eastAsia="宋体" w:hAnsi="Times New Roman" w:cs="Times New Roman"/>
-          <w:kern w:val="0"/>
-          <w:sz w:val="24"/>
-          <w14:ligatures w14:val="none"/>
-        </w:rPr>
-        <w:t>: FASN inhibitors, SCD inhibitors, CDK4/6 inhibitors (FC &gt;1.3, p&lt;0.05); low-score sensitive: immune checkpoint inhibitors (FC&lt;0.77, p&lt;0.05). D) Gene correlation network heatmap (supplement to Fig. 6E) of the complete correlation matrix of the six core genes.</w:t>
+        <w:t>Figure S3. Immune infiltration and drug sensitivity. (A) No obvious distinction between each group in heatmap of immune infiltration scores per patient. All boxplots show no significant differences (FDR &gt; 0.05; Wilcoxon test) in immune scores between groups. Drug sensitivity predictions: (C) high-score sensitive: FASN inhibitors, SCD inhibitors, CDK4/6 inhibitors (FC &gt;1.3, p&lt;0.05); low-score sensitive: immune checkpoint inhibitors (FC&lt;0.77, p&lt;0.05). D) Gene correlation network heatmap (supplement to Fig. 6E) of the complete correlation matrix of the six core genes.</w:t>
       </w:r>
     </w:p>
     <w:p>
@@ -10090,47 +7124,7 @@
           <w:sz w:val="24"/>
           <w14:ligatures w14:val="none"/>
         </w:rPr>
-        <w:t xml:space="preserve">Figure S4. Kaplan–Meier survival curves of the TCGA cohort, separated by lipid score. Patients with high </w:t>
-      </w:r>
-      <w:proofErr w:type="gramStart"/>
-      <w:r>
-        <w:rPr>
-          <w:rFonts w:ascii="Times New Roman" w:eastAsia="宋体" w:hAnsi="Times New Roman" w:cs="Times New Roman"/>
-          <w:kern w:val="0"/>
-          <w:sz w:val="24"/>
-          <w14:ligatures w14:val="none"/>
-        </w:rPr>
-        <w:t>score</w:t>
-      </w:r>
-      <w:proofErr w:type="gramEnd"/>
-      <w:r>
-        <w:rPr>
-          <w:rFonts w:ascii="Times New Roman" w:eastAsia="宋体" w:hAnsi="Times New Roman" w:cs="Times New Roman"/>
-          <w:kern w:val="0"/>
-          <w:sz w:val="24"/>
-          <w14:ligatures w14:val="none"/>
-        </w:rPr>
-        <w:t xml:space="preserve"> (red) showed significantly poorer overall survival compared with patients with low </w:t>
-      </w:r>
-      <w:proofErr w:type="gramStart"/>
-      <w:r>
-        <w:rPr>
-          <w:rFonts w:ascii="Times New Roman" w:eastAsia="宋体" w:hAnsi="Times New Roman" w:cs="Times New Roman"/>
-          <w:kern w:val="0"/>
-          <w:sz w:val="24"/>
-          <w14:ligatures w14:val="none"/>
-        </w:rPr>
-        <w:t>score</w:t>
-      </w:r>
-      <w:proofErr w:type="gramEnd"/>
-      <w:r>
-        <w:rPr>
-          <w:rFonts w:ascii="Times New Roman" w:eastAsia="宋体" w:hAnsi="Times New Roman" w:cs="Times New Roman"/>
-          <w:kern w:val="0"/>
-          <w:sz w:val="24"/>
-          <w14:ligatures w14:val="none"/>
-        </w:rPr>
-        <w:t xml:space="preserve"> (blue) (log-rank p = 0.031). The risk table shows the number at risk at each time point.</w:t>
+        <w:t>Figure S4. Kaplan–Meier survival curves of the TCGA cohort, separated by lipid score. Patients with high score (red) showed significantly poorer overall survival compared with patients with low score (blue) (log-rank p = 0.031). The risk table shows the number at risk at each time point.</w:t>
       </w:r>
     </w:p>
     <w:p>
@@ -10171,47 +7165,7 @@
           <w:sz w:val="24"/>
           <w14:ligatures w14:val="none"/>
         </w:rPr>
-        <w:t xml:space="preserve">Figure S5. Nomogram for prediction of 1-, 3- and 5-year survival. The nomogram includes age, FNCLCC grade and lipid score. Each variable is assigned a </w:t>
-      </w:r>
-      <w:proofErr w:type="gramStart"/>
-      <w:r>
-        <w:rPr>
-          <w:rFonts w:ascii="Times New Roman" w:eastAsia="宋体" w:hAnsi="Times New Roman" w:cs="Times New Roman"/>
-          <w:kern w:val="0"/>
-          <w:sz w:val="24"/>
-          <w14:ligatures w14:val="none"/>
-        </w:rPr>
-        <w:t>point</w:t>
-      </w:r>
-      <w:proofErr w:type="gramEnd"/>
-      <w:r>
-        <w:rPr>
-          <w:rFonts w:ascii="Times New Roman" w:eastAsia="宋体" w:hAnsi="Times New Roman" w:cs="Times New Roman"/>
-          <w:kern w:val="0"/>
-          <w:sz w:val="24"/>
-          <w14:ligatures w14:val="none"/>
-        </w:rPr>
-        <w:t xml:space="preserve"> and the total score is the sum of all the points, which translates to </w:t>
-      </w:r>
-      <w:proofErr w:type="gramStart"/>
-      <w:r>
-        <w:rPr>
-          <w:rFonts w:ascii="Times New Roman" w:eastAsia="宋体" w:hAnsi="Times New Roman" w:cs="Times New Roman"/>
-          <w:kern w:val="0"/>
-          <w:sz w:val="24"/>
-          <w14:ligatures w14:val="none"/>
-        </w:rPr>
-        <w:t>1, 3 and 5 year</w:t>
-      </w:r>
-      <w:proofErr w:type="gramEnd"/>
-      <w:r>
-        <w:rPr>
-          <w:rFonts w:ascii="Times New Roman" w:eastAsia="宋体" w:hAnsi="Times New Roman" w:cs="Times New Roman"/>
-          <w:kern w:val="0"/>
-          <w:sz w:val="24"/>
-          <w14:ligatures w14:val="none"/>
-        </w:rPr>
-        <w:t xml:space="preserve"> survival probability.</w:t>
+        <w:t>Figure S5. Nomogram for prediction of 1-, 3- and 5-year survival. The nomogram includes age, FNCLCC grade and lipid score. Each variable is assigned a point and the total score is the sum of all the points, which translates to 1, 3 and 5 year survival probability.</w:t>
       </w:r>
     </w:p>
     <w:p>
@@ -10252,27 +7206,7 @@
           <w:sz w:val="24"/>
           <w14:ligatures w14:val="none"/>
         </w:rPr>
-        <w:t xml:space="preserve">Figure S6. Calibration curves of the nomogram. Calibration plots for 1-, 3- and 5-year survival. The predicted and observed survival </w:t>
-      </w:r>
-      <w:proofErr w:type="gramStart"/>
-      <w:r>
-        <w:rPr>
-          <w:rFonts w:ascii="Times New Roman" w:eastAsia="宋体" w:hAnsi="Times New Roman" w:cs="Times New Roman"/>
-          <w:kern w:val="0"/>
-          <w:sz w:val="24"/>
-          <w14:ligatures w14:val="none"/>
-        </w:rPr>
-        <w:t>are in agreement</w:t>
-      </w:r>
-      <w:proofErr w:type="gramEnd"/>
-      <w:r>
-        <w:rPr>
-          <w:rFonts w:ascii="Times New Roman" w:eastAsia="宋体" w:hAnsi="Times New Roman" w:cs="Times New Roman"/>
-          <w:kern w:val="0"/>
-          <w:sz w:val="24"/>
-          <w14:ligatures w14:val="none"/>
-        </w:rPr>
-        <w:t xml:space="preserve"> with the bootstrap corrected curves (B = 200). The diagonal dashed line is the perfect calibration line.</w:t>
+        <w:t>Figure S6. Calibration curves of the nomogram. Calibration plots for 1-, 3- and 5-year survival. The predicted and observed survival are in agreement with the bootstrap corrected curves (B = 200). The diagonal dashed line is the perfect calibration line.</w:t>
       </w:r>
     </w:p>
     <w:p>
@@ -11195,6 +8129,9 @@
               <w:kinsoku w:val="0"/>
               <w:spacing w:after="150" w:line="240" w:lineRule="auto"/>
               <w:jc w:val="both"/>
+              <w:rPr>
+                <w:rFonts w:hint="eastAsia"/>
+              </w:rPr>
             </w:pPr>
             <w:r>
               <w:rPr>
@@ -11676,27 +8613,7 @@
                 <w:sz w:val="24"/>
                 <w14:ligatures w14:val="none"/>
               </w:rPr>
-              <w:t>(Table S2</w:t>
-            </w:r>
-            <w:proofErr w:type="gramStart"/>
-            <w:r>
-              <w:rPr>
-                <w:rFonts w:ascii="Times New Roman" w:eastAsia="宋体" w:hAnsi="Times New Roman" w:cs="Times New Roman"/>
-                <w:kern w:val="0"/>
-                <w:sz w:val="24"/>
-                <w14:ligatures w14:val="none"/>
-              </w:rPr>
-              <w:t>).FASN</w:t>
-            </w:r>
-            <w:proofErr w:type="gramEnd"/>
-            <w:r>
-              <w:rPr>
-                <w:rFonts w:ascii="Times New Roman" w:eastAsia="宋体" w:hAnsi="Times New Roman" w:cs="Times New Roman"/>
-                <w:kern w:val="0"/>
-                <w:sz w:val="24"/>
-                <w14:ligatures w14:val="none"/>
-              </w:rPr>
-              <w:t>, ACLY, SCD, SREBF1, HMGCR, PPARG are studied in</w:t>
+              <w:t>(Table S2).FASN, ACLY, SCD, SREBF1, HMGCR, PPARG are studied in</w:t>
             </w:r>
           </w:p>
         </w:tc>
@@ -12156,21 +9073,12 @@
                 <w14:ligatures w14:val="none"/>
               </w:rPr>
             </w:pPr>
-            <w:proofErr w:type="spellStart"/>
             <w:r>
               <w:rPr>
                 <w:rFonts w:ascii="Times New Roman" w:hAnsi="Times New Roman" w:cs="Times New Roman"/>
                 <w:sz w:val="24"/>
               </w:rPr>
-              <w:t>limma</w:t>
-            </w:r>
-            <w:proofErr w:type="spellEnd"/>
-            <w:r>
-              <w:rPr>
-                <w:rFonts w:ascii="Times New Roman" w:hAnsi="Times New Roman" w:cs="Times New Roman"/>
-                <w:sz w:val="24"/>
-              </w:rPr>
-              <w:t xml:space="preserve"> v3.56.2</w:t>
+              <w:t>limma v3.56.2</w:t>
             </w:r>
           </w:p>
         </w:tc>
@@ -12275,7 +9183,6 @@
                 <w14:ligatures w14:val="none"/>
               </w:rPr>
             </w:pPr>
-            <w:proofErr w:type="spellStart"/>
             <w:r>
               <w:rPr>
                 <w:rFonts w:ascii="Times New Roman" w:hAnsi="Times New Roman" w:cs="Times New Roman"/>
@@ -12283,7 +9190,6 @@
               </w:rPr>
               <w:t>clusterProfiler</w:t>
             </w:r>
-            <w:proofErr w:type="spellEnd"/>
           </w:p>
         </w:tc>
         <w:tc>
@@ -12506,7 +9412,6 @@
                 <w14:ligatures w14:val="none"/>
               </w:rPr>
             </w:pPr>
-            <w:proofErr w:type="spellStart"/>
             <w:r>
               <w:rPr>
                 <w:rFonts w:ascii="Times New Roman" w:eastAsia="宋体" w:hAnsi="Times New Roman" w:cs="Times New Roman" w:hint="eastAsia"/>
@@ -12515,18 +9420,7 @@
                 <w:sz w:val="24"/>
                 <w14:ligatures w14:val="none"/>
               </w:rPr>
-              <w:t>survminer</w:t>
-            </w:r>
-            <w:proofErr w:type="spellEnd"/>
-            <w:r>
-              <w:rPr>
-                <w:rFonts w:ascii="Times New Roman" w:eastAsia="宋体" w:hAnsi="Times New Roman" w:cs="Times New Roman" w:hint="eastAsia"/>
-                <w:color w:val="333333"/>
-                <w:kern w:val="0"/>
-                <w:sz w:val="24"/>
-                <w14:ligatures w14:val="none"/>
-              </w:rPr>
-              <w:t xml:space="preserve"> v0.4.9</w:t>
+              <w:t>survminer v0.4.9</w:t>
             </w:r>
           </w:p>
         </w:tc>
@@ -12604,20 +9498,8 @@
                 <w:sz w:val="24"/>
                 <w14:ligatures w14:val="none"/>
               </w:rPr>
-              <w:t>https://cran.r project.org/package=</w:t>
+              <w:t>https://cran.r project.org/package=survminer</w:t>
             </w:r>
-            <w:proofErr w:type="spellStart"/>
-            <w:r>
-              <w:rPr>
-                <w:rFonts w:ascii="Times New Roman" w:eastAsia="宋体" w:hAnsi="Times New Roman" w:cs="Times New Roman" w:hint="eastAsia"/>
-                <w:color w:val="333333"/>
-                <w:kern w:val="0"/>
-                <w:sz w:val="24"/>
-                <w14:ligatures w14:val="none"/>
-              </w:rPr>
-              <w:t>survminer</w:t>
-            </w:r>
-            <w:proofErr w:type="spellEnd"/>
           </w:p>
         </w:tc>
       </w:tr>
@@ -12649,7 +9531,6 @@
                 <w14:ligatures w14:val="none"/>
               </w:rPr>
             </w:pPr>
-            <w:proofErr w:type="spellStart"/>
             <w:r>
               <w:rPr>
                 <w:rFonts w:ascii="Times New Roman" w:eastAsia="宋体" w:hAnsi="Times New Roman" w:cs="Times New Roman" w:hint="eastAsia"/>
@@ -12660,7 +9541,6 @@
               </w:rPr>
               <w:t>timeROC</w:t>
             </w:r>
-            <w:proofErr w:type="spellEnd"/>
           </w:p>
         </w:tc>
         <w:tc>
@@ -12737,20 +9617,8 @@
                 <w:sz w:val="24"/>
                 <w14:ligatures w14:val="none"/>
               </w:rPr>
-              <w:t>https://cran.r project.org/package=</w:t>
+              <w:t>https://cran.r project.org/package=timeROC</w:t>
             </w:r>
-            <w:proofErr w:type="spellStart"/>
-            <w:r>
-              <w:rPr>
-                <w:rFonts w:ascii="Times New Roman" w:eastAsia="宋体" w:hAnsi="Times New Roman" w:cs="Times New Roman" w:hint="eastAsia"/>
-                <w:color w:val="333333"/>
-                <w:kern w:val="0"/>
-                <w:sz w:val="24"/>
-                <w14:ligatures w14:val="none"/>
-              </w:rPr>
-              <w:t>timeROC</w:t>
-            </w:r>
-            <w:proofErr w:type="spellEnd"/>
           </w:p>
         </w:tc>
       </w:tr>
@@ -12782,7 +9650,6 @@
                 <w14:ligatures w14:val="none"/>
               </w:rPr>
             </w:pPr>
-            <w:proofErr w:type="spellStart"/>
             <w:r>
               <w:rPr>
                 <w:rFonts w:ascii="Times New Roman" w:eastAsia="宋体" w:hAnsi="Times New Roman" w:cs="Times New Roman" w:hint="eastAsia"/>
@@ -12793,7 +9660,6 @@
               </w:rPr>
               <w:t>DoRothEA</w:t>
             </w:r>
-            <w:proofErr w:type="spellEnd"/>
           </w:p>
         </w:tc>
         <w:tc>
@@ -13022,7 +9888,6 @@
                 <w14:ligatures w14:val="none"/>
               </w:rPr>
             </w:pPr>
-            <w:proofErr w:type="spellStart"/>
             <w:r>
               <w:rPr>
                 <w:rFonts w:ascii="Times New Roman" w:eastAsia="宋体" w:hAnsi="Times New Roman" w:cs="Times New Roman" w:hint="eastAsia"/>
@@ -13031,18 +9896,7 @@
                 <w:sz w:val="24"/>
                 <w14:ligatures w14:val="none"/>
               </w:rPr>
-              <w:t>ggtree</w:t>
-            </w:r>
-            <w:proofErr w:type="spellEnd"/>
-            <w:r>
-              <w:rPr>
-                <w:rFonts w:ascii="Times New Roman" w:eastAsia="宋体" w:hAnsi="Times New Roman" w:cs="Times New Roman" w:hint="eastAsia"/>
-                <w:color w:val="333333"/>
-                <w:kern w:val="0"/>
-                <w:sz w:val="24"/>
-                <w14:ligatures w14:val="none"/>
-              </w:rPr>
-              <w:t xml:space="preserve"> v4.2.0</w:t>
+              <w:t>ggtree v4.2.0</w:t>
             </w:r>
           </w:p>
         </w:tc>
@@ -13153,7 +10007,6 @@
                 <w14:ligatures w14:val="none"/>
               </w:rPr>
             </w:pPr>
-            <w:proofErr w:type="spellStart"/>
             <w:r>
               <w:rPr>
                 <w:rFonts w:ascii="Times New Roman" w:eastAsia="宋体" w:hAnsi="Times New Roman" w:cs="Times New Roman" w:hint="eastAsia"/>
@@ -13163,18 +10016,7 @@
                 <w14:ligatures w14:val="none"/>
               </w:rPr>
               <w:lastRenderedPageBreak/>
-              <w:t>ggtreeExtra</w:t>
-            </w:r>
-            <w:proofErr w:type="spellEnd"/>
-            <w:r>
-              <w:rPr>
-                <w:rFonts w:ascii="Times New Roman" w:eastAsia="宋体" w:hAnsi="Times New Roman" w:cs="Times New Roman" w:hint="eastAsia"/>
-                <w:color w:val="333333"/>
-                <w:kern w:val="0"/>
-                <w:sz w:val="24"/>
-                <w14:ligatures w14:val="none"/>
-              </w:rPr>
-              <w:t xml:space="preserve"> v1.22.1</w:t>
+              <w:t>ggtreeExtra v1.22.1</w:t>
             </w:r>
           </w:p>
         </w:tc>
@@ -13285,7 +10127,6 @@
                 <w14:ligatures w14:val="none"/>
               </w:rPr>
             </w:pPr>
-            <w:proofErr w:type="spellStart"/>
             <w:r>
               <w:rPr>
                 <w:rFonts w:ascii="Times New Roman" w:eastAsia="宋体" w:hAnsi="Times New Roman" w:cs="Times New Roman"/>
@@ -13294,18 +10135,7 @@
                 <w:sz w:val="24"/>
                 <w14:ligatures w14:val="none"/>
               </w:rPr>
-              <w:t>MSigDB</w:t>
-            </w:r>
-            <w:proofErr w:type="spellEnd"/>
-            <w:r>
-              <w:rPr>
-                <w:rFonts w:ascii="Times New Roman" w:eastAsia="宋体" w:hAnsi="Times New Roman" w:cs="Times New Roman"/>
-                <w:color w:val="333333"/>
-                <w:kern w:val="0"/>
-                <w:sz w:val="24"/>
-                <w14:ligatures w14:val="none"/>
-              </w:rPr>
-              <w:t xml:space="preserve"> Hallmark gene sets v7.4</w:t>
+              <w:t>MSigDB Hallmark gene sets v7.4</w:t>
             </w:r>
           </w:p>
         </w:tc>
@@ -14217,27 +11047,7 @@
           <w:sz w:val="24"/>
           <w14:ligatures w14:val="none"/>
         </w:rPr>
-        <w:t xml:space="preserve">Table S2. Six essential genes </w:t>
-      </w:r>
-      <w:proofErr w:type="gramStart"/>
-      <w:r>
-        <w:rPr>
-          <w:rFonts w:ascii="Times New Roman" w:eastAsia="宋体" w:hAnsi="Times New Roman" w:cs="Times New Roman"/>
-          <w:kern w:val="0"/>
-          <w:sz w:val="24"/>
-          <w14:ligatures w14:val="none"/>
-        </w:rPr>
-        <w:t>involved</w:t>
-      </w:r>
-      <w:proofErr w:type="gramEnd"/>
-      <w:r>
-        <w:rPr>
-          <w:rFonts w:ascii="Times New Roman" w:eastAsia="宋体" w:hAnsi="Times New Roman" w:cs="Times New Roman"/>
-          <w:kern w:val="0"/>
-          <w:sz w:val="24"/>
-          <w14:ligatures w14:val="none"/>
-        </w:rPr>
-        <w:t xml:space="preserve"> in lipid metabolism.</w:t>
+        <w:t>Table S2. Six essential genes involved in lipid metabolism.</w:t>
       </w:r>
     </w:p>
     <w:p>

</xml_diff>